<commit_message>
Pack 16.2: fix bank statement template — replace hardcoded Aliev data with Jinja vars
</commit_message>
<xml_diff>
--- a/templates/docx/bank_statement_template.docx
+++ b/templates/docx/bank_statement_template.docx
@@ -402,57 +402,7 @@
                                   <w:spacing w:val="-2"/>
                                   <w:sz w:val="16"/>
                                 </w:rPr>
-                                <w:t>40803840441563809831</w:t>
-                              </w:r>
-                              <w:r>
-                                <w:rPr>
-                                  <w:spacing w:val="-2"/>
-                                  <w:sz w:val="16"/>
-                                  <w:lang w:val="en-US"/>
-                                </w:rPr>
-                                <w:t xml:space="preserve"> </w:t>
-                              </w:r>
-                              <w:r>
-                                <w:rPr>
-                                  <w:spacing w:val="-2"/>
-                                  <w:sz w:val="16"/>
-                                </w:rPr>
-                                <w:t>1</w:t>
-                              </w:r>
-                              <w:r>
-                                <w:rPr>
-                                  <w:spacing w:val="-2"/>
-                                  <w:sz w:val="16"/>
-                                </w:rPr>
-                                <w:t>1</w:t>
-                              </w:r>
-                              <w:r>
-                                <w:rPr>
-                                  <w:spacing w:val="-2"/>
-                                  <w:sz w:val="16"/>
-                                </w:rPr>
-                                <w:t>.0</w:t>
-                              </w:r>
-                              <w:r>
-                                <w:rPr>
-                                  <w:spacing w:val="-2"/>
-                                  <w:sz w:val="16"/>
-                                </w:rPr>
-                                <w:t>2</w:t>
-                              </w:r>
-                              <w:r>
-                                <w:rPr>
-                                  <w:spacing w:val="-2"/>
-                                  <w:sz w:val="16"/>
-                                </w:rPr>
-                                <w:t>.202</w:t>
-                              </w:r>
-                              <w:r>
-                                <w:rPr>
-                                  <w:spacing w:val="-2"/>
-                                  <w:sz w:val="16"/>
-                                </w:rPr>
-                                <w:t>4</w:t>
+                                <w:t xml:space="preserve">{{ applicant.bank_account }} {{ bank.account_open_date_formatted }}</w:t>
                               </w:r>
                             </w:p>
                             <w:p>
@@ -514,42 +464,7 @@
                                   <w:spacing w:val="-2"/>
                                   <w:sz w:val="16"/>
                                 </w:rPr>
-                                <w:t>20</w:t>
-                              </w:r>
-                              <w:r>
-                                <w:rPr>
-                                  <w:spacing w:val="-2"/>
-                                  <w:sz w:val="16"/>
-                                </w:rPr>
-                                <w:t>.</w:t>
-                              </w:r>
-                              <w:r>
-                                <w:rPr>
-                                  <w:spacing w:val="-2"/>
-                                  <w:sz w:val="16"/>
-                                </w:rPr>
-                                <w:t>0</w:t>
-                              </w:r>
-                              <w:r>
-                                <w:rPr>
-                                  <w:spacing w:val="-2"/>
-                                  <w:sz w:val="16"/>
-                                </w:rPr>
-                                <w:t>4</w:t>
-                              </w:r>
-                              <w:r>
-                                <w:rPr>
-                                  <w:spacing w:val="-2"/>
-                                  <w:sz w:val="16"/>
-                                </w:rPr>
-                                <w:t>.</w:t>
-                              </w:r>
-                              <w:r>
-                                <w:rPr>
-                                  <w:spacing w:val="-2"/>
-                                  <w:sz w:val="16"/>
-                                </w:rPr>
-                                <w:t>2026</w:t>
+                                <w:t xml:space="preserve">{{ bank.statement_date_formatted }}</w:t>
                               </w:r>
                             </w:p>
                           </w:txbxContent>
@@ -587,31 +502,7 @@
                                   <w:bCs/>
                                   <w:sz w:val="16"/>
                                 </w:rPr>
-                                <w:t xml:space="preserve">Алиев Джафар </w:t>
-                              </w:r>
-                              <w:proofErr w:type="spellStart"/>
-                              <w:r>
-                                <w:rPr>
-                                  <w:b/>
-                                  <w:bCs/>
-                                  <w:sz w:val="16"/>
-                                </w:rPr>
-                                <w:t>Надирович</w:t>
-                              </w:r>
-                              <w:proofErr w:type="spellEnd"/>
-                            </w:p>
-                            <w:p>
-                              <w:pPr>
-                                <w:spacing w:before="60" w:after="60" w:line="178" w:lineRule="exact"/>
-                                <w:rPr>
-                                  <w:sz w:val="16"/>
-                                </w:rPr>
-                              </w:pPr>
-                              <w:r>
-                                <w:rPr>
-                                  <w:sz w:val="16"/>
-                                </w:rPr>
-                                <w:t>Паспорт AZE C01366076</w:t>
+                                <w:t xml:space="preserve">{{ applicant.full_name_native }}</w:t>
                               </w:r>
                             </w:p>
                             <w:p>
@@ -625,7 +516,7 @@
                                 <w:rPr>
                                   <w:sz w:val="16"/>
                                 </w:rPr>
-                                <w:t>352919, Краснодарский край,</w:t>
+                                <w:t xml:space="preserve">Паспорт {{ applicant.nationality }} {{ applicant.passport_number }}</w:t>
                               </w:r>
                             </w:p>
                             <w:p>
@@ -639,7 +530,21 @@
                                 <w:rPr>
                                   <w:sz w:val="16"/>
                                 </w:rPr>
-                                <w:t>г. Армавир, ул. 11-я Линия, д. 31 кв. 2</w:t>
+                                <w:t xml:space="preserve">{{ applicant.home_address_line1 }}</w:t>
+                              </w:r>
+                            </w:p>
+                            <w:p>
+                              <w:pPr>
+                                <w:spacing w:before="60" w:after="60" w:line="178" w:lineRule="exact"/>
+                                <w:rPr>
+                                  <w:sz w:val="16"/>
+                                </w:rPr>
+                              </w:pPr>
+                              <w:r>
+                                <w:rPr>
+                                  <w:sz w:val="16"/>
+                                </w:rPr>
+                                <w:t xml:space="preserve">{{ applicant.home_address_line2 }}</w:t>
                               </w:r>
                             </w:p>
                           </w:txbxContent>
@@ -873,57 +778,7 @@
                             <w:spacing w:val="-2"/>
                             <w:sz w:val="16"/>
                           </w:rPr>
-                          <w:t>40803840441563809831</w:t>
-                        </w:r>
-                        <w:r>
-                          <w:rPr>
-                            <w:spacing w:val="-2"/>
-                            <w:sz w:val="16"/>
-                            <w:lang w:val="en-US"/>
-                          </w:rPr>
-                          <w:t xml:space="preserve"> </w:t>
-                        </w:r>
-                        <w:r>
-                          <w:rPr>
-                            <w:spacing w:val="-2"/>
-                            <w:sz w:val="16"/>
-                          </w:rPr>
-                          <w:t>1</w:t>
-                        </w:r>
-                        <w:r>
-                          <w:rPr>
-                            <w:spacing w:val="-2"/>
-                            <w:sz w:val="16"/>
-                          </w:rPr>
-                          <w:t>1</w:t>
-                        </w:r>
-                        <w:r>
-                          <w:rPr>
-                            <w:spacing w:val="-2"/>
-                            <w:sz w:val="16"/>
-                          </w:rPr>
-                          <w:t>.0</w:t>
-                        </w:r>
-                        <w:r>
-                          <w:rPr>
-                            <w:spacing w:val="-2"/>
-                            <w:sz w:val="16"/>
-                          </w:rPr>
-                          <w:t>2</w:t>
-                        </w:r>
-                        <w:r>
-                          <w:rPr>
-                            <w:spacing w:val="-2"/>
-                            <w:sz w:val="16"/>
-                          </w:rPr>
-                          <w:t>.202</w:t>
-                        </w:r>
-                        <w:r>
-                          <w:rPr>
-                            <w:spacing w:val="-2"/>
-                            <w:sz w:val="16"/>
-                          </w:rPr>
-                          <w:t>4</w:t>
+                          <w:t xml:space="preserve">{{ applicant.bank_account }} {{ bank.account_open_date_formatted }}</w:t>
                         </w:r>
                       </w:p>
                       <w:p>
@@ -985,42 +840,7 @@
                             <w:spacing w:val="-2"/>
                             <w:sz w:val="16"/>
                           </w:rPr>
-                          <w:t>20</w:t>
-                        </w:r>
-                        <w:r>
-                          <w:rPr>
-                            <w:spacing w:val="-2"/>
-                            <w:sz w:val="16"/>
-                          </w:rPr>
-                          <w:t>.</w:t>
-                        </w:r>
-                        <w:r>
-                          <w:rPr>
-                            <w:spacing w:val="-2"/>
-                            <w:sz w:val="16"/>
-                          </w:rPr>
-                          <w:t>0</w:t>
-                        </w:r>
-                        <w:r>
-                          <w:rPr>
-                            <w:spacing w:val="-2"/>
-                            <w:sz w:val="16"/>
-                          </w:rPr>
-                          <w:t>4</w:t>
-                        </w:r>
-                        <w:r>
-                          <w:rPr>
-                            <w:spacing w:val="-2"/>
-                            <w:sz w:val="16"/>
-                          </w:rPr>
-                          <w:t>.</w:t>
-                        </w:r>
-                        <w:r>
-                          <w:rPr>
-                            <w:spacing w:val="-2"/>
-                            <w:sz w:val="16"/>
-                          </w:rPr>
-                          <w:t>2026</w:t>
+                          <w:t xml:space="preserve">{{ bank.statement_date_formatted }}</w:t>
                         </w:r>
                       </w:p>
                     </w:txbxContent>
@@ -1044,31 +864,7 @@
                             <w:bCs/>
                             <w:sz w:val="16"/>
                           </w:rPr>
-                          <w:t xml:space="preserve">Алиев Джафар </w:t>
-                        </w:r>
-                        <w:proofErr w:type="spellStart"/>
-                        <w:r>
-                          <w:rPr>
-                            <w:b/>
-                            <w:bCs/>
-                            <w:sz w:val="16"/>
-                          </w:rPr>
-                          <w:t>Надирович</w:t>
-                        </w:r>
-                        <w:proofErr w:type="spellEnd"/>
-                      </w:p>
-                      <w:p>
-                        <w:pPr>
-                          <w:spacing w:before="60" w:after="60" w:line="178" w:lineRule="exact"/>
-                          <w:rPr>
-                            <w:sz w:val="16"/>
-                          </w:rPr>
-                        </w:pPr>
-                        <w:r>
-                          <w:rPr>
-                            <w:sz w:val="16"/>
-                          </w:rPr>
-                          <w:t>Паспорт AZE C01366076</w:t>
+                          <w:t xml:space="preserve">{{ applicant.full_name_native }}</w:t>
                         </w:r>
                       </w:p>
                       <w:p>
@@ -1082,7 +878,7 @@
                           <w:rPr>
                             <w:sz w:val="16"/>
                           </w:rPr>
-                          <w:t>352919, Краснодарский край,</w:t>
+                          <w:t xml:space="preserve">Паспорт {{ applicant.nationality }} {{ applicant.passport_number }}</w:t>
                         </w:r>
                       </w:p>
                       <w:p>
@@ -1096,7 +892,21 @@
                           <w:rPr>
                             <w:sz w:val="16"/>
                           </w:rPr>
-                          <w:t>г. Армавир, ул. 11-я Линия, д. 31 кв. 2</w:t>
+                          <w:t xml:space="preserve">{{ applicant.home_address_line1 }}</w:t>
+                        </w:r>
+                      </w:p>
+                      <w:p>
+                        <w:pPr>
+                          <w:spacing w:before="60" w:after="60" w:line="178" w:lineRule="exact"/>
+                          <w:rPr>
+                            <w:sz w:val="16"/>
+                          </w:rPr>
+                        </w:pPr>
+                        <w:r>
+                          <w:rPr>
+                            <w:sz w:val="16"/>
+                          </w:rPr>
+                          <w:t xml:space="preserve">{{ applicant.home_address_line2 }}</w:t>
                         </w:r>
                       </w:p>
                     </w:txbxContent>
@@ -1116,86 +926,114 @@
         <w:ind w:left="5812"/>
       </w:pPr>
       <w:r>
-        <w:t>За период с {{ bank.period_start_formatted }} по {{ bank.period_end_formatted }}</w:t>
+        <w:t>За</w:t>
       </w:r>
       <w:r>
         <w:rPr>
           <w:spacing w:val="-6"/>
         </w:rPr>
+        <w:t xml:space="preserve"> </w:t>
       </w:r>
-      <w:r/>
       <w:r>
-        <w:rPr>
-          <w:spacing w:val="-5"/>
-        </w:rPr>
-      </w:r>
-      <w:proofErr w:type="gramStart"/>
-      <w:r/>
-      <w:r>
-        <w:rPr>
-          <w:spacing w:val="-5"/>
-        </w:rPr>
+        <w:t>период</w:t>
       </w:r>
       <w:r>
         <w:rPr>
           <w:spacing w:val="-5"/>
         </w:rPr>
+        <w:t xml:space="preserve"> </w:t>
+      </w:r>
+      <w:proofErr w:type="gramStart"/>
+      <w:r>
+        <w:t>с</w:t>
       </w:r>
       <w:r>
         <w:rPr>
           <w:spacing w:val="-5"/>
         </w:rPr>
+        <w:t xml:space="preserve"> </w:t>
       </w:r>
-      <w:r/>
-      <w:r/>
-      <w:r/>
-      <w:r/>
+      <w:r>
+        <w:rPr>
+          <w:spacing w:val="-5"/>
+        </w:rPr>
+        <w:t xml:space="preserve"> </w:t>
+      </w:r>
+      <w:r>
+        <w:rPr>
+          <w:spacing w:val="-5"/>
+        </w:rPr>
+        <w:t>20</w:t>
+      </w:r>
+      <w:r>
+        <w:t>.</w:t>
+      </w:r>
+      <w:r>
+        <w:t>01</w:t>
+      </w:r>
+      <w:r>
+        <w:t>.202</w:t>
+      </w:r>
+      <w:r>
+        <w:t>6</w:t>
+      </w:r>
       <w:proofErr w:type="gramEnd"/>
       <w:r>
         <w:rPr>
           <w:spacing w:val="-5"/>
         </w:rPr>
+        <w:t xml:space="preserve"> </w:t>
       </w:r>
-      <w:r/>
       <w:r>
-        <w:rPr>
-          <w:spacing w:val="-5"/>
-        </w:rPr>
+        <w:t>по</w:t>
       </w:r>
       <w:r>
         <w:rPr>
           <w:spacing w:val="-5"/>
         </w:rPr>
+        <w:t xml:space="preserve"> </w:t>
       </w:r>
       <w:r>
         <w:rPr>
           <w:spacing w:val="-5"/>
         </w:rPr>
+        <w:t>1</w:t>
+      </w:r>
+      <w:r>
+        <w:rPr>
+          <w:spacing w:val="-5"/>
+        </w:rPr>
+        <w:t>9</w:t>
       </w:r>
       <w:r>
         <w:rPr>
           <w:spacing w:val="-2"/>
         </w:rPr>
+        <w:t>.</w:t>
       </w:r>
       <w:r>
         <w:rPr>
           <w:spacing w:val="-2"/>
         </w:rPr>
+        <w:t>0</w:t>
       </w:r>
       <w:r>
         <w:rPr>
           <w:spacing w:val="-2"/>
         </w:rPr>
+        <w:t>4</w:t>
       </w:r>
       <w:r>
         <w:rPr>
           <w:spacing w:val="-2"/>
         </w:rPr>
+        <w:t>.202</w:t>
       </w:r>
       <w:r>
         <w:rPr>
           <w:spacing w:val="-2"/>
         </w:rPr>
+        <w:t>6</w:t>
       </w:r>
     </w:p>
     <w:p>
@@ -1312,50 +1150,64 @@
         <w:ind w:left="5812"/>
       </w:pPr>
       <w:r>
-        <w:t>Входящий остаток                                                               {{ bank.opening_balance_formatted }}</w:t>
+        <w:t>Входящий</w:t>
       </w:r>
       <w:r>
         <w:rPr>
           <w:spacing w:val="-6"/>
         </w:rPr>
+        <w:t xml:space="preserve"> </w:t>
       </w:r>
       <w:r>
         <w:rPr>
           <w:spacing w:val="-2"/>
         </w:rPr>
+        <w:t>остаток</w:t>
       </w:r>
       <w:r>
         <w:rPr>
           <w:spacing w:val="-2"/>
         </w:rPr>
+        <w:t xml:space="preserve">                                                              </w:t>
       </w:r>
       <w:r>
         <w:rPr>
           <w:spacing w:val="-2"/>
         </w:rPr>
+        <w:t xml:space="preserve"> </w:t>
       </w:r>
       <w:r>
         <w:rPr>
           <w:spacing w:val="-2"/>
         </w:rPr>
+        <w:t>301</w:t>
       </w:r>
       <w:r>
         <w:rPr>
           <w:spacing w:val="-2"/>
         </w:rPr>
+        <w:t xml:space="preserve"> </w:t>
       </w:r>
       <w:r>
         <w:rPr>
           <w:spacing w:val="-2"/>
         </w:rPr>
+        <w:t>018</w:t>
       </w:r>
-      <w:r/>
-      <w:r/>
-      <w:r/>
+      <w:r>
+        <w:t>,</w:t>
+      </w:r>
+      <w:r>
+        <w:t>66</w:t>
+      </w:r>
+      <w:r>
+        <w:t xml:space="preserve"> </w:t>
+      </w:r>
       <w:r>
         <w:rPr>
           <w:spacing w:val="-5"/>
         </w:rPr>
+        <w:t>RUR</w:t>
       </w:r>
     </w:p>
     <w:p>
@@ -1469,27 +1321,45 @@
           <w:spacing w:val="-2"/>
         </w:rPr>
         <w:t>Поступления</w:t>
+      </w:r>
+      <w:r>
         <w:tab/>
-        <w:t xml:space="preserve">   {{ bank.total_income_formatted }}</w:t>
       </w:r>
-      <w:r/>
-      <w:r/>
-      <w:r/>
-      <w:r/>
-      <w:r/>
-      <w:r/>
-      <w:r/>
-      <w:r/>
-      <w:r/>
+      <w:r>
+        <w:t xml:space="preserve">   </w:t>
+      </w:r>
+      <w:r>
+        <w:t>9</w:t>
+      </w:r>
+      <w:r>
+        <w:t>00</w:t>
+      </w:r>
+      <w:r>
+        <w:t xml:space="preserve"> </w:t>
+      </w:r>
+      <w:r>
+        <w:t>0</w:t>
+      </w:r>
+      <w:r>
+        <w:t>0</w:t>
+      </w:r>
+      <w:r>
+        <w:t>0</w:t>
+      </w:r>
+      <w:r>
+        <w:t>,00</w:t>
+      </w:r>
       <w:r>
         <w:rPr>
           <w:spacing w:val="-1"/>
         </w:rPr>
+        <w:t xml:space="preserve"> </w:t>
       </w:r>
       <w:r>
         <w:rPr>
           <w:spacing w:val="-5"/>
         </w:rPr>
+        <w:t>RUR</w:t>
       </w:r>
     </w:p>
     <w:p>
@@ -1602,31 +1472,10 @@
         <w:rPr>
           <w:spacing w:val="-2"/>
         </w:rPr>
-        <w:t>Расходы</w:t>
-      </w:r>
-      <w:r>
         <w:tab/>
-      </w:r>
-      <w:r>
-        <w:t>1 171 778</w:t>
-      </w:r>
-      <w:r>
-        <w:t>,</w:t>
-      </w:r>
-      <w:r>
-        <w:t>54</w:t>
-      </w:r>
-      <w:r>
-        <w:rPr>
-          <w:spacing w:val="-1"/>
-        </w:rPr>
-        <w:t xml:space="preserve"> </w:t>
-      </w:r>
-      <w:r>
-        <w:rPr>
-          <w:spacing w:val="-5"/>
-        </w:rPr>
-        <w:t>RUR</w:t>
+        <w:t xml:space="preserve">Расходы</w:t>
+        <w:tab/>
+        <w:t xml:space="preserve">{{ bank.total_expense_formatted }}</w:t>
       </w:r>
     </w:p>
     <w:p>
@@ -1738,25 +1587,50 @@
         <w:ind w:left="5812" w:right="139"/>
       </w:pPr>
       <w:r>
-        <w:t xml:space="preserve">Исходящий остаток                                                           {{ bank.closing_balance_formatted }} </w:t>
+        <w:t>Исходящий остаток</w:t>
       </w:r>
-      <w:r/>
-      <w:r/>
-      <w:r/>
-      <w:r/>
-      <w:r/>
-      <w:r/>
-      <w:r/>
-      <w:r/>
-      <w:r/>
-      <w:r/>
-      <w:r/>
+      <w:r>
+        <w:t xml:space="preserve">                          </w:t>
+      </w:r>
+      <w:r>
+        <w:t xml:space="preserve">                </w:t>
+      </w:r>
+      <w:r>
+        <w:t xml:space="preserve"> </w:t>
+      </w:r>
+      <w:r>
+        <w:t xml:space="preserve">      </w:t>
+      </w:r>
+      <w:r>
+        <w:t xml:space="preserve">  </w:t>
+      </w:r>
+      <w:r>
+        <w:t xml:space="preserve">      </w:t>
+      </w:r>
+      <w:r>
+        <w:t xml:space="preserve">  29</w:t>
+      </w:r>
+      <w:r>
+        <w:t xml:space="preserve"> </w:t>
+      </w:r>
+      <w:r>
+        <w:t>240</w:t>
+      </w:r>
+      <w:r>
+        <w:t>,</w:t>
+      </w:r>
+      <w:r>
+        <w:t>12</w:t>
+      </w:r>
       <w:r>
         <w:rPr>
           <w:spacing w:val="-11"/>
         </w:rPr>
+        <w:t xml:space="preserve"> </w:t>
       </w:r>
-      <w:r/>
+      <w:r>
+        <w:t xml:space="preserve">RUR </w:t>
+      </w:r>
     </w:p>
     <w:p>
       <w:pPr>
@@ -2088,7 +1962,21 @@
                 <w:spacing w:val="-2"/>
                 <w:sz w:val="16"/>
               </w:rPr>
-              <w:t>__TX_DATE__</w:t>
+              <w:t>1</w:t>
+            </w:r>
+            <w:r>
+              <w:rPr>
+                <w:spacing w:val="-2"/>
+                <w:sz w:val="16"/>
+              </w:rPr>
+              <w:t>9</w:t>
+            </w:r>
+            <w:r>
+              <w:rPr>
+                <w:spacing w:val="-2"/>
+                <w:sz w:val="16"/>
+              </w:rPr>
+              <w:t>.04.2026</w:t>
             </w:r>
           </w:p>
         </w:tc>
@@ -2115,7 +2003,7 @@
                 <w:spacing w:val="-2"/>
                 <w:sz w:val="16"/>
               </w:rPr>
-              <w:t>__TX_CODE__</w:t>
+              <w:t>С011334780834634</w:t>
             </w:r>
           </w:p>
         </w:tc>
@@ -2141,7 +2029,35 @@
                 <w:spacing w:val="-2"/>
                 <w:sz w:val="16"/>
               </w:rPr>
-              <w:t>__TX_DESCRIPTION__</w:t>
+              <w:t xml:space="preserve">Единый налоговый платеж. Оплата НПД за </w:t>
+            </w:r>
+            <w:r>
+              <w:rPr>
+                <w:spacing w:val="-2"/>
+                <w:sz w:val="16"/>
+              </w:rPr>
+              <w:t>март</w:t>
+            </w:r>
+            <w:r>
+              <w:rPr>
+                <w:spacing w:val="-2"/>
+                <w:sz w:val="16"/>
+              </w:rPr>
+              <w:t xml:space="preserve"> 202</w:t>
+            </w:r>
+            <w:r>
+              <w:rPr>
+                <w:spacing w:val="-2"/>
+                <w:sz w:val="16"/>
+              </w:rPr>
+              <w:t>6</w:t>
+            </w:r>
+            <w:r>
+              <w:rPr>
+                <w:spacing w:val="-2"/>
+                <w:sz w:val="16"/>
+              </w:rPr>
+              <w:t xml:space="preserve">г.                                              </w:t>
             </w:r>
           </w:p>
         </w:tc>
@@ -2169,7 +2085,3351 @@
               <w:rPr>
                 <w:sz w:val="16"/>
               </w:rPr>
-              <w:t>__TX_AMOUNT__</w:t>
+              <w:t xml:space="preserve">  </w:t>
+            </w:r>
+            <w:r>
+              <w:rPr>
+                <w:sz w:val="16"/>
+              </w:rPr>
+              <w:t>-1</w:t>
+            </w:r>
+            <w:r>
+              <w:rPr>
+                <w:sz w:val="16"/>
+              </w:rPr>
+              <w:t>8 00</w:t>
+            </w:r>
+            <w:r>
+              <w:rPr>
+                <w:sz w:val="16"/>
+              </w:rPr>
+              <w:t>0,00 RUR</w:t>
+            </w:r>
+          </w:p>
+        </w:tc>
+      </w:tr>
+      <w:tr>
+        <w:trPr>
+          <w:trHeight w:val="442"/>
+        </w:trPr>
+        <w:tc>
+          <w:tcPr>
+            <w:tcW w:w="1239" w:type="dxa"/>
+            <w:tcBorders>
+              <w:top w:val="single" w:sz="4" w:space="0" w:color="7E7E7E"/>
+              <w:bottom w:val="single" w:sz="4" w:space="0" w:color="7E7E7E"/>
+            </w:tcBorders>
+          </w:tcPr>
+          <w:p>
+            <w:pPr>
+              <w:pStyle w:val="TableParagraph"/>
+              <w:spacing w:before="54"/>
+              <w:rPr>
+                <w:spacing w:val="-2"/>
+                <w:sz w:val="16"/>
+              </w:rPr>
+            </w:pPr>
+            <w:r>
+              <w:rPr>
+                <w:spacing w:val="-2"/>
+                <w:sz w:val="16"/>
+              </w:rPr>
+              <w:t>1</w:t>
+            </w:r>
+            <w:r>
+              <w:rPr>
+                <w:spacing w:val="-2"/>
+                <w:sz w:val="16"/>
+              </w:rPr>
+              <w:t>0</w:t>
+            </w:r>
+            <w:r>
+              <w:rPr>
+                <w:spacing w:val="-2"/>
+                <w:sz w:val="16"/>
+              </w:rPr>
+              <w:t>.0</w:t>
+            </w:r>
+            <w:r>
+              <w:rPr>
+                <w:spacing w:val="-2"/>
+                <w:sz w:val="16"/>
+              </w:rPr>
+              <w:t>4</w:t>
+            </w:r>
+            <w:r>
+              <w:rPr>
+                <w:spacing w:val="-2"/>
+                <w:sz w:val="16"/>
+              </w:rPr>
+              <w:t>.2026</w:t>
+            </w:r>
+          </w:p>
+        </w:tc>
+        <w:tc>
+          <w:tcPr>
+            <w:tcW w:w="1789" w:type="dxa"/>
+            <w:tcBorders>
+              <w:top w:val="single" w:sz="4" w:space="0" w:color="7E7E7E"/>
+              <w:bottom w:val="single" w:sz="4" w:space="0" w:color="7E7E7E"/>
+            </w:tcBorders>
+          </w:tcPr>
+          <w:p>
+            <w:pPr>
+              <w:pStyle w:val="TableParagraph"/>
+              <w:spacing w:before="54"/>
+              <w:ind w:left="144"/>
+              <w:rPr>
+                <w:spacing w:val="-2"/>
+                <w:sz w:val="16"/>
+              </w:rPr>
+            </w:pPr>
+            <w:r>
+              <w:rPr>
+                <w:spacing w:val="-2"/>
+                <w:sz w:val="16"/>
+              </w:rPr>
+              <w:t>С0113052</w:t>
+            </w:r>
+            <w:r>
+              <w:rPr>
+                <w:spacing w:val="-2"/>
+                <w:sz w:val="16"/>
+              </w:rPr>
+              <w:t>46622810</w:t>
+            </w:r>
+          </w:p>
+        </w:tc>
+        <w:tc>
+          <w:tcPr>
+            <w:tcW w:w="6430" w:type="dxa"/>
+            <w:tcBorders>
+              <w:top w:val="single" w:sz="4" w:space="0" w:color="7E7E7E"/>
+              <w:bottom w:val="single" w:sz="4" w:space="0" w:color="7E7E7E"/>
+            </w:tcBorders>
+          </w:tcPr>
+          <w:p>
+            <w:pPr>
+              <w:pStyle w:val="TableParagraph"/>
+              <w:spacing w:before="54" w:line="244" w:lineRule="auto"/>
+              <w:ind w:left="199" w:firstLine="195"/>
+              <w:rPr>
+                <w:spacing w:val="-2"/>
+                <w:sz w:val="16"/>
+              </w:rPr>
+            </w:pPr>
+            <w:r>
+              <w:rPr>
+                <w:spacing w:val="-2"/>
+                <w:sz w:val="16"/>
+              </w:rPr>
+              <w:t xml:space="preserve">Перевод </w:t>
+            </w:r>
+            <w:r>
+              <w:rPr>
+                <w:spacing w:val="-2"/>
+                <w:sz w:val="16"/>
+              </w:rPr>
+              <w:t xml:space="preserve">  </w:t>
+            </w:r>
+            <w:r>
+              <w:rPr>
+                <w:spacing w:val="-2"/>
+                <w:sz w:val="16"/>
+              </w:rPr>
+              <w:t xml:space="preserve">JSC*KWIKPAY </w:t>
+            </w:r>
+            <w:proofErr w:type="spellStart"/>
+            <w:r>
+              <w:rPr>
+                <w:spacing w:val="-2"/>
+                <w:sz w:val="16"/>
+              </w:rPr>
+              <w:t>online</w:t>
+            </w:r>
+            <w:proofErr w:type="spellEnd"/>
+            <w:r>
+              <w:rPr>
+                <w:spacing w:val="-5"/>
+                <w:sz w:val="16"/>
+              </w:rPr>
+              <w:t>.</w:t>
+            </w:r>
+          </w:p>
+        </w:tc>
+        <w:tc>
+          <w:tcPr>
+            <w:tcW w:w="1472" w:type="dxa"/>
+            <w:gridSpan w:val="2"/>
+            <w:tcBorders>
+              <w:top w:val="single" w:sz="4" w:space="0" w:color="7E7E7E"/>
+              <w:bottom w:val="single" w:sz="4" w:space="0" w:color="7E7E7E"/>
+            </w:tcBorders>
+          </w:tcPr>
+          <w:p>
+            <w:pPr>
+              <w:pStyle w:val="TableParagraph"/>
+              <w:spacing w:before="54"/>
+              <w:ind w:right="1"/>
+              <w:jc w:val="right"/>
+              <w:rPr>
+                <w:sz w:val="16"/>
+              </w:rPr>
+            </w:pPr>
+            <w:r>
+              <w:rPr>
+                <w:sz w:val="16"/>
+              </w:rPr>
+              <w:t>-2</w:t>
+            </w:r>
+            <w:r>
+              <w:rPr>
+                <w:sz w:val="16"/>
+              </w:rPr>
+              <w:t>88</w:t>
+            </w:r>
+            <w:r>
+              <w:rPr>
+                <w:sz w:val="16"/>
+              </w:rPr>
+              <w:t xml:space="preserve"> </w:t>
+            </w:r>
+            <w:r>
+              <w:rPr>
+                <w:sz w:val="16"/>
+              </w:rPr>
+              <w:t>040</w:t>
+            </w:r>
+            <w:r>
+              <w:rPr>
+                <w:sz w:val="16"/>
+              </w:rPr>
+              <w:t>,</w:t>
+            </w:r>
+            <w:r>
+              <w:rPr>
+                <w:sz w:val="16"/>
+              </w:rPr>
+              <w:t>22</w:t>
+            </w:r>
+            <w:r>
+              <w:rPr>
+                <w:spacing w:val="-3"/>
+                <w:sz w:val="16"/>
+              </w:rPr>
+              <w:t xml:space="preserve"> </w:t>
+            </w:r>
+            <w:r>
+              <w:rPr>
+                <w:spacing w:val="-5"/>
+                <w:sz w:val="16"/>
+              </w:rPr>
+              <w:t>RUR</w:t>
+            </w:r>
+          </w:p>
+        </w:tc>
+      </w:tr>
+      <w:tr>
+        <w:trPr>
+          <w:trHeight w:val="1249"/>
+        </w:trPr>
+        <w:tc>
+          <w:tcPr>
+            <w:tcW w:w="1239" w:type="dxa"/>
+            <w:shd w:val="clear" w:color="auto" w:fill="E8E8E8"/>
+          </w:tcPr>
+          <w:p>
+            <w:pPr>
+              <w:pStyle w:val="TableParagraph"/>
+              <w:spacing w:before="54"/>
+              <w:rPr>
+                <w:spacing w:val="-2"/>
+                <w:sz w:val="16"/>
+              </w:rPr>
+            </w:pPr>
+            <w:r>
+              <w:rPr>
+                <w:spacing w:val="-2"/>
+                <w:sz w:val="16"/>
+              </w:rPr>
+              <w:t>06.04.2026</w:t>
+            </w:r>
+          </w:p>
+        </w:tc>
+        <w:tc>
+          <w:tcPr>
+            <w:tcW w:w="1789" w:type="dxa"/>
+            <w:shd w:val="clear" w:color="auto" w:fill="E8E8E8"/>
+          </w:tcPr>
+          <w:p>
+            <w:pPr>
+              <w:pStyle w:val="TableParagraph"/>
+              <w:spacing w:before="54"/>
+              <w:ind w:left="144"/>
+              <w:rPr>
+                <w:spacing w:val="-2"/>
+                <w:sz w:val="16"/>
+              </w:rPr>
+            </w:pPr>
+            <w:r>
+              <w:rPr>
+                <w:spacing w:val="-2"/>
+                <w:sz w:val="16"/>
+              </w:rPr>
+              <w:t>C161305240761982</w:t>
+            </w:r>
+          </w:p>
+        </w:tc>
+        <w:tc>
+          <w:tcPr>
+            <w:tcW w:w="6430" w:type="dxa"/>
+            <w:shd w:val="clear" w:color="auto" w:fill="E8E8E8"/>
+          </w:tcPr>
+          <w:p>
+            <w:pPr>
+              <w:pStyle w:val="TableParagraph"/>
+              <w:spacing w:before="54" w:line="244" w:lineRule="auto"/>
+              <w:ind w:left="199" w:firstLine="195"/>
+              <w:rPr>
+                <w:sz w:val="16"/>
+              </w:rPr>
+            </w:pPr>
+            <w:r>
+              <w:rPr>
+                <w:sz w:val="16"/>
+              </w:rPr>
+              <w:t>Плательщик: ООО "Строительная компания СК10"</w:t>
+            </w:r>
+          </w:p>
+          <w:p>
+            <w:pPr>
+              <w:pStyle w:val="TableParagraph"/>
+              <w:spacing w:before="54" w:line="244" w:lineRule="auto"/>
+              <w:ind w:left="199" w:firstLine="195"/>
+              <w:rPr>
+                <w:sz w:val="16"/>
+              </w:rPr>
+            </w:pPr>
+            <w:r>
+              <w:rPr>
+                <w:sz w:val="16"/>
+              </w:rPr>
+              <w:t>ИНН плательщика: 6168006148</w:t>
+            </w:r>
+          </w:p>
+          <w:p>
+            <w:pPr>
+              <w:pStyle w:val="TableParagraph"/>
+              <w:spacing w:before="54" w:line="244" w:lineRule="auto"/>
+              <w:ind w:left="199" w:firstLine="195"/>
+              <w:rPr>
+                <w:sz w:val="16"/>
+              </w:rPr>
+            </w:pPr>
+            <w:r>
+              <w:rPr>
+                <w:sz w:val="16"/>
+              </w:rPr>
+              <w:t xml:space="preserve">Счет плательщика: </w:t>
+            </w:r>
+            <w:proofErr w:type="gramStart"/>
+            <w:r>
+              <w:rPr>
+                <w:sz w:val="16"/>
+              </w:rPr>
+              <w:t>40702810206640002909,  БИК</w:t>
+            </w:r>
+            <w:proofErr w:type="gramEnd"/>
+            <w:r>
+              <w:rPr>
+                <w:sz w:val="16"/>
+              </w:rPr>
+              <w:t xml:space="preserve"> 044525411</w:t>
+            </w:r>
+          </w:p>
+          <w:p>
+            <w:pPr>
+              <w:pStyle w:val="TableParagraph"/>
+              <w:spacing w:before="40" w:after="40"/>
+              <w:ind w:left="388"/>
+              <w:rPr>
+                <w:sz w:val="16"/>
+              </w:rPr>
+            </w:pPr>
+            <w:r>
+              <w:rPr>
+                <w:sz w:val="16"/>
+              </w:rPr>
+              <w:t xml:space="preserve">Назначение платежа: </w:t>
+            </w:r>
+            <w:r>
+              <w:rPr>
+                <w:sz w:val="16"/>
+              </w:rPr>
+              <w:t xml:space="preserve">Оплата за оказание </w:t>
+            </w:r>
+            <w:proofErr w:type="gramStart"/>
+            <w:r>
+              <w:rPr>
+                <w:sz w:val="16"/>
+              </w:rPr>
+              <w:t>услуг  по</w:t>
+            </w:r>
+            <w:proofErr w:type="gramEnd"/>
+            <w:r>
+              <w:rPr>
+                <w:sz w:val="16"/>
+              </w:rPr>
+              <w:t xml:space="preserve">  </w:t>
+            </w:r>
+            <w:proofErr w:type="gramStart"/>
+            <w:r>
+              <w:rPr>
+                <w:sz w:val="16"/>
+              </w:rPr>
+              <w:t>Договору  №</w:t>
+            </w:r>
+            <w:proofErr w:type="gramEnd"/>
+            <w:r>
+              <w:rPr>
+                <w:sz w:val="16"/>
+              </w:rPr>
+              <w:t>0</w:t>
+            </w:r>
+            <w:r>
+              <w:rPr>
+                <w:sz w:val="16"/>
+              </w:rPr>
+              <w:t>04</w:t>
+            </w:r>
+            <w:r>
+              <w:rPr>
+                <w:sz w:val="16"/>
+              </w:rPr>
+              <w:t>/</w:t>
+            </w:r>
+            <w:r>
+              <w:rPr>
+                <w:sz w:val="16"/>
+              </w:rPr>
+              <w:t>09</w:t>
+            </w:r>
+            <w:r>
+              <w:rPr>
+                <w:sz w:val="16"/>
+              </w:rPr>
+              <w:t>/2</w:t>
+            </w:r>
+            <w:r>
+              <w:rPr>
+                <w:sz w:val="16"/>
+              </w:rPr>
+              <w:t>5</w:t>
+            </w:r>
+            <w:r>
+              <w:rPr>
+                <w:sz w:val="16"/>
+              </w:rPr>
+              <w:t xml:space="preserve"> </w:t>
+            </w:r>
+            <w:proofErr w:type="gramStart"/>
+            <w:r>
+              <w:rPr>
+                <w:sz w:val="16"/>
+              </w:rPr>
+              <w:t xml:space="preserve">от </w:t>
+            </w:r>
+            <w:r>
+              <w:rPr>
+                <w:sz w:val="16"/>
+              </w:rPr>
+              <w:t xml:space="preserve"> </w:t>
+            </w:r>
+            <w:r>
+              <w:rPr>
+                <w:sz w:val="16"/>
+              </w:rPr>
+              <w:t>0</w:t>
+            </w:r>
+            <w:r>
+              <w:rPr>
+                <w:sz w:val="16"/>
+              </w:rPr>
+              <w:t>5</w:t>
+            </w:r>
+            <w:r>
+              <w:rPr>
+                <w:sz w:val="16"/>
+              </w:rPr>
+              <w:t>.</w:t>
+            </w:r>
+            <w:r>
+              <w:rPr>
+                <w:sz w:val="16"/>
+              </w:rPr>
+              <w:t>09</w:t>
+            </w:r>
+            <w:r>
+              <w:rPr>
+                <w:sz w:val="16"/>
+              </w:rPr>
+              <w:t>.25г</w:t>
+            </w:r>
+            <w:r>
+              <w:rPr>
+                <w:sz w:val="16"/>
+              </w:rPr>
+              <w:t>.</w:t>
+            </w:r>
+            <w:proofErr w:type="gramEnd"/>
+            <w:r>
+              <w:rPr>
+                <w:sz w:val="16"/>
+              </w:rPr>
+              <w:t xml:space="preserve"> </w:t>
+            </w:r>
+            <w:r>
+              <w:rPr>
+                <w:sz w:val="16"/>
+              </w:rPr>
+              <w:t>за период 01.</w:t>
+            </w:r>
+            <w:r>
+              <w:rPr>
+                <w:sz w:val="16"/>
+              </w:rPr>
+              <w:t>03</w:t>
+            </w:r>
+            <w:r>
+              <w:rPr>
+                <w:sz w:val="16"/>
+              </w:rPr>
+              <w:t>-3</w:t>
+            </w:r>
+            <w:r>
+              <w:rPr>
+                <w:sz w:val="16"/>
+              </w:rPr>
+              <w:t>1</w:t>
+            </w:r>
+            <w:r>
+              <w:rPr>
+                <w:sz w:val="16"/>
+              </w:rPr>
+              <w:t>.</w:t>
+            </w:r>
+            <w:r>
+              <w:rPr>
+                <w:sz w:val="16"/>
+              </w:rPr>
+              <w:t>03</w:t>
+            </w:r>
+            <w:r>
+              <w:rPr>
+                <w:sz w:val="16"/>
+              </w:rPr>
+              <w:t>.202</w:t>
+            </w:r>
+            <w:r>
+              <w:rPr>
+                <w:sz w:val="16"/>
+              </w:rPr>
+              <w:t>6</w:t>
+            </w:r>
+            <w:r>
+              <w:rPr>
+                <w:sz w:val="16"/>
+              </w:rPr>
+              <w:t>г., Акт №</w:t>
+            </w:r>
+            <w:r>
+              <w:rPr>
+                <w:sz w:val="16"/>
+              </w:rPr>
+              <w:t>3</w:t>
+            </w:r>
+            <w:r>
+              <w:rPr>
+                <w:sz w:val="16"/>
+              </w:rPr>
+              <w:t>/</w:t>
+            </w:r>
+            <w:proofErr w:type="gramStart"/>
+            <w:r>
+              <w:rPr>
+                <w:sz w:val="16"/>
+              </w:rPr>
+              <w:t>2</w:t>
+            </w:r>
+            <w:r>
+              <w:rPr>
+                <w:sz w:val="16"/>
+              </w:rPr>
+              <w:t>6</w:t>
+            </w:r>
+            <w:r>
+              <w:rPr>
+                <w:sz w:val="16"/>
+              </w:rPr>
+              <w:t xml:space="preserve">  от</w:t>
+            </w:r>
+            <w:proofErr w:type="gramEnd"/>
+            <w:r>
+              <w:rPr>
+                <w:sz w:val="16"/>
+              </w:rPr>
+              <w:t xml:space="preserve"> 3</w:t>
+            </w:r>
+            <w:r>
+              <w:rPr>
+                <w:sz w:val="16"/>
+              </w:rPr>
+              <w:t>1</w:t>
+            </w:r>
+            <w:r>
+              <w:rPr>
+                <w:sz w:val="16"/>
+              </w:rPr>
+              <w:t>.</w:t>
+            </w:r>
+            <w:r>
+              <w:rPr>
+                <w:sz w:val="16"/>
+              </w:rPr>
+              <w:t>03</w:t>
+            </w:r>
+            <w:r>
+              <w:rPr>
+                <w:sz w:val="16"/>
+              </w:rPr>
+              <w:t>.202</w:t>
+            </w:r>
+            <w:r>
+              <w:rPr>
+                <w:sz w:val="16"/>
+              </w:rPr>
+              <w:t>6</w:t>
+            </w:r>
+            <w:r>
+              <w:rPr>
+                <w:sz w:val="16"/>
+              </w:rPr>
+              <w:t>г.</w:t>
+            </w:r>
+            <w:r>
+              <w:rPr>
+                <w:sz w:val="16"/>
+              </w:rPr>
+              <w:t>,</w:t>
+            </w:r>
+            <w:r>
+              <w:rPr>
+                <w:sz w:val="16"/>
+              </w:rPr>
+              <w:t xml:space="preserve"> без НДС</w:t>
+            </w:r>
+            <w:r>
+              <w:rPr>
+                <w:sz w:val="16"/>
+              </w:rPr>
+              <w:t>.</w:t>
+            </w:r>
+            <w:r>
+              <w:rPr>
+                <w:sz w:val="16"/>
+              </w:rPr>
+              <w:t xml:space="preserve"> </w:t>
+            </w:r>
+          </w:p>
+        </w:tc>
+        <w:tc>
+          <w:tcPr>
+            <w:tcW w:w="1472" w:type="dxa"/>
+            <w:gridSpan w:val="2"/>
+            <w:shd w:val="clear" w:color="auto" w:fill="E8E8E8"/>
+          </w:tcPr>
+          <w:p>
+            <w:pPr>
+              <w:pStyle w:val="TableParagraph"/>
+              <w:spacing w:before="54"/>
+              <w:ind w:right="1"/>
+              <w:jc w:val="right"/>
+              <w:rPr>
+                <w:b/>
+                <w:sz w:val="16"/>
+              </w:rPr>
+            </w:pPr>
+            <w:r>
+              <w:rPr>
+                <w:b/>
+                <w:sz w:val="16"/>
+              </w:rPr>
+              <w:t xml:space="preserve">       </w:t>
+            </w:r>
+            <w:r>
+              <w:rPr>
+                <w:b/>
+                <w:sz w:val="16"/>
+              </w:rPr>
+              <w:t>300 000</w:t>
+            </w:r>
+            <w:r>
+              <w:rPr>
+                <w:b/>
+                <w:sz w:val="16"/>
+              </w:rPr>
+              <w:t>,00</w:t>
+            </w:r>
+            <w:r>
+              <w:rPr>
+                <w:b/>
+                <w:spacing w:val="-4"/>
+                <w:sz w:val="16"/>
+              </w:rPr>
+              <w:t xml:space="preserve"> </w:t>
+            </w:r>
+            <w:r>
+              <w:rPr>
+                <w:b/>
+                <w:spacing w:val="-5"/>
+                <w:sz w:val="16"/>
+              </w:rPr>
+              <w:t>RUR</w:t>
+            </w:r>
+          </w:p>
+        </w:tc>
+      </w:tr>
+      <w:tr>
+        <w:trPr>
+          <w:trHeight w:val="430"/>
+        </w:trPr>
+        <w:tc>
+          <w:tcPr>
+            <w:tcW w:w="1239" w:type="dxa"/>
+            <w:tcBorders>
+              <w:top w:val="single" w:sz="4" w:space="0" w:color="7E7E7E"/>
+            </w:tcBorders>
+          </w:tcPr>
+          <w:p>
+            <w:pPr>
+              <w:pStyle w:val="TableParagraph"/>
+              <w:spacing w:before="54"/>
+              <w:rPr>
+                <w:spacing w:val="-2"/>
+                <w:sz w:val="16"/>
+              </w:rPr>
+            </w:pPr>
+            <w:r>
+              <w:rPr>
+                <w:spacing w:val="-2"/>
+                <w:sz w:val="16"/>
+              </w:rPr>
+              <w:t>01.04.2026</w:t>
+            </w:r>
+          </w:p>
+        </w:tc>
+        <w:tc>
+          <w:tcPr>
+            <w:tcW w:w="1789" w:type="dxa"/>
+            <w:tcBorders>
+              <w:top w:val="single" w:sz="4" w:space="0" w:color="7E7E7E"/>
+            </w:tcBorders>
+          </w:tcPr>
+          <w:p>
+            <w:pPr>
+              <w:pStyle w:val="TableParagraph"/>
+              <w:spacing w:before="54"/>
+              <w:ind w:left="144"/>
+              <w:rPr>
+                <w:spacing w:val="-2"/>
+                <w:sz w:val="16"/>
+              </w:rPr>
+            </w:pPr>
+            <w:r>
+              <w:rPr>
+                <w:sz w:val="16"/>
+              </w:rPr>
+              <w:t xml:space="preserve"> MOSH</w:t>
+            </w:r>
+            <w:r>
+              <w:rPr>
+                <w:spacing w:val="-2"/>
+                <w:sz w:val="16"/>
+              </w:rPr>
+              <w:t xml:space="preserve"> 1940500209</w:t>
+            </w:r>
+          </w:p>
+        </w:tc>
+        <w:tc>
+          <w:tcPr>
+            <w:tcW w:w="6430" w:type="dxa"/>
+            <w:tcBorders>
+              <w:top w:val="single" w:sz="4" w:space="0" w:color="7E7E7E"/>
+            </w:tcBorders>
+          </w:tcPr>
+          <w:p>
+            <w:pPr>
+              <w:pStyle w:val="TableParagraph"/>
+              <w:spacing w:before="40" w:after="40"/>
+              <w:ind w:left="199" w:firstLine="195"/>
+              <w:rPr>
+                <w:sz w:val="16"/>
+              </w:rPr>
+            </w:pPr>
+            <w:r>
+              <w:rPr>
+                <w:sz w:val="16"/>
+              </w:rPr>
+              <w:t>Комиссия</w:t>
+            </w:r>
+            <w:r>
+              <w:rPr>
+                <w:spacing w:val="-11"/>
+                <w:sz w:val="16"/>
+              </w:rPr>
+              <w:t xml:space="preserve"> </w:t>
+            </w:r>
+            <w:r>
+              <w:rPr>
+                <w:sz w:val="16"/>
+              </w:rPr>
+              <w:t>за</w:t>
+            </w:r>
+            <w:r>
+              <w:rPr>
+                <w:spacing w:val="-10"/>
+                <w:sz w:val="16"/>
+              </w:rPr>
+              <w:t xml:space="preserve"> </w:t>
+            </w:r>
+            <w:r>
+              <w:rPr>
+                <w:sz w:val="16"/>
+              </w:rPr>
+              <w:t>пакет</w:t>
+            </w:r>
+            <w:r>
+              <w:rPr>
+                <w:spacing w:val="-10"/>
+                <w:sz w:val="16"/>
+              </w:rPr>
+              <w:t xml:space="preserve"> </w:t>
+            </w:r>
+            <w:r>
+              <w:rPr>
+                <w:sz w:val="16"/>
+              </w:rPr>
+              <w:t>услуг</w:t>
+            </w:r>
+            <w:r>
+              <w:rPr>
+                <w:spacing w:val="-11"/>
+                <w:sz w:val="16"/>
+              </w:rPr>
+              <w:t xml:space="preserve"> </w:t>
+            </w:r>
+            <w:r>
+              <w:rPr>
+                <w:sz w:val="16"/>
+              </w:rPr>
+              <w:t>за</w:t>
+            </w:r>
+            <w:r>
+              <w:rPr>
+                <w:spacing w:val="-10"/>
+                <w:sz w:val="16"/>
+              </w:rPr>
+              <w:t xml:space="preserve"> </w:t>
+            </w:r>
+            <w:r>
+              <w:rPr>
+                <w:sz w:val="16"/>
+              </w:rPr>
+              <w:t>март</w:t>
+            </w:r>
+            <w:r>
+              <w:rPr>
+                <w:spacing w:val="-10"/>
+                <w:sz w:val="16"/>
+              </w:rPr>
+              <w:t xml:space="preserve"> </w:t>
+            </w:r>
+            <w:r>
+              <w:rPr>
+                <w:sz w:val="16"/>
+              </w:rPr>
+              <w:t>2026</w:t>
+            </w:r>
+            <w:r>
+              <w:rPr>
+                <w:spacing w:val="-11"/>
+                <w:sz w:val="16"/>
+              </w:rPr>
+              <w:t xml:space="preserve"> </w:t>
+            </w:r>
+            <w:r>
+              <w:rPr>
+                <w:sz w:val="16"/>
+              </w:rPr>
+              <w:t>г.</w:t>
+            </w:r>
+            <w:r>
+              <w:rPr>
+                <w:spacing w:val="-10"/>
+                <w:sz w:val="16"/>
+              </w:rPr>
+              <w:t xml:space="preserve"> </w:t>
+            </w:r>
+            <w:r>
+              <w:rPr>
+                <w:sz w:val="16"/>
+              </w:rPr>
+              <w:t>Согласно</w:t>
+            </w:r>
+            <w:r>
+              <w:rPr>
+                <w:spacing w:val="-10"/>
+                <w:sz w:val="16"/>
+              </w:rPr>
+              <w:t xml:space="preserve"> </w:t>
+            </w:r>
+            <w:r>
+              <w:rPr>
+                <w:sz w:val="16"/>
+              </w:rPr>
+              <w:t>тарифам банка.</w:t>
+            </w:r>
+            <w:r>
+              <w:rPr>
+                <w:spacing w:val="-11"/>
+                <w:sz w:val="16"/>
+              </w:rPr>
+              <w:t xml:space="preserve"> </w:t>
+            </w:r>
+            <w:r>
+              <w:rPr>
+                <w:spacing w:val="-11"/>
+                <w:sz w:val="16"/>
+              </w:rPr>
+              <w:t xml:space="preserve"> </w:t>
+            </w:r>
+          </w:p>
+        </w:tc>
+        <w:tc>
+          <w:tcPr>
+            <w:tcW w:w="1472" w:type="dxa"/>
+            <w:gridSpan w:val="2"/>
+            <w:tcBorders>
+              <w:top w:val="single" w:sz="4" w:space="0" w:color="7E7E7E"/>
+            </w:tcBorders>
+          </w:tcPr>
+          <w:p>
+            <w:pPr>
+              <w:pStyle w:val="TableParagraph"/>
+              <w:spacing w:before="54"/>
+              <w:ind w:right="1"/>
+              <w:jc w:val="right"/>
+              <w:rPr>
+                <w:b/>
+                <w:sz w:val="16"/>
+              </w:rPr>
+            </w:pPr>
+            <w:r>
+              <w:rPr>
+                <w:sz w:val="16"/>
+              </w:rPr>
+              <w:t xml:space="preserve">  </w:t>
+            </w:r>
+            <w:r>
+              <w:rPr>
+                <w:sz w:val="16"/>
+              </w:rPr>
+              <w:t xml:space="preserve">    -</w:t>
+            </w:r>
+            <w:r>
+              <w:rPr>
+                <w:spacing w:val="-2"/>
+                <w:sz w:val="16"/>
+              </w:rPr>
+              <w:t xml:space="preserve"> 399</w:t>
+            </w:r>
+            <w:r>
+              <w:rPr>
+                <w:sz w:val="16"/>
+              </w:rPr>
+              <w:t>,00</w:t>
+            </w:r>
+            <w:r>
+              <w:rPr>
+                <w:spacing w:val="-2"/>
+                <w:sz w:val="16"/>
+              </w:rPr>
+              <w:t xml:space="preserve"> </w:t>
+            </w:r>
+            <w:r>
+              <w:rPr>
+                <w:spacing w:val="-5"/>
+                <w:sz w:val="16"/>
+              </w:rPr>
+              <w:t>RUR</w:t>
+            </w:r>
+          </w:p>
+        </w:tc>
+      </w:tr>
+      <w:tr>
+        <w:trPr>
+          <w:trHeight w:val="515"/>
+        </w:trPr>
+        <w:tc>
+          <w:tcPr>
+            <w:tcW w:w="1239" w:type="dxa"/>
+            <w:tcBorders>
+              <w:top w:val="single" w:sz="4" w:space="0" w:color="7E7E7E"/>
+              <w:bottom w:val="single" w:sz="4" w:space="0" w:color="7E7E7E"/>
+            </w:tcBorders>
+          </w:tcPr>
+          <w:p>
+            <w:pPr>
+              <w:pStyle w:val="TableParagraph"/>
+              <w:spacing w:before="54"/>
+              <w:rPr>
+                <w:spacing w:val="-2"/>
+                <w:sz w:val="16"/>
+              </w:rPr>
+            </w:pPr>
+            <w:r>
+              <w:rPr>
+                <w:spacing w:val="-2"/>
+                <w:sz w:val="16"/>
+              </w:rPr>
+              <w:t>20.03.2026</w:t>
+            </w:r>
+          </w:p>
+        </w:tc>
+        <w:tc>
+          <w:tcPr>
+            <w:tcW w:w="1789" w:type="dxa"/>
+            <w:tcBorders>
+              <w:top w:val="single" w:sz="4" w:space="0" w:color="7E7E7E"/>
+              <w:bottom w:val="single" w:sz="4" w:space="0" w:color="7E7E7E"/>
+            </w:tcBorders>
+          </w:tcPr>
+          <w:p>
+            <w:pPr>
+              <w:pStyle w:val="TableParagraph"/>
+              <w:spacing w:before="54"/>
+              <w:ind w:left="144"/>
+              <w:rPr>
+                <w:spacing w:val="-2"/>
+                <w:sz w:val="16"/>
+              </w:rPr>
+            </w:pPr>
+            <w:r>
+              <w:rPr>
+                <w:spacing w:val="-2"/>
+                <w:sz w:val="16"/>
+              </w:rPr>
+              <w:t>С011334780343002</w:t>
+            </w:r>
+          </w:p>
+        </w:tc>
+        <w:tc>
+          <w:tcPr>
+            <w:tcW w:w="6430" w:type="dxa"/>
+            <w:tcBorders>
+              <w:top w:val="single" w:sz="4" w:space="0" w:color="7E7E7E"/>
+              <w:bottom w:val="single" w:sz="4" w:space="0" w:color="7E7E7E"/>
+            </w:tcBorders>
+          </w:tcPr>
+          <w:p>
+            <w:pPr>
+              <w:pStyle w:val="TableParagraph"/>
+              <w:spacing w:before="40" w:after="40"/>
+              <w:ind w:left="199" w:firstLine="195"/>
+              <w:rPr>
+                <w:sz w:val="16"/>
+              </w:rPr>
+            </w:pPr>
+            <w:r>
+              <w:rPr>
+                <w:spacing w:val="-2"/>
+                <w:sz w:val="16"/>
+              </w:rPr>
+              <w:t xml:space="preserve">Единый налоговый платеж. Оплата НПД за </w:t>
+            </w:r>
+            <w:r>
+              <w:rPr>
+                <w:spacing w:val="-2"/>
+                <w:sz w:val="16"/>
+              </w:rPr>
+              <w:t>февраль</w:t>
+            </w:r>
+            <w:r>
+              <w:rPr>
+                <w:spacing w:val="-2"/>
+                <w:sz w:val="16"/>
+              </w:rPr>
+              <w:t xml:space="preserve"> 202</w:t>
+            </w:r>
+            <w:r>
+              <w:rPr>
+                <w:spacing w:val="-2"/>
+                <w:sz w:val="16"/>
+              </w:rPr>
+              <w:t>6</w:t>
+            </w:r>
+            <w:r>
+              <w:rPr>
+                <w:spacing w:val="-2"/>
+                <w:sz w:val="16"/>
+              </w:rPr>
+              <w:t xml:space="preserve">г.                                              </w:t>
+            </w:r>
+          </w:p>
+        </w:tc>
+        <w:tc>
+          <w:tcPr>
+            <w:tcW w:w="1472" w:type="dxa"/>
+            <w:gridSpan w:val="2"/>
+            <w:tcBorders>
+              <w:top w:val="single" w:sz="4" w:space="0" w:color="7E7E7E"/>
+              <w:bottom w:val="single" w:sz="4" w:space="0" w:color="7E7E7E"/>
+            </w:tcBorders>
+          </w:tcPr>
+          <w:p>
+            <w:pPr>
+              <w:pStyle w:val="TableParagraph"/>
+              <w:spacing w:before="54"/>
+              <w:ind w:right="1"/>
+              <w:jc w:val="right"/>
+              <w:rPr>
+                <w:b/>
+                <w:sz w:val="16"/>
+              </w:rPr>
+            </w:pPr>
+            <w:r>
+              <w:rPr>
+                <w:sz w:val="16"/>
+              </w:rPr>
+              <w:t xml:space="preserve">  </w:t>
+            </w:r>
+            <w:r>
+              <w:rPr>
+                <w:sz w:val="16"/>
+              </w:rPr>
+              <w:t>-1</w:t>
+            </w:r>
+            <w:r>
+              <w:rPr>
+                <w:sz w:val="16"/>
+              </w:rPr>
+              <w:t>8 00</w:t>
+            </w:r>
+            <w:r>
+              <w:rPr>
+                <w:sz w:val="16"/>
+              </w:rPr>
+              <w:t>0,00 RUR</w:t>
+            </w:r>
+          </w:p>
+        </w:tc>
+      </w:tr>
+      <w:tr>
+        <w:trPr>
+          <w:trHeight w:val="515"/>
+        </w:trPr>
+        <w:tc>
+          <w:tcPr>
+            <w:tcW w:w="1239" w:type="dxa"/>
+            <w:tcBorders>
+              <w:top w:val="single" w:sz="4" w:space="0" w:color="7E7E7E"/>
+              <w:bottom w:val="single" w:sz="4" w:space="0" w:color="7E7E7E"/>
+            </w:tcBorders>
+          </w:tcPr>
+          <w:p>
+            <w:pPr>
+              <w:pStyle w:val="TableParagraph"/>
+              <w:spacing w:before="54"/>
+              <w:rPr>
+                <w:spacing w:val="-2"/>
+                <w:sz w:val="16"/>
+              </w:rPr>
+            </w:pPr>
+            <w:r>
+              <w:rPr>
+                <w:spacing w:val="-2"/>
+                <w:sz w:val="16"/>
+              </w:rPr>
+              <w:t>1</w:t>
+            </w:r>
+            <w:r>
+              <w:rPr>
+                <w:spacing w:val="-2"/>
+                <w:sz w:val="16"/>
+              </w:rPr>
+              <w:t>2</w:t>
+            </w:r>
+            <w:r>
+              <w:rPr>
+                <w:spacing w:val="-2"/>
+                <w:sz w:val="16"/>
+              </w:rPr>
+              <w:t>.0</w:t>
+            </w:r>
+            <w:r>
+              <w:rPr>
+                <w:spacing w:val="-2"/>
+                <w:sz w:val="16"/>
+              </w:rPr>
+              <w:t>3</w:t>
+            </w:r>
+            <w:r>
+              <w:rPr>
+                <w:spacing w:val="-2"/>
+                <w:sz w:val="16"/>
+              </w:rPr>
+              <w:t>.2026</w:t>
+            </w:r>
+          </w:p>
+        </w:tc>
+        <w:tc>
+          <w:tcPr>
+            <w:tcW w:w="1789" w:type="dxa"/>
+            <w:tcBorders>
+              <w:top w:val="single" w:sz="4" w:space="0" w:color="7E7E7E"/>
+              <w:bottom w:val="single" w:sz="4" w:space="0" w:color="7E7E7E"/>
+            </w:tcBorders>
+          </w:tcPr>
+          <w:p>
+            <w:pPr>
+              <w:pStyle w:val="TableParagraph"/>
+              <w:spacing w:before="54"/>
+              <w:ind w:left="144"/>
+              <w:rPr>
+                <w:spacing w:val="-2"/>
+                <w:sz w:val="16"/>
+              </w:rPr>
+            </w:pPr>
+            <w:r>
+              <w:rPr>
+                <w:spacing w:val="-2"/>
+                <w:sz w:val="16"/>
+              </w:rPr>
+              <w:t>С011305</w:t>
+            </w:r>
+            <w:r>
+              <w:rPr>
+                <w:spacing w:val="-2"/>
+                <w:sz w:val="16"/>
+              </w:rPr>
+              <w:t>557389655</w:t>
+            </w:r>
+          </w:p>
+        </w:tc>
+        <w:tc>
+          <w:tcPr>
+            <w:tcW w:w="6430" w:type="dxa"/>
+            <w:tcBorders>
+              <w:top w:val="single" w:sz="4" w:space="0" w:color="7E7E7E"/>
+              <w:bottom w:val="single" w:sz="4" w:space="0" w:color="7E7E7E"/>
+            </w:tcBorders>
+          </w:tcPr>
+          <w:p>
+            <w:pPr>
+              <w:pStyle w:val="TableParagraph"/>
+              <w:spacing w:before="40" w:after="40"/>
+              <w:ind w:left="199" w:firstLine="195"/>
+              <w:rPr>
+                <w:spacing w:val="-2"/>
+                <w:sz w:val="16"/>
+              </w:rPr>
+            </w:pPr>
+            <w:r>
+              <w:rPr>
+                <w:spacing w:val="-2"/>
+                <w:sz w:val="16"/>
+              </w:rPr>
+              <w:t xml:space="preserve">Перевод </w:t>
+            </w:r>
+            <w:r>
+              <w:rPr>
+                <w:spacing w:val="-2"/>
+                <w:sz w:val="16"/>
+              </w:rPr>
+              <w:t xml:space="preserve">  </w:t>
+            </w:r>
+            <w:r>
+              <w:rPr>
+                <w:spacing w:val="-2"/>
+                <w:sz w:val="16"/>
+              </w:rPr>
+              <w:t xml:space="preserve">JSC*KWIKPAY </w:t>
+            </w:r>
+            <w:proofErr w:type="spellStart"/>
+            <w:r>
+              <w:rPr>
+                <w:spacing w:val="-2"/>
+                <w:sz w:val="16"/>
+              </w:rPr>
+              <w:t>online</w:t>
+            </w:r>
+            <w:proofErr w:type="spellEnd"/>
+            <w:r>
+              <w:rPr>
+                <w:spacing w:val="-5"/>
+                <w:sz w:val="16"/>
+              </w:rPr>
+              <w:t>.</w:t>
+            </w:r>
+          </w:p>
+        </w:tc>
+        <w:tc>
+          <w:tcPr>
+            <w:tcW w:w="1472" w:type="dxa"/>
+            <w:gridSpan w:val="2"/>
+            <w:tcBorders>
+              <w:top w:val="single" w:sz="4" w:space="0" w:color="7E7E7E"/>
+              <w:bottom w:val="single" w:sz="4" w:space="0" w:color="7E7E7E"/>
+            </w:tcBorders>
+          </w:tcPr>
+          <w:p>
+            <w:pPr>
+              <w:pStyle w:val="TableParagraph"/>
+              <w:spacing w:before="54"/>
+              <w:ind w:right="1"/>
+              <w:jc w:val="right"/>
+              <w:rPr>
+                <w:sz w:val="16"/>
+              </w:rPr>
+            </w:pPr>
+            <w:r>
+              <w:rPr>
+                <w:sz w:val="16"/>
+              </w:rPr>
+              <w:t>-2</w:t>
+            </w:r>
+            <w:r>
+              <w:rPr>
+                <w:sz w:val="16"/>
+              </w:rPr>
+              <w:t>70</w:t>
+            </w:r>
+            <w:r>
+              <w:rPr>
+                <w:sz w:val="16"/>
+              </w:rPr>
+              <w:t xml:space="preserve"> </w:t>
+            </w:r>
+            <w:r>
+              <w:rPr>
+                <w:sz w:val="16"/>
+              </w:rPr>
+              <w:t>733</w:t>
+            </w:r>
+            <w:r>
+              <w:rPr>
+                <w:sz w:val="16"/>
+              </w:rPr>
+              <w:t>,</w:t>
+            </w:r>
+            <w:r>
+              <w:rPr>
+                <w:sz w:val="16"/>
+              </w:rPr>
+              <w:t>91</w:t>
+            </w:r>
+            <w:r>
+              <w:rPr>
+                <w:spacing w:val="-3"/>
+                <w:sz w:val="16"/>
+              </w:rPr>
+              <w:t xml:space="preserve"> </w:t>
+            </w:r>
+            <w:r>
+              <w:rPr>
+                <w:spacing w:val="-5"/>
+                <w:sz w:val="16"/>
+              </w:rPr>
+              <w:t>RUR</w:t>
+            </w:r>
+          </w:p>
+        </w:tc>
+      </w:tr>
+      <w:tr>
+        <w:trPr>
+          <w:trHeight w:val="1152"/>
+        </w:trPr>
+        <w:tc>
+          <w:tcPr>
+            <w:tcW w:w="1239" w:type="dxa"/>
+            <w:tcBorders>
+              <w:top w:val="single" w:sz="4" w:space="0" w:color="7E7E7E"/>
+              <w:bottom w:val="single" w:sz="4" w:space="0" w:color="7E7E7E"/>
+            </w:tcBorders>
+            <w:shd w:val="clear" w:color="auto" w:fill="E8E8E8"/>
+          </w:tcPr>
+          <w:p>
+            <w:pPr>
+              <w:pStyle w:val="TableParagraph"/>
+              <w:spacing w:before="54"/>
+              <w:rPr>
+                <w:spacing w:val="-2"/>
+                <w:sz w:val="16"/>
+              </w:rPr>
+            </w:pPr>
+            <w:r>
+              <w:rPr>
+                <w:spacing w:val="-2"/>
+                <w:sz w:val="16"/>
+              </w:rPr>
+              <w:t>06.0</w:t>
+            </w:r>
+            <w:r>
+              <w:rPr>
+                <w:spacing w:val="-2"/>
+                <w:sz w:val="16"/>
+                <w:lang w:val="en-US"/>
+              </w:rPr>
+              <w:t>3</w:t>
+            </w:r>
+            <w:r>
+              <w:rPr>
+                <w:spacing w:val="-2"/>
+                <w:sz w:val="16"/>
+              </w:rPr>
+              <w:t>.2026</w:t>
+            </w:r>
+          </w:p>
+        </w:tc>
+        <w:tc>
+          <w:tcPr>
+            <w:tcW w:w="1789" w:type="dxa"/>
+            <w:tcBorders>
+              <w:top w:val="single" w:sz="4" w:space="0" w:color="7E7E7E"/>
+              <w:bottom w:val="single" w:sz="4" w:space="0" w:color="7E7E7E"/>
+            </w:tcBorders>
+            <w:shd w:val="clear" w:color="auto" w:fill="E8E8E8"/>
+          </w:tcPr>
+          <w:p>
+            <w:pPr>
+              <w:pStyle w:val="TableParagraph"/>
+              <w:spacing w:before="54"/>
+              <w:ind w:left="144"/>
+              <w:rPr>
+                <w:sz w:val="16"/>
+                <w:lang w:val="en-US"/>
+              </w:rPr>
+            </w:pPr>
+            <w:r>
+              <w:rPr>
+                <w:spacing w:val="-2"/>
+                <w:sz w:val="16"/>
+              </w:rPr>
+              <w:t>C16130524</w:t>
+            </w:r>
+            <w:r>
+              <w:rPr>
+                <w:spacing w:val="-2"/>
+                <w:sz w:val="16"/>
+                <w:lang w:val="en-US"/>
+              </w:rPr>
+              <w:t>2384665</w:t>
+            </w:r>
+          </w:p>
+        </w:tc>
+        <w:tc>
+          <w:tcPr>
+            <w:tcW w:w="6430" w:type="dxa"/>
+            <w:shd w:val="clear" w:color="auto" w:fill="E8E8E8"/>
+          </w:tcPr>
+          <w:p>
+            <w:pPr>
+              <w:pStyle w:val="TableParagraph"/>
+              <w:spacing w:before="40" w:after="40"/>
+              <w:ind w:left="199" w:firstLine="195"/>
+              <w:rPr>
+                <w:sz w:val="16"/>
+              </w:rPr>
+            </w:pPr>
+            <w:r>
+              <w:rPr>
+                <w:sz w:val="16"/>
+              </w:rPr>
+              <w:t>Плательщик: ООО "Строительная компания СК10"</w:t>
+            </w:r>
+          </w:p>
+          <w:p>
+            <w:pPr>
+              <w:pStyle w:val="TableParagraph"/>
+              <w:spacing w:before="40" w:after="40"/>
+              <w:ind w:left="199" w:firstLine="195"/>
+              <w:rPr>
+                <w:sz w:val="16"/>
+              </w:rPr>
+            </w:pPr>
+            <w:r>
+              <w:rPr>
+                <w:sz w:val="16"/>
+              </w:rPr>
+              <w:t>ИНН плательщика: 6168006148</w:t>
+            </w:r>
+          </w:p>
+          <w:p>
+            <w:pPr>
+              <w:pStyle w:val="TableParagraph"/>
+              <w:spacing w:before="40" w:after="40"/>
+              <w:ind w:left="199" w:firstLine="195"/>
+              <w:rPr>
+                <w:sz w:val="16"/>
+              </w:rPr>
+            </w:pPr>
+            <w:r>
+              <w:rPr>
+                <w:sz w:val="16"/>
+              </w:rPr>
+              <w:t xml:space="preserve">Счет плательщика: </w:t>
+            </w:r>
+            <w:proofErr w:type="gramStart"/>
+            <w:r>
+              <w:rPr>
+                <w:sz w:val="16"/>
+              </w:rPr>
+              <w:t>40702810206640002909,  БИК</w:t>
+            </w:r>
+            <w:proofErr w:type="gramEnd"/>
+            <w:r>
+              <w:rPr>
+                <w:sz w:val="16"/>
+              </w:rPr>
+              <w:t xml:space="preserve"> 044525411</w:t>
+            </w:r>
+          </w:p>
+          <w:p>
+            <w:pPr>
+              <w:pStyle w:val="TableParagraph"/>
+              <w:spacing w:before="54"/>
+              <w:ind w:left="388"/>
+              <w:rPr>
+                <w:sz w:val="16"/>
+              </w:rPr>
+            </w:pPr>
+            <w:r>
+              <w:rPr>
+                <w:sz w:val="16"/>
+              </w:rPr>
+              <w:t xml:space="preserve"> </w:t>
+            </w:r>
+            <w:r>
+              <w:rPr>
+                <w:sz w:val="16"/>
+              </w:rPr>
+              <w:t xml:space="preserve">Назначение платежа: </w:t>
+            </w:r>
+            <w:r>
+              <w:rPr>
+                <w:sz w:val="16"/>
+              </w:rPr>
+              <w:t xml:space="preserve">Оплата за оказание </w:t>
+            </w:r>
+            <w:proofErr w:type="gramStart"/>
+            <w:r>
+              <w:rPr>
+                <w:sz w:val="16"/>
+              </w:rPr>
+              <w:t>услуг  по</w:t>
+            </w:r>
+            <w:proofErr w:type="gramEnd"/>
+            <w:r>
+              <w:rPr>
+                <w:sz w:val="16"/>
+              </w:rPr>
+              <w:t xml:space="preserve">  </w:t>
+            </w:r>
+            <w:proofErr w:type="gramStart"/>
+            <w:r>
+              <w:rPr>
+                <w:sz w:val="16"/>
+              </w:rPr>
+              <w:t>Договору  №</w:t>
+            </w:r>
+            <w:proofErr w:type="gramEnd"/>
+            <w:r>
+              <w:rPr>
+                <w:sz w:val="16"/>
+              </w:rPr>
+              <w:t xml:space="preserve">004/09/25 </w:t>
+            </w:r>
+            <w:proofErr w:type="gramStart"/>
+            <w:r>
+              <w:rPr>
+                <w:sz w:val="16"/>
+              </w:rPr>
+              <w:t>от  05.09.25г.</w:t>
+            </w:r>
+            <w:proofErr w:type="gramEnd"/>
+            <w:r>
+              <w:rPr>
+                <w:sz w:val="16"/>
+              </w:rPr>
+              <w:t xml:space="preserve"> </w:t>
+            </w:r>
+            <w:r>
+              <w:rPr>
+                <w:sz w:val="16"/>
+              </w:rPr>
+              <w:t xml:space="preserve"> за период 01.</w:t>
+            </w:r>
+            <w:r>
+              <w:rPr>
+                <w:sz w:val="16"/>
+              </w:rPr>
+              <w:t>0</w:t>
+            </w:r>
+            <w:r>
+              <w:rPr>
+                <w:sz w:val="16"/>
+              </w:rPr>
+              <w:t>2</w:t>
+            </w:r>
+            <w:r>
+              <w:rPr>
+                <w:sz w:val="16"/>
+              </w:rPr>
+              <w:t>-</w:t>
+            </w:r>
+            <w:r>
+              <w:rPr>
+                <w:sz w:val="16"/>
+              </w:rPr>
+              <w:t>28</w:t>
+            </w:r>
+            <w:r>
+              <w:rPr>
+                <w:sz w:val="16"/>
+              </w:rPr>
+              <w:t>.</w:t>
+            </w:r>
+            <w:r>
+              <w:rPr>
+                <w:sz w:val="16"/>
+              </w:rPr>
+              <w:t>0</w:t>
+            </w:r>
+            <w:r>
+              <w:rPr>
+                <w:sz w:val="16"/>
+              </w:rPr>
+              <w:t>2</w:t>
+            </w:r>
+            <w:r>
+              <w:rPr>
+                <w:sz w:val="16"/>
+              </w:rPr>
+              <w:t>.202</w:t>
+            </w:r>
+            <w:r>
+              <w:rPr>
+                <w:sz w:val="16"/>
+              </w:rPr>
+              <w:t>6</w:t>
+            </w:r>
+            <w:r>
+              <w:rPr>
+                <w:sz w:val="16"/>
+              </w:rPr>
+              <w:t>г., Акт №</w:t>
+            </w:r>
+            <w:r>
+              <w:rPr>
+                <w:sz w:val="16"/>
+              </w:rPr>
+              <w:t>2</w:t>
+            </w:r>
+            <w:r>
+              <w:rPr>
+                <w:sz w:val="16"/>
+              </w:rPr>
+              <w:t>/</w:t>
+            </w:r>
+            <w:proofErr w:type="gramStart"/>
+            <w:r>
+              <w:rPr>
+                <w:sz w:val="16"/>
+              </w:rPr>
+              <w:t>26</w:t>
+            </w:r>
+            <w:r>
+              <w:rPr>
+                <w:sz w:val="16"/>
+              </w:rPr>
+              <w:t xml:space="preserve">  от</w:t>
+            </w:r>
+            <w:proofErr w:type="gramEnd"/>
+            <w:r>
+              <w:rPr>
+                <w:sz w:val="16"/>
+              </w:rPr>
+              <w:t xml:space="preserve"> </w:t>
+            </w:r>
+            <w:r>
+              <w:rPr>
+                <w:sz w:val="16"/>
+              </w:rPr>
+              <w:t>28</w:t>
+            </w:r>
+            <w:r>
+              <w:rPr>
+                <w:sz w:val="16"/>
+              </w:rPr>
+              <w:t>.</w:t>
+            </w:r>
+            <w:r>
+              <w:rPr>
+                <w:sz w:val="16"/>
+              </w:rPr>
+              <w:t>0</w:t>
+            </w:r>
+            <w:r>
+              <w:rPr>
+                <w:sz w:val="16"/>
+              </w:rPr>
+              <w:t>2</w:t>
+            </w:r>
+            <w:r>
+              <w:rPr>
+                <w:sz w:val="16"/>
+              </w:rPr>
+              <w:t>.202</w:t>
+            </w:r>
+            <w:r>
+              <w:rPr>
+                <w:sz w:val="16"/>
+              </w:rPr>
+              <w:t>6</w:t>
+            </w:r>
+            <w:r>
+              <w:rPr>
+                <w:sz w:val="16"/>
+              </w:rPr>
+              <w:t>г.</w:t>
+            </w:r>
+            <w:r>
+              <w:rPr>
+                <w:sz w:val="16"/>
+              </w:rPr>
+              <w:t>,</w:t>
+            </w:r>
+            <w:r>
+              <w:rPr>
+                <w:sz w:val="16"/>
+              </w:rPr>
+              <w:t xml:space="preserve"> без НДС</w:t>
+            </w:r>
+            <w:r>
+              <w:rPr>
+                <w:sz w:val="16"/>
+              </w:rPr>
+              <w:t>.</w:t>
+            </w:r>
+          </w:p>
+        </w:tc>
+        <w:tc>
+          <w:tcPr>
+            <w:tcW w:w="1472" w:type="dxa"/>
+            <w:gridSpan w:val="2"/>
+            <w:shd w:val="clear" w:color="auto" w:fill="E8E8E8"/>
+          </w:tcPr>
+          <w:p>
+            <w:pPr>
+              <w:pStyle w:val="TableParagraph"/>
+              <w:spacing w:before="54"/>
+              <w:ind w:right="1"/>
+              <w:jc w:val="right"/>
+              <w:rPr>
+                <w:sz w:val="16"/>
+              </w:rPr>
+            </w:pPr>
+            <w:r>
+              <w:rPr>
+                <w:b/>
+                <w:sz w:val="16"/>
+              </w:rPr>
+              <w:t xml:space="preserve">    </w:t>
+            </w:r>
+            <w:r>
+              <w:rPr>
+                <w:b/>
+                <w:sz w:val="16"/>
+              </w:rPr>
+              <w:t xml:space="preserve">  300 000</w:t>
+            </w:r>
+            <w:r>
+              <w:rPr>
+                <w:b/>
+                <w:sz w:val="16"/>
+              </w:rPr>
+              <w:t>,00</w:t>
+            </w:r>
+            <w:r>
+              <w:rPr>
+                <w:b/>
+                <w:spacing w:val="-4"/>
+                <w:sz w:val="16"/>
+              </w:rPr>
+              <w:t xml:space="preserve"> </w:t>
+            </w:r>
+            <w:r>
+              <w:rPr>
+                <w:b/>
+                <w:spacing w:val="-5"/>
+                <w:sz w:val="16"/>
+              </w:rPr>
+              <w:t>RUR</w:t>
+            </w:r>
+          </w:p>
+        </w:tc>
+      </w:tr>
+      <w:tr>
+        <w:trPr>
+          <w:trHeight w:val="383"/>
+        </w:trPr>
+        <w:tc>
+          <w:tcPr>
+            <w:tcW w:w="1239" w:type="dxa"/>
+            <w:tcBorders>
+              <w:top w:val="single" w:sz="4" w:space="0" w:color="7E7E7E"/>
+            </w:tcBorders>
+          </w:tcPr>
+          <w:p>
+            <w:pPr>
+              <w:pStyle w:val="TableParagraph"/>
+              <w:spacing w:before="54"/>
+              <w:rPr>
+                <w:spacing w:val="-2"/>
+                <w:sz w:val="16"/>
+              </w:rPr>
+            </w:pPr>
+            <w:r>
+              <w:rPr>
+                <w:spacing w:val="-2"/>
+                <w:sz w:val="16"/>
+              </w:rPr>
+              <w:t>01.03.2026</w:t>
+            </w:r>
+          </w:p>
+        </w:tc>
+        <w:tc>
+          <w:tcPr>
+            <w:tcW w:w="1789" w:type="dxa"/>
+            <w:tcBorders>
+              <w:top w:val="single" w:sz="4" w:space="0" w:color="7E7E7E"/>
+            </w:tcBorders>
+          </w:tcPr>
+          <w:p>
+            <w:pPr>
+              <w:pStyle w:val="TableParagraph"/>
+              <w:spacing w:before="54"/>
+              <w:ind w:left="144"/>
+              <w:rPr>
+                <w:spacing w:val="-2"/>
+                <w:sz w:val="16"/>
+              </w:rPr>
+            </w:pPr>
+            <w:r>
+              <w:rPr>
+                <w:sz w:val="16"/>
+              </w:rPr>
+              <w:t xml:space="preserve"> MOSH</w:t>
+            </w:r>
+            <w:r>
+              <w:rPr>
+                <w:spacing w:val="-2"/>
+                <w:sz w:val="16"/>
+              </w:rPr>
+              <w:t xml:space="preserve"> 1949145572</w:t>
+            </w:r>
+          </w:p>
+        </w:tc>
+        <w:tc>
+          <w:tcPr>
+            <w:tcW w:w="6430" w:type="dxa"/>
+            <w:tcBorders>
+              <w:top w:val="single" w:sz="4" w:space="0" w:color="7E7E7E"/>
+            </w:tcBorders>
+          </w:tcPr>
+          <w:p>
+            <w:pPr>
+              <w:pStyle w:val="TableParagraph"/>
+              <w:spacing w:before="54"/>
+              <w:ind w:left="193"/>
+              <w:rPr>
+                <w:spacing w:val="-2"/>
+                <w:sz w:val="16"/>
+              </w:rPr>
+            </w:pPr>
+            <w:r>
+              <w:rPr>
+                <w:sz w:val="16"/>
+              </w:rPr>
+              <w:t xml:space="preserve">     Комиссия</w:t>
+            </w:r>
+            <w:r>
+              <w:rPr>
+                <w:spacing w:val="-11"/>
+                <w:sz w:val="16"/>
+              </w:rPr>
+              <w:t xml:space="preserve"> </w:t>
+            </w:r>
+            <w:r>
+              <w:rPr>
+                <w:sz w:val="16"/>
+              </w:rPr>
+              <w:t>за</w:t>
+            </w:r>
+            <w:r>
+              <w:rPr>
+                <w:spacing w:val="-10"/>
+                <w:sz w:val="16"/>
+              </w:rPr>
+              <w:t xml:space="preserve"> </w:t>
+            </w:r>
+            <w:r>
+              <w:rPr>
+                <w:sz w:val="16"/>
+              </w:rPr>
+              <w:t>пакет</w:t>
+            </w:r>
+            <w:r>
+              <w:rPr>
+                <w:spacing w:val="-10"/>
+                <w:sz w:val="16"/>
+              </w:rPr>
+              <w:t xml:space="preserve"> </w:t>
+            </w:r>
+            <w:r>
+              <w:rPr>
+                <w:sz w:val="16"/>
+              </w:rPr>
+              <w:t>услуг</w:t>
+            </w:r>
+            <w:r>
+              <w:rPr>
+                <w:spacing w:val="-11"/>
+                <w:sz w:val="16"/>
+              </w:rPr>
+              <w:t xml:space="preserve"> </w:t>
+            </w:r>
+            <w:proofErr w:type="gramStart"/>
+            <w:r>
+              <w:rPr>
+                <w:sz w:val="16"/>
+              </w:rPr>
+              <w:t>за</w:t>
+            </w:r>
+            <w:r>
+              <w:rPr>
+                <w:spacing w:val="-10"/>
+                <w:sz w:val="16"/>
+              </w:rPr>
+              <w:t xml:space="preserve"> </w:t>
+            </w:r>
+            <w:r>
+              <w:rPr>
+                <w:sz w:val="16"/>
+              </w:rPr>
+              <w:t xml:space="preserve"> февраль</w:t>
+            </w:r>
+            <w:proofErr w:type="gramEnd"/>
+            <w:r>
+              <w:rPr>
+                <w:sz w:val="16"/>
+              </w:rPr>
+              <w:t xml:space="preserve"> </w:t>
+            </w:r>
+            <w:r>
+              <w:rPr>
+                <w:spacing w:val="-10"/>
+                <w:sz w:val="16"/>
+              </w:rPr>
+              <w:t xml:space="preserve"> </w:t>
+            </w:r>
+            <w:r>
+              <w:rPr>
+                <w:sz w:val="16"/>
+              </w:rPr>
+              <w:t>2026</w:t>
+            </w:r>
+            <w:r>
+              <w:rPr>
+                <w:spacing w:val="-11"/>
+                <w:sz w:val="16"/>
+              </w:rPr>
+              <w:t xml:space="preserve"> </w:t>
+            </w:r>
+            <w:r>
+              <w:rPr>
+                <w:sz w:val="16"/>
+              </w:rPr>
+              <w:t>г.</w:t>
+            </w:r>
+            <w:r>
+              <w:rPr>
+                <w:spacing w:val="-10"/>
+                <w:sz w:val="16"/>
+              </w:rPr>
+              <w:t xml:space="preserve"> </w:t>
+            </w:r>
+            <w:r>
+              <w:rPr>
+                <w:sz w:val="16"/>
+              </w:rPr>
+              <w:t>Согласно</w:t>
+            </w:r>
+            <w:r>
+              <w:rPr>
+                <w:spacing w:val="-10"/>
+                <w:sz w:val="16"/>
+              </w:rPr>
+              <w:t xml:space="preserve"> </w:t>
+            </w:r>
+            <w:r>
+              <w:rPr>
+                <w:sz w:val="16"/>
+              </w:rPr>
+              <w:t>тарифам банка</w:t>
+            </w:r>
+            <w:r>
+              <w:rPr>
+                <w:spacing w:val="-11"/>
+                <w:sz w:val="16"/>
+              </w:rPr>
+              <w:t xml:space="preserve"> </w:t>
+            </w:r>
+          </w:p>
+        </w:tc>
+        <w:tc>
+          <w:tcPr>
+            <w:tcW w:w="1472" w:type="dxa"/>
+            <w:gridSpan w:val="2"/>
+            <w:tcBorders>
+              <w:top w:val="single" w:sz="4" w:space="0" w:color="7E7E7E"/>
+            </w:tcBorders>
+          </w:tcPr>
+          <w:p>
+            <w:pPr>
+              <w:pStyle w:val="TableParagraph"/>
+              <w:spacing w:before="54"/>
+              <w:ind w:right="1"/>
+              <w:jc w:val="right"/>
+              <w:rPr>
+                <w:sz w:val="16"/>
+              </w:rPr>
+            </w:pPr>
+            <w:r>
+              <w:rPr>
+                <w:sz w:val="16"/>
+              </w:rPr>
+              <w:t>-</w:t>
+            </w:r>
+            <w:r>
+              <w:rPr>
+                <w:spacing w:val="-2"/>
+                <w:sz w:val="16"/>
+              </w:rPr>
+              <w:t xml:space="preserve"> 399</w:t>
+            </w:r>
+            <w:r>
+              <w:rPr>
+                <w:sz w:val="16"/>
+              </w:rPr>
+              <w:t>,00</w:t>
+            </w:r>
+            <w:r>
+              <w:rPr>
+                <w:spacing w:val="-2"/>
+                <w:sz w:val="16"/>
+              </w:rPr>
+              <w:t xml:space="preserve"> </w:t>
+            </w:r>
+            <w:r>
+              <w:rPr>
+                <w:spacing w:val="-5"/>
+                <w:sz w:val="16"/>
+              </w:rPr>
+              <w:t>RUR</w:t>
+            </w:r>
+          </w:p>
+        </w:tc>
+      </w:tr>
+      <w:tr>
+        <w:trPr>
+          <w:trHeight w:val="383"/>
+        </w:trPr>
+        <w:tc>
+          <w:tcPr>
+            <w:tcW w:w="1239" w:type="dxa"/>
+            <w:tcBorders>
+              <w:top w:val="single" w:sz="4" w:space="0" w:color="7E7E7E"/>
+              <w:bottom w:val="single" w:sz="4" w:space="0" w:color="7E7E7E"/>
+            </w:tcBorders>
+          </w:tcPr>
+          <w:p>
+            <w:pPr>
+              <w:pStyle w:val="TableParagraph"/>
+              <w:spacing w:before="54"/>
+              <w:rPr>
+                <w:sz w:val="16"/>
+              </w:rPr>
+            </w:pPr>
+            <w:r>
+              <w:rPr>
+                <w:spacing w:val="-2"/>
+                <w:sz w:val="16"/>
+              </w:rPr>
+              <w:t>20.02.2026</w:t>
+            </w:r>
+          </w:p>
+        </w:tc>
+        <w:tc>
+          <w:tcPr>
+            <w:tcW w:w="1789" w:type="dxa"/>
+            <w:tcBorders>
+              <w:top w:val="single" w:sz="4" w:space="0" w:color="7E7E7E"/>
+              <w:bottom w:val="single" w:sz="4" w:space="0" w:color="7E7E7E"/>
+            </w:tcBorders>
+          </w:tcPr>
+          <w:p>
+            <w:pPr>
+              <w:pStyle w:val="TableParagraph"/>
+              <w:spacing w:before="54"/>
+              <w:ind w:left="144"/>
+              <w:rPr>
+                <w:sz w:val="16"/>
+                <w:lang w:val="en-US"/>
+              </w:rPr>
+            </w:pPr>
+            <w:r>
+              <w:rPr>
+                <w:spacing w:val="-2"/>
+                <w:sz w:val="16"/>
+              </w:rPr>
+              <w:t>С011305240842792</w:t>
+            </w:r>
+          </w:p>
+        </w:tc>
+        <w:tc>
+          <w:tcPr>
+            <w:tcW w:w="6430" w:type="dxa"/>
+            <w:tcBorders>
+              <w:top w:val="single" w:sz="4" w:space="0" w:color="7E7E7E"/>
+              <w:bottom w:val="single" w:sz="4" w:space="0" w:color="7E7E7E"/>
+            </w:tcBorders>
+          </w:tcPr>
+          <w:p>
+            <w:pPr>
+              <w:pStyle w:val="TableParagraph"/>
+              <w:spacing w:before="54"/>
+              <w:ind w:left="388"/>
+              <w:rPr>
+                <w:sz w:val="16"/>
+              </w:rPr>
+            </w:pPr>
+            <w:r>
+              <w:rPr>
+                <w:spacing w:val="-2"/>
+                <w:sz w:val="16"/>
+              </w:rPr>
+              <w:t xml:space="preserve">Единый налоговый платеж. Оплата НПД за январь 2026г.                                             </w:t>
+            </w:r>
+            <w:r>
+              <w:rPr>
+                <w:spacing w:val="-2"/>
+                <w:sz w:val="16"/>
+              </w:rPr>
+              <w:t xml:space="preserve"> </w:t>
+            </w:r>
+          </w:p>
+        </w:tc>
+        <w:tc>
+          <w:tcPr>
+            <w:tcW w:w="1472" w:type="dxa"/>
+            <w:gridSpan w:val="2"/>
+            <w:tcBorders>
+              <w:top w:val="single" w:sz="4" w:space="0" w:color="7E7E7E"/>
+              <w:bottom w:val="single" w:sz="4" w:space="0" w:color="7E7E7E"/>
+            </w:tcBorders>
+          </w:tcPr>
+          <w:p>
+            <w:pPr>
+              <w:pStyle w:val="TableParagraph"/>
+              <w:spacing w:before="54"/>
+              <w:ind w:right="1"/>
+              <w:jc w:val="right"/>
+              <w:rPr>
+                <w:sz w:val="16"/>
+              </w:rPr>
+            </w:pPr>
+            <w:r>
+              <w:rPr>
+                <w:sz w:val="16"/>
+              </w:rPr>
+              <w:t>-18 000,00</w:t>
+            </w:r>
+            <w:r>
+              <w:rPr>
+                <w:spacing w:val="-3"/>
+                <w:sz w:val="16"/>
+              </w:rPr>
+              <w:t xml:space="preserve"> </w:t>
+            </w:r>
+            <w:r>
+              <w:rPr>
+                <w:spacing w:val="-5"/>
+                <w:sz w:val="16"/>
+              </w:rPr>
+              <w:t>RUR</w:t>
+            </w:r>
+          </w:p>
+        </w:tc>
+      </w:tr>
+      <w:tr>
+        <w:trPr>
+          <w:trHeight w:val="383"/>
+        </w:trPr>
+        <w:tc>
+          <w:tcPr>
+            <w:tcW w:w="1239" w:type="dxa"/>
+            <w:tcBorders>
+              <w:top w:val="single" w:sz="4" w:space="0" w:color="7E7E7E"/>
+              <w:bottom w:val="single" w:sz="4" w:space="0" w:color="7E7E7E"/>
+            </w:tcBorders>
+          </w:tcPr>
+          <w:p>
+            <w:pPr>
+              <w:pStyle w:val="TableParagraph"/>
+              <w:spacing w:before="54"/>
+              <w:rPr>
+                <w:spacing w:val="-2"/>
+                <w:sz w:val="16"/>
+              </w:rPr>
+            </w:pPr>
+            <w:r>
+              <w:rPr>
+                <w:spacing w:val="-2"/>
+                <w:sz w:val="16"/>
+              </w:rPr>
+              <w:t>13.02.2026</w:t>
+            </w:r>
+          </w:p>
+        </w:tc>
+        <w:tc>
+          <w:tcPr>
+            <w:tcW w:w="1789" w:type="dxa"/>
+            <w:tcBorders>
+              <w:top w:val="single" w:sz="4" w:space="0" w:color="7E7E7E"/>
+              <w:bottom w:val="single" w:sz="4" w:space="0" w:color="7E7E7E"/>
+            </w:tcBorders>
+          </w:tcPr>
+          <w:p>
+            <w:pPr>
+              <w:pStyle w:val="TableParagraph"/>
+              <w:spacing w:before="54"/>
+              <w:ind w:left="144"/>
+              <w:rPr>
+                <w:spacing w:val="-2"/>
+                <w:sz w:val="16"/>
+                <w:lang w:val="en-US"/>
+              </w:rPr>
+            </w:pPr>
+            <w:r>
+              <w:rPr>
+                <w:spacing w:val="-2"/>
+                <w:sz w:val="16"/>
+              </w:rPr>
+              <w:t>С011305240820612</w:t>
+            </w:r>
+          </w:p>
+        </w:tc>
+        <w:tc>
+          <w:tcPr>
+            <w:tcW w:w="6430" w:type="dxa"/>
+            <w:tcBorders>
+              <w:top w:val="single" w:sz="4" w:space="0" w:color="7E7E7E"/>
+              <w:bottom w:val="single" w:sz="4" w:space="0" w:color="7E7E7E"/>
+            </w:tcBorders>
+          </w:tcPr>
+          <w:p>
+            <w:pPr>
+              <w:pStyle w:val="TableParagraph"/>
+              <w:spacing w:before="54"/>
+              <w:ind w:left="193" w:firstLine="196"/>
+              <w:rPr>
+                <w:spacing w:val="-2"/>
+                <w:sz w:val="16"/>
+              </w:rPr>
+            </w:pPr>
+            <w:r>
+              <w:rPr>
+                <w:spacing w:val="-2"/>
+                <w:sz w:val="16"/>
+              </w:rPr>
+              <w:t xml:space="preserve">Перевод </w:t>
+            </w:r>
+            <w:r>
+              <w:rPr>
+                <w:spacing w:val="-2"/>
+                <w:sz w:val="16"/>
+              </w:rPr>
+              <w:t xml:space="preserve">  </w:t>
+            </w:r>
+            <w:r>
+              <w:rPr>
+                <w:spacing w:val="-2"/>
+                <w:sz w:val="16"/>
+              </w:rPr>
+              <w:t xml:space="preserve">JSC*KWIKPAY </w:t>
+            </w:r>
+            <w:proofErr w:type="spellStart"/>
+            <w:r>
+              <w:rPr>
+                <w:spacing w:val="-2"/>
+                <w:sz w:val="16"/>
+              </w:rPr>
+              <w:t>online</w:t>
+            </w:r>
+            <w:proofErr w:type="spellEnd"/>
+            <w:r>
+              <w:rPr>
+                <w:spacing w:val="-5"/>
+                <w:sz w:val="16"/>
+              </w:rPr>
+              <w:t>.</w:t>
+            </w:r>
+          </w:p>
+        </w:tc>
+        <w:tc>
+          <w:tcPr>
+            <w:tcW w:w="1472" w:type="dxa"/>
+            <w:gridSpan w:val="2"/>
+            <w:tcBorders>
+              <w:top w:val="single" w:sz="4" w:space="0" w:color="7E7E7E"/>
+              <w:bottom w:val="single" w:sz="4" w:space="0" w:color="7E7E7E"/>
+            </w:tcBorders>
+          </w:tcPr>
+          <w:p>
+            <w:pPr>
+              <w:pStyle w:val="TableParagraph"/>
+              <w:spacing w:before="54"/>
+              <w:ind w:right="1"/>
+              <w:jc w:val="right"/>
+              <w:rPr>
+                <w:sz w:val="16"/>
+              </w:rPr>
+            </w:pPr>
+            <w:r>
+              <w:rPr>
+                <w:sz w:val="16"/>
+              </w:rPr>
+              <w:t>-25</w:t>
+            </w:r>
+            <w:r>
+              <w:rPr>
+                <w:sz w:val="16"/>
+                <w:lang w:val="en-US"/>
+              </w:rPr>
+              <w:t>8</w:t>
+            </w:r>
+            <w:r>
+              <w:rPr>
+                <w:sz w:val="16"/>
+              </w:rPr>
+              <w:t xml:space="preserve"> 607,23</w:t>
+            </w:r>
+            <w:r>
+              <w:rPr>
+                <w:spacing w:val="-3"/>
+                <w:sz w:val="16"/>
+              </w:rPr>
+              <w:t xml:space="preserve"> </w:t>
+            </w:r>
+            <w:r>
+              <w:rPr>
+                <w:spacing w:val="-5"/>
+                <w:sz w:val="16"/>
+              </w:rPr>
+              <w:t>RUR</w:t>
+            </w:r>
+          </w:p>
+        </w:tc>
+      </w:tr>
+      <w:tr>
+        <w:trPr>
+          <w:trHeight w:val="1223"/>
+        </w:trPr>
+        <w:tc>
+          <w:tcPr>
+            <w:tcW w:w="1239" w:type="dxa"/>
+            <w:tcBorders>
+              <w:top w:val="single" w:sz="4" w:space="0" w:color="7E7E7E"/>
+              <w:bottom w:val="single" w:sz="4" w:space="0" w:color="7E7E7E"/>
+            </w:tcBorders>
+            <w:shd w:val="clear" w:color="auto" w:fill="E8E8E8"/>
+          </w:tcPr>
+          <w:p>
+            <w:pPr>
+              <w:pStyle w:val="TableParagraph"/>
+              <w:spacing w:before="54"/>
+              <w:rPr>
+                <w:sz w:val="16"/>
+              </w:rPr>
+            </w:pPr>
+            <w:r>
+              <w:rPr>
+                <w:spacing w:val="-2"/>
+                <w:sz w:val="16"/>
+              </w:rPr>
+              <w:t>09.02.2026</w:t>
+            </w:r>
+          </w:p>
+        </w:tc>
+        <w:tc>
+          <w:tcPr>
+            <w:tcW w:w="1789" w:type="dxa"/>
+            <w:tcBorders>
+              <w:top w:val="single" w:sz="4" w:space="0" w:color="7E7E7E"/>
+              <w:bottom w:val="single" w:sz="4" w:space="0" w:color="7E7E7E"/>
+            </w:tcBorders>
+            <w:shd w:val="clear" w:color="auto" w:fill="E8E8E8"/>
+          </w:tcPr>
+          <w:p>
+            <w:pPr>
+              <w:pStyle w:val="TableParagraph"/>
+              <w:spacing w:before="54"/>
+              <w:rPr>
+                <w:sz w:val="16"/>
+                <w:lang w:val="en-US"/>
+              </w:rPr>
+            </w:pPr>
+            <w:r>
+              <w:rPr>
+                <w:spacing w:val="-2"/>
+                <w:sz w:val="16"/>
+              </w:rPr>
+              <w:t xml:space="preserve">    </w:t>
+            </w:r>
+            <w:r>
+              <w:rPr>
+                <w:spacing w:val="-2"/>
+                <w:sz w:val="16"/>
+              </w:rPr>
+              <w:t>C1613052408</w:t>
+            </w:r>
+            <w:r>
+              <w:rPr>
+                <w:spacing w:val="-2"/>
+                <w:sz w:val="16"/>
+              </w:rPr>
+              <w:t>15432</w:t>
+            </w:r>
+          </w:p>
+        </w:tc>
+        <w:tc>
+          <w:tcPr>
+            <w:tcW w:w="6430" w:type="dxa"/>
+            <w:tcBorders>
+              <w:bottom w:val="single" w:sz="4" w:space="0" w:color="7E7E7E"/>
+            </w:tcBorders>
+            <w:shd w:val="clear" w:color="auto" w:fill="E8E8E8"/>
+          </w:tcPr>
+          <w:p>
+            <w:pPr>
+              <w:pStyle w:val="TableParagraph"/>
+              <w:spacing w:before="40" w:after="40"/>
+              <w:ind w:left="199" w:firstLine="195"/>
+              <w:rPr>
+                <w:sz w:val="16"/>
+              </w:rPr>
+            </w:pPr>
+            <w:r>
+              <w:rPr>
+                <w:sz w:val="16"/>
+              </w:rPr>
+              <w:t>Плательщик: ООО "Строительная компания СК10"</w:t>
+            </w:r>
+          </w:p>
+          <w:p>
+            <w:pPr>
+              <w:pStyle w:val="TableParagraph"/>
+              <w:spacing w:before="40" w:after="40"/>
+              <w:ind w:left="199" w:firstLine="195"/>
+              <w:rPr>
+                <w:sz w:val="16"/>
+              </w:rPr>
+            </w:pPr>
+            <w:r>
+              <w:rPr>
+                <w:sz w:val="16"/>
+              </w:rPr>
+              <w:t>ИНН плательщика: 6168006148</w:t>
+            </w:r>
+          </w:p>
+          <w:p>
+            <w:pPr>
+              <w:pStyle w:val="TableParagraph"/>
+              <w:spacing w:before="40" w:after="40"/>
+              <w:ind w:left="199" w:firstLine="195"/>
+              <w:rPr>
+                <w:sz w:val="16"/>
+              </w:rPr>
+            </w:pPr>
+            <w:r>
+              <w:rPr>
+                <w:sz w:val="16"/>
+              </w:rPr>
+              <w:t xml:space="preserve">Счет плательщика: </w:t>
+            </w:r>
+            <w:proofErr w:type="gramStart"/>
+            <w:r>
+              <w:rPr>
+                <w:sz w:val="16"/>
+              </w:rPr>
+              <w:t>40702810206640002909,  БИК</w:t>
+            </w:r>
+            <w:proofErr w:type="gramEnd"/>
+            <w:r>
+              <w:rPr>
+                <w:sz w:val="16"/>
+              </w:rPr>
+              <w:t xml:space="preserve"> 044525411</w:t>
+            </w:r>
+          </w:p>
+          <w:p>
+            <w:pPr>
+              <w:pStyle w:val="TableParagraph"/>
+              <w:spacing w:before="40" w:after="40"/>
+              <w:ind w:left="394" w:hanging="1"/>
+              <w:rPr>
+                <w:sz w:val="16"/>
+              </w:rPr>
+            </w:pPr>
+            <w:r>
+              <w:rPr>
+                <w:sz w:val="16"/>
+              </w:rPr>
+              <w:t xml:space="preserve">Назначение платежа: Оплата за оказание </w:t>
+            </w:r>
+            <w:proofErr w:type="gramStart"/>
+            <w:r>
+              <w:rPr>
+                <w:sz w:val="16"/>
+              </w:rPr>
+              <w:t>услуг  по</w:t>
+            </w:r>
+            <w:proofErr w:type="gramEnd"/>
+            <w:r>
+              <w:rPr>
+                <w:sz w:val="16"/>
+              </w:rPr>
+              <w:t xml:space="preserve"> </w:t>
+            </w:r>
+            <w:proofErr w:type="gramStart"/>
+            <w:r>
+              <w:rPr>
+                <w:sz w:val="16"/>
+              </w:rPr>
+              <w:t>Договору  №</w:t>
+            </w:r>
+            <w:proofErr w:type="gramEnd"/>
+            <w:r>
+              <w:rPr>
+                <w:sz w:val="16"/>
+              </w:rPr>
+              <w:t xml:space="preserve">004/09/25 </w:t>
+            </w:r>
+            <w:proofErr w:type="gramStart"/>
+            <w:r>
+              <w:rPr>
+                <w:sz w:val="16"/>
+              </w:rPr>
+              <w:t>от  05.09.25г.</w:t>
+            </w:r>
+            <w:proofErr w:type="gramEnd"/>
+            <w:r>
+              <w:rPr>
+                <w:sz w:val="16"/>
+              </w:rPr>
+              <w:t xml:space="preserve"> </w:t>
+            </w:r>
+            <w:r>
+              <w:rPr>
+                <w:sz w:val="16"/>
+              </w:rPr>
+              <w:t>за период 01.</w:t>
+            </w:r>
+            <w:r>
+              <w:rPr>
+                <w:sz w:val="16"/>
+              </w:rPr>
+              <w:t>0</w:t>
+            </w:r>
+            <w:r>
+              <w:rPr>
+                <w:sz w:val="16"/>
+              </w:rPr>
+              <w:t>1-3</w:t>
+            </w:r>
+            <w:r>
+              <w:rPr>
+                <w:sz w:val="16"/>
+              </w:rPr>
+              <w:t>1</w:t>
+            </w:r>
+            <w:r>
+              <w:rPr>
+                <w:sz w:val="16"/>
+              </w:rPr>
+              <w:t>.</w:t>
+            </w:r>
+            <w:r>
+              <w:rPr>
+                <w:sz w:val="16"/>
+              </w:rPr>
+              <w:t>0</w:t>
+            </w:r>
+            <w:r>
+              <w:rPr>
+                <w:sz w:val="16"/>
+              </w:rPr>
+              <w:t>1.202</w:t>
+            </w:r>
+            <w:r>
+              <w:rPr>
+                <w:sz w:val="16"/>
+              </w:rPr>
+              <w:t>6</w:t>
+            </w:r>
+            <w:r>
+              <w:rPr>
+                <w:sz w:val="16"/>
+              </w:rPr>
+              <w:t>г., Акт №</w:t>
+            </w:r>
+            <w:r>
+              <w:rPr>
+                <w:sz w:val="16"/>
+              </w:rPr>
+              <w:t>1/</w:t>
+            </w:r>
+            <w:proofErr w:type="gramStart"/>
+            <w:r>
+              <w:rPr>
+                <w:sz w:val="16"/>
+              </w:rPr>
+              <w:t>26</w:t>
+            </w:r>
+            <w:r>
+              <w:rPr>
+                <w:sz w:val="16"/>
+              </w:rPr>
+              <w:t xml:space="preserve">  от</w:t>
+            </w:r>
+            <w:proofErr w:type="gramEnd"/>
+            <w:r>
+              <w:rPr>
+                <w:sz w:val="16"/>
+              </w:rPr>
+              <w:t xml:space="preserve"> 3</w:t>
+            </w:r>
+            <w:r>
+              <w:rPr>
+                <w:sz w:val="16"/>
+              </w:rPr>
+              <w:t>1</w:t>
+            </w:r>
+            <w:r>
+              <w:rPr>
+                <w:sz w:val="16"/>
+              </w:rPr>
+              <w:t>.</w:t>
+            </w:r>
+            <w:r>
+              <w:rPr>
+                <w:sz w:val="16"/>
+              </w:rPr>
+              <w:t>0</w:t>
+            </w:r>
+            <w:r>
+              <w:rPr>
+                <w:sz w:val="16"/>
+              </w:rPr>
+              <w:t>1.202</w:t>
+            </w:r>
+            <w:r>
+              <w:rPr>
+                <w:sz w:val="16"/>
+              </w:rPr>
+              <w:t>6</w:t>
+            </w:r>
+            <w:r>
+              <w:rPr>
+                <w:sz w:val="16"/>
+              </w:rPr>
+              <w:t>г.</w:t>
+            </w:r>
+            <w:r>
+              <w:rPr>
+                <w:sz w:val="16"/>
+              </w:rPr>
+              <w:t>,</w:t>
+            </w:r>
+            <w:r>
+              <w:rPr>
+                <w:sz w:val="16"/>
+              </w:rPr>
+              <w:t xml:space="preserve"> без НДС</w:t>
+            </w:r>
+            <w:r>
+              <w:rPr>
+                <w:sz w:val="16"/>
+              </w:rPr>
+              <w:t>.</w:t>
+            </w:r>
+          </w:p>
+        </w:tc>
+        <w:tc>
+          <w:tcPr>
+            <w:tcW w:w="1472" w:type="dxa"/>
+            <w:gridSpan w:val="2"/>
+            <w:tcBorders>
+              <w:bottom w:val="single" w:sz="4" w:space="0" w:color="7E7E7E"/>
+            </w:tcBorders>
+            <w:shd w:val="clear" w:color="auto" w:fill="E8E8E8"/>
+          </w:tcPr>
+          <w:p>
+            <w:pPr>
+              <w:pStyle w:val="TableParagraph"/>
+              <w:spacing w:before="52"/>
+              <w:rPr>
+                <w:b/>
+                <w:sz w:val="16"/>
+              </w:rPr>
+            </w:pPr>
+            <w:r>
+              <w:rPr>
+                <w:b/>
+                <w:sz w:val="16"/>
+              </w:rPr>
+              <w:t xml:space="preserve">    </w:t>
+            </w:r>
+            <w:r>
+              <w:rPr>
+                <w:b/>
+                <w:sz w:val="16"/>
+              </w:rPr>
+              <w:t xml:space="preserve">  </w:t>
+            </w:r>
+            <w:r>
+              <w:rPr>
+                <w:b/>
+                <w:sz w:val="16"/>
+              </w:rPr>
+              <w:t xml:space="preserve"> </w:t>
+            </w:r>
+            <w:r>
+              <w:rPr>
+                <w:b/>
+                <w:sz w:val="16"/>
+              </w:rPr>
+              <w:t>300 000</w:t>
+            </w:r>
+            <w:r>
+              <w:rPr>
+                <w:b/>
+                <w:sz w:val="16"/>
+              </w:rPr>
+              <w:t>,00</w:t>
+            </w:r>
+            <w:r>
+              <w:rPr>
+                <w:b/>
+                <w:spacing w:val="-4"/>
+                <w:sz w:val="16"/>
+              </w:rPr>
+              <w:t xml:space="preserve"> </w:t>
+            </w:r>
+            <w:r>
+              <w:rPr>
+                <w:b/>
+                <w:spacing w:val="-5"/>
+                <w:sz w:val="16"/>
+              </w:rPr>
+              <w:t>RUR</w:t>
+            </w:r>
+          </w:p>
+        </w:tc>
+      </w:tr>
+      <w:tr>
+        <w:trPr>
+          <w:trHeight w:val="418"/>
+        </w:trPr>
+        <w:tc>
+          <w:tcPr>
+            <w:tcW w:w="1239" w:type="dxa"/>
+            <w:tcBorders>
+              <w:top w:val="single" w:sz="4" w:space="0" w:color="7E7E7E"/>
+              <w:bottom w:val="single" w:sz="4" w:space="0" w:color="7E7E7E"/>
+            </w:tcBorders>
+          </w:tcPr>
+          <w:p>
+            <w:pPr>
+              <w:pStyle w:val="TableParagraph"/>
+              <w:spacing w:before="54" w:line="164" w:lineRule="exact"/>
+              <w:rPr>
+                <w:sz w:val="16"/>
+              </w:rPr>
+            </w:pPr>
+            <w:r>
+              <w:rPr>
+                <w:spacing w:val="-2"/>
+                <w:sz w:val="16"/>
+              </w:rPr>
+              <w:lastRenderedPageBreak/>
+              <w:t>01.02.2026</w:t>
+            </w:r>
+          </w:p>
+        </w:tc>
+        <w:tc>
+          <w:tcPr>
+            <w:tcW w:w="1789" w:type="dxa"/>
+            <w:tcBorders>
+              <w:top w:val="single" w:sz="4" w:space="0" w:color="7E7E7E"/>
+              <w:bottom w:val="single" w:sz="4" w:space="0" w:color="7E7E7E"/>
+            </w:tcBorders>
+          </w:tcPr>
+          <w:p>
+            <w:pPr>
+              <w:pStyle w:val="TableParagraph"/>
+              <w:spacing w:before="54" w:line="164" w:lineRule="exact"/>
+              <w:rPr>
+                <w:sz w:val="16"/>
+              </w:rPr>
+            </w:pPr>
+            <w:r>
+              <w:rPr>
+                <w:sz w:val="16"/>
+              </w:rPr>
+              <w:t xml:space="preserve">    MOSH</w:t>
+            </w:r>
+            <w:r>
+              <w:rPr>
+                <w:spacing w:val="-2"/>
+                <w:sz w:val="16"/>
+              </w:rPr>
+              <w:t xml:space="preserve"> 1940765083</w:t>
+            </w:r>
+          </w:p>
+        </w:tc>
+        <w:tc>
+          <w:tcPr>
+            <w:tcW w:w="6430" w:type="dxa"/>
+            <w:tcBorders>
+              <w:top w:val="single" w:sz="4" w:space="0" w:color="7E7E7E"/>
+              <w:bottom w:val="single" w:sz="4" w:space="0" w:color="7E7E7E"/>
+            </w:tcBorders>
+          </w:tcPr>
+          <w:p>
+            <w:pPr>
+              <w:pStyle w:val="TableParagraph"/>
+              <w:spacing w:before="54" w:line="164" w:lineRule="exact"/>
+              <w:ind w:left="168"/>
+              <w:rPr>
+                <w:sz w:val="16"/>
+              </w:rPr>
+            </w:pPr>
+            <w:r>
+              <w:rPr>
+                <w:sz w:val="16"/>
+              </w:rPr>
+              <w:t xml:space="preserve">     Комиссия</w:t>
+            </w:r>
+            <w:r>
+              <w:rPr>
+                <w:spacing w:val="-11"/>
+                <w:sz w:val="16"/>
+              </w:rPr>
+              <w:t xml:space="preserve"> </w:t>
+            </w:r>
+            <w:r>
+              <w:rPr>
+                <w:sz w:val="16"/>
+              </w:rPr>
+              <w:t>за</w:t>
+            </w:r>
+            <w:r>
+              <w:rPr>
+                <w:spacing w:val="-10"/>
+                <w:sz w:val="16"/>
+              </w:rPr>
+              <w:t xml:space="preserve"> </w:t>
+            </w:r>
+            <w:r>
+              <w:rPr>
+                <w:sz w:val="16"/>
+              </w:rPr>
+              <w:t>пакет</w:t>
+            </w:r>
+            <w:r>
+              <w:rPr>
+                <w:spacing w:val="-10"/>
+                <w:sz w:val="16"/>
+              </w:rPr>
+              <w:t xml:space="preserve"> </w:t>
+            </w:r>
+            <w:r>
+              <w:rPr>
+                <w:sz w:val="16"/>
+              </w:rPr>
+              <w:t>услуг</w:t>
+            </w:r>
+            <w:r>
+              <w:rPr>
+                <w:spacing w:val="-11"/>
+                <w:sz w:val="16"/>
+              </w:rPr>
+              <w:t xml:space="preserve"> </w:t>
+            </w:r>
+            <w:proofErr w:type="gramStart"/>
+            <w:r>
+              <w:rPr>
+                <w:sz w:val="16"/>
+              </w:rPr>
+              <w:t>за</w:t>
+            </w:r>
+            <w:r>
+              <w:rPr>
+                <w:spacing w:val="-10"/>
+                <w:sz w:val="16"/>
+              </w:rPr>
+              <w:t xml:space="preserve"> </w:t>
+            </w:r>
+            <w:r>
+              <w:rPr>
+                <w:sz w:val="16"/>
+              </w:rPr>
+              <w:t xml:space="preserve"> январь</w:t>
+            </w:r>
+            <w:proofErr w:type="gramEnd"/>
+            <w:r>
+              <w:rPr>
+                <w:spacing w:val="-10"/>
+                <w:sz w:val="16"/>
+              </w:rPr>
+              <w:t xml:space="preserve"> </w:t>
+            </w:r>
+            <w:r>
+              <w:rPr>
+                <w:sz w:val="16"/>
+              </w:rPr>
+              <w:t>2026</w:t>
+            </w:r>
+            <w:r>
+              <w:rPr>
+                <w:spacing w:val="-11"/>
+                <w:sz w:val="16"/>
+              </w:rPr>
+              <w:t xml:space="preserve"> </w:t>
+            </w:r>
+            <w:r>
+              <w:rPr>
+                <w:sz w:val="16"/>
+              </w:rPr>
+              <w:t>г.</w:t>
+            </w:r>
+            <w:r>
+              <w:rPr>
+                <w:spacing w:val="-10"/>
+                <w:sz w:val="16"/>
+              </w:rPr>
+              <w:t xml:space="preserve"> </w:t>
+            </w:r>
+            <w:r>
+              <w:rPr>
+                <w:sz w:val="16"/>
+              </w:rPr>
+              <w:t>Согласно</w:t>
+            </w:r>
+            <w:r>
+              <w:rPr>
+                <w:spacing w:val="-10"/>
+                <w:sz w:val="16"/>
+              </w:rPr>
+              <w:t xml:space="preserve"> </w:t>
+            </w:r>
+            <w:proofErr w:type="gramStart"/>
+            <w:r>
+              <w:rPr>
+                <w:sz w:val="16"/>
+              </w:rPr>
+              <w:t>тарифам  банка</w:t>
+            </w:r>
+            <w:proofErr w:type="gramEnd"/>
+            <w:r>
+              <w:rPr>
+                <w:sz w:val="16"/>
+              </w:rPr>
+              <w:t>.</w:t>
+            </w:r>
+            <w:r>
+              <w:rPr>
+                <w:spacing w:val="-11"/>
+                <w:sz w:val="16"/>
+              </w:rPr>
+              <w:t xml:space="preserve"> </w:t>
+            </w:r>
+          </w:p>
+        </w:tc>
+        <w:tc>
+          <w:tcPr>
+            <w:tcW w:w="1472" w:type="dxa"/>
+            <w:gridSpan w:val="2"/>
+            <w:tcBorders>
+              <w:top w:val="single" w:sz="4" w:space="0" w:color="7E7E7E"/>
+              <w:bottom w:val="single" w:sz="4" w:space="0" w:color="7E7E7E"/>
+            </w:tcBorders>
+          </w:tcPr>
+          <w:p>
+            <w:pPr>
+              <w:pStyle w:val="TableParagraph"/>
+              <w:spacing w:before="54" w:line="164" w:lineRule="exact"/>
+              <w:ind w:right="10"/>
+              <w:jc w:val="right"/>
+              <w:rPr>
+                <w:sz w:val="16"/>
+              </w:rPr>
+            </w:pPr>
+            <w:r>
+              <w:rPr>
+                <w:sz w:val="16"/>
+              </w:rPr>
+              <w:t>-</w:t>
+            </w:r>
+            <w:r>
+              <w:rPr>
+                <w:spacing w:val="-2"/>
+                <w:sz w:val="16"/>
+              </w:rPr>
+              <w:t xml:space="preserve"> 399</w:t>
+            </w:r>
+            <w:r>
+              <w:rPr>
+                <w:sz w:val="16"/>
+              </w:rPr>
+              <w:t>,00</w:t>
+            </w:r>
+            <w:r>
+              <w:rPr>
+                <w:spacing w:val="-2"/>
+                <w:sz w:val="16"/>
+              </w:rPr>
+              <w:t xml:space="preserve"> </w:t>
+            </w:r>
+            <w:r>
+              <w:rPr>
+                <w:spacing w:val="-5"/>
+                <w:sz w:val="16"/>
+              </w:rPr>
+              <w:t>RUR</w:t>
+            </w:r>
+          </w:p>
+        </w:tc>
+      </w:tr>
+      <w:tr>
+        <w:trPr>
+          <w:trHeight w:val="419"/>
+        </w:trPr>
+        <w:tc>
+          <w:tcPr>
+            <w:tcW w:w="1239" w:type="dxa"/>
+            <w:tcBorders>
+              <w:top w:val="single" w:sz="4" w:space="0" w:color="7E7E7E"/>
+              <w:bottom w:val="single" w:sz="4" w:space="0" w:color="7E7E7E"/>
+            </w:tcBorders>
+          </w:tcPr>
+          <w:p>
+            <w:pPr>
+              <w:pStyle w:val="TableParagraph"/>
+              <w:spacing w:before="54"/>
+              <w:rPr>
+                <w:sz w:val="16"/>
+              </w:rPr>
+            </w:pPr>
+            <w:r>
+              <w:rPr>
+                <w:spacing w:val="-2"/>
+                <w:sz w:val="16"/>
+              </w:rPr>
+              <w:t>22.01.2026</w:t>
+            </w:r>
+          </w:p>
+        </w:tc>
+        <w:tc>
+          <w:tcPr>
+            <w:tcW w:w="1789" w:type="dxa"/>
+            <w:tcBorders>
+              <w:top w:val="single" w:sz="4" w:space="0" w:color="7E7E7E"/>
+              <w:bottom w:val="single" w:sz="4" w:space="0" w:color="7E7E7E"/>
+            </w:tcBorders>
+          </w:tcPr>
+          <w:p>
+            <w:pPr>
+              <w:pStyle w:val="TableParagraph"/>
+              <w:spacing w:before="54"/>
+              <w:ind w:left="144"/>
+              <w:rPr>
+                <w:sz w:val="16"/>
+              </w:rPr>
+            </w:pPr>
+            <w:r>
+              <w:rPr>
+                <w:spacing w:val="-2"/>
+                <w:sz w:val="16"/>
+              </w:rPr>
+              <w:t>С011325240345860</w:t>
+            </w:r>
+          </w:p>
+        </w:tc>
+        <w:tc>
+          <w:tcPr>
+            <w:tcW w:w="6430" w:type="dxa"/>
+            <w:tcBorders>
+              <w:top w:val="single" w:sz="4" w:space="0" w:color="7E7E7E"/>
+              <w:bottom w:val="single" w:sz="4" w:space="0" w:color="7E7E7E"/>
+            </w:tcBorders>
+          </w:tcPr>
+          <w:p>
+            <w:pPr>
+              <w:pStyle w:val="TableParagraph"/>
+              <w:spacing w:before="54"/>
+              <w:ind w:left="193" w:firstLine="196"/>
+              <w:rPr>
+                <w:sz w:val="16"/>
+              </w:rPr>
+            </w:pPr>
+            <w:r>
+              <w:rPr>
+                <w:spacing w:val="-2"/>
+                <w:sz w:val="16"/>
+              </w:rPr>
+              <w:t xml:space="preserve">Единый налоговый платеж. Оплата НПД за </w:t>
+            </w:r>
+            <w:r>
+              <w:rPr>
+                <w:spacing w:val="-2"/>
+                <w:sz w:val="16"/>
+              </w:rPr>
+              <w:t>декабрь</w:t>
+            </w:r>
+            <w:r>
+              <w:rPr>
+                <w:spacing w:val="-2"/>
+                <w:sz w:val="16"/>
+              </w:rPr>
+              <w:t xml:space="preserve"> 202</w:t>
+            </w:r>
+            <w:r>
+              <w:rPr>
+                <w:spacing w:val="-2"/>
+                <w:sz w:val="16"/>
+              </w:rPr>
+              <w:t>5</w:t>
+            </w:r>
+            <w:r>
+              <w:rPr>
+                <w:spacing w:val="-2"/>
+                <w:sz w:val="16"/>
+              </w:rPr>
+              <w:t xml:space="preserve">г.                                              </w:t>
+            </w:r>
+          </w:p>
+        </w:tc>
+        <w:tc>
+          <w:tcPr>
+            <w:tcW w:w="1472" w:type="dxa"/>
+            <w:gridSpan w:val="2"/>
+            <w:tcBorders>
+              <w:top w:val="single" w:sz="4" w:space="0" w:color="7E7E7E"/>
+              <w:bottom w:val="single" w:sz="4" w:space="0" w:color="7E7E7E"/>
+            </w:tcBorders>
+          </w:tcPr>
+          <w:p>
+            <w:pPr>
+              <w:pStyle w:val="TableParagraph"/>
+              <w:spacing w:before="54"/>
+              <w:ind w:right="1"/>
+              <w:jc w:val="right"/>
+              <w:rPr>
+                <w:sz w:val="16"/>
+              </w:rPr>
+            </w:pPr>
+            <w:r>
+              <w:rPr>
+                <w:sz w:val="16"/>
+              </w:rPr>
+              <w:t>-18 000,00</w:t>
+            </w:r>
+            <w:r>
+              <w:rPr>
+                <w:spacing w:val="-3"/>
+                <w:sz w:val="16"/>
+              </w:rPr>
+              <w:t xml:space="preserve"> </w:t>
+            </w:r>
+            <w:r>
+              <w:rPr>
+                <w:spacing w:val="-5"/>
+                <w:sz w:val="16"/>
+              </w:rPr>
+              <w:t>RUR</w:t>
+            </w:r>
+          </w:p>
+        </w:tc>
+      </w:tr>
+      <w:tr>
+        <w:trPr>
+          <w:trHeight w:val="419"/>
+        </w:trPr>
+        <w:tc>
+          <w:tcPr>
+            <w:tcW w:w="1239" w:type="dxa"/>
+            <w:tcBorders>
+              <w:top w:val="single" w:sz="4" w:space="0" w:color="7E7E7E"/>
+              <w:bottom w:val="single" w:sz="4" w:space="0" w:color="7E7E7E"/>
+            </w:tcBorders>
+          </w:tcPr>
+          <w:p>
+            <w:pPr>
+              <w:pStyle w:val="TableParagraph"/>
+              <w:spacing w:before="54" w:line="164" w:lineRule="exact"/>
+              <w:rPr>
+                <w:sz w:val="16"/>
+              </w:rPr>
+            </w:pPr>
+            <w:r>
+              <w:rPr>
+                <w:spacing w:val="-2"/>
+                <w:sz w:val="16"/>
+              </w:rPr>
+              <w:t>19.01.2026</w:t>
+            </w:r>
+          </w:p>
+        </w:tc>
+        <w:tc>
+          <w:tcPr>
+            <w:tcW w:w="1789" w:type="dxa"/>
+            <w:tcBorders>
+              <w:top w:val="single" w:sz="4" w:space="0" w:color="7E7E7E"/>
+              <w:bottom w:val="single" w:sz="4" w:space="0" w:color="7E7E7E"/>
+            </w:tcBorders>
+          </w:tcPr>
+          <w:p>
+            <w:pPr>
+              <w:pStyle w:val="TableParagraph"/>
+              <w:spacing w:before="54"/>
+              <w:ind w:left="144"/>
+              <w:rPr>
+                <w:sz w:val="16"/>
+                <w:lang w:val="en-US"/>
+              </w:rPr>
+            </w:pPr>
+            <w:r>
+              <w:rPr>
+                <w:spacing w:val="-2"/>
+                <w:sz w:val="16"/>
+              </w:rPr>
+              <w:t>С011325240755337</w:t>
+            </w:r>
+          </w:p>
+        </w:tc>
+        <w:tc>
+          <w:tcPr>
+            <w:tcW w:w="6430" w:type="dxa"/>
+            <w:tcBorders>
+              <w:top w:val="single" w:sz="4" w:space="0" w:color="7E7E7E"/>
+              <w:bottom w:val="single" w:sz="4" w:space="0" w:color="7E7E7E"/>
+            </w:tcBorders>
+          </w:tcPr>
+          <w:p>
+            <w:pPr>
+              <w:pStyle w:val="TableParagraph"/>
+              <w:spacing w:before="54"/>
+              <w:ind w:left="193" w:firstLine="196"/>
+              <w:rPr>
+                <w:sz w:val="16"/>
+              </w:rPr>
+            </w:pPr>
+            <w:r>
+              <w:rPr>
+                <w:spacing w:val="-2"/>
+                <w:sz w:val="16"/>
+              </w:rPr>
+              <w:t xml:space="preserve">Перевод   JSC*KWIKPAY </w:t>
+            </w:r>
+            <w:proofErr w:type="spellStart"/>
+            <w:r>
+              <w:rPr>
+                <w:spacing w:val="-2"/>
+                <w:sz w:val="16"/>
+              </w:rPr>
+              <w:t>online</w:t>
+            </w:r>
+            <w:proofErr w:type="spellEnd"/>
+            <w:r>
+              <w:rPr>
+                <w:spacing w:val="-2"/>
+                <w:sz w:val="16"/>
+              </w:rPr>
+              <w:t>.</w:t>
+            </w:r>
+          </w:p>
+        </w:tc>
+        <w:tc>
+          <w:tcPr>
+            <w:tcW w:w="1472" w:type="dxa"/>
+            <w:gridSpan w:val="2"/>
+            <w:tcBorders>
+              <w:top w:val="single" w:sz="4" w:space="0" w:color="7E7E7E"/>
+              <w:bottom w:val="single" w:sz="4" w:space="0" w:color="7E7E7E"/>
+            </w:tcBorders>
+          </w:tcPr>
+          <w:p>
+            <w:pPr>
+              <w:pStyle w:val="TableParagraph"/>
+              <w:spacing w:before="54"/>
+              <w:ind w:right="1"/>
+              <w:jc w:val="right"/>
+              <w:rPr>
+                <w:sz w:val="16"/>
+              </w:rPr>
+            </w:pPr>
+            <w:r>
+              <w:rPr>
+                <w:sz w:val="16"/>
+              </w:rPr>
+              <w:t>-281 200,18</w:t>
+            </w:r>
+            <w:r>
+              <w:rPr>
+                <w:spacing w:val="-3"/>
+                <w:sz w:val="16"/>
+              </w:rPr>
+              <w:t xml:space="preserve"> </w:t>
+            </w:r>
+            <w:r>
+              <w:rPr>
+                <w:spacing w:val="-5"/>
+                <w:sz w:val="16"/>
+              </w:rPr>
+              <w:t>RUR</w:t>
             </w:r>
           </w:p>
         </w:tc>

</xml_diff>

<commit_message>
Pack 16.3: fix bank statement — restore __TX_*__ marker row, remove Aliev hardcoded ops
</commit_message>
<xml_diff>
--- a/templates/docx/bank_statement_template.docx
+++ b/templates/docx/bank_statement_template.docx
@@ -1962,21 +1962,7 @@
                 <w:spacing w:val="-2"/>
                 <w:sz w:val="16"/>
               </w:rPr>
-              <w:t>1</w:t>
-            </w:r>
-            <w:r>
-              <w:rPr>
-                <w:spacing w:val="-2"/>
-                <w:sz w:val="16"/>
-              </w:rPr>
-              <w:t>9</w:t>
-            </w:r>
-            <w:r>
-              <w:rPr>
-                <w:spacing w:val="-2"/>
-                <w:sz w:val="16"/>
-              </w:rPr>
-              <w:t>.04.2026</w:t>
+              <w:t xml:space="preserve">__TX_DATE__</w:t>
             </w:r>
           </w:p>
         </w:tc>
@@ -2003,7 +1989,7 @@
                 <w:spacing w:val="-2"/>
                 <w:sz w:val="16"/>
               </w:rPr>
-              <w:t>С011334780834634</w:t>
+              <w:t xml:space="preserve">__TX_CODE__</w:t>
             </w:r>
           </w:p>
         </w:tc>
@@ -2029,35 +2015,7 @@
                 <w:spacing w:val="-2"/>
                 <w:sz w:val="16"/>
               </w:rPr>
-              <w:t xml:space="preserve">Единый налоговый платеж. Оплата НПД за </w:t>
-            </w:r>
-            <w:r>
-              <w:rPr>
-                <w:spacing w:val="-2"/>
-                <w:sz w:val="16"/>
-              </w:rPr>
-              <w:t>март</w:t>
-            </w:r>
-            <w:r>
-              <w:rPr>
-                <w:spacing w:val="-2"/>
-                <w:sz w:val="16"/>
-              </w:rPr>
-              <w:t xml:space="preserve"> 202</w:t>
-            </w:r>
-            <w:r>
-              <w:rPr>
-                <w:spacing w:val="-2"/>
-                <w:sz w:val="16"/>
-              </w:rPr>
-              <w:t>6</w:t>
-            </w:r>
-            <w:r>
-              <w:rPr>
-                <w:spacing w:val="-2"/>
-                <w:sz w:val="16"/>
-              </w:rPr>
-              <w:t xml:space="preserve">г.                                              </w:t>
+              <w:t xml:space="preserve">__TX_DESCRIPTION__</w:t>
             </w:r>
           </w:p>
         </w:tc>
@@ -2085,3351 +2043,7 @@
               <w:rPr>
                 <w:sz w:val="16"/>
               </w:rPr>
-              <w:t xml:space="preserve">  </w:t>
-            </w:r>
-            <w:r>
-              <w:rPr>
-                <w:sz w:val="16"/>
-              </w:rPr>
-              <w:t>-1</w:t>
-            </w:r>
-            <w:r>
-              <w:rPr>
-                <w:sz w:val="16"/>
-              </w:rPr>
-              <w:t>8 00</w:t>
-            </w:r>
-            <w:r>
-              <w:rPr>
-                <w:sz w:val="16"/>
-              </w:rPr>
-              <w:t>0,00 RUR</w:t>
-            </w:r>
-          </w:p>
-        </w:tc>
-      </w:tr>
-      <w:tr>
-        <w:trPr>
-          <w:trHeight w:val="442"/>
-        </w:trPr>
-        <w:tc>
-          <w:tcPr>
-            <w:tcW w:w="1239" w:type="dxa"/>
-            <w:tcBorders>
-              <w:top w:val="single" w:sz="4" w:space="0" w:color="7E7E7E"/>
-              <w:bottom w:val="single" w:sz="4" w:space="0" w:color="7E7E7E"/>
-            </w:tcBorders>
-          </w:tcPr>
-          <w:p>
-            <w:pPr>
-              <w:pStyle w:val="TableParagraph"/>
-              <w:spacing w:before="54"/>
-              <w:rPr>
-                <w:spacing w:val="-2"/>
-                <w:sz w:val="16"/>
-              </w:rPr>
-            </w:pPr>
-            <w:r>
-              <w:rPr>
-                <w:spacing w:val="-2"/>
-                <w:sz w:val="16"/>
-              </w:rPr>
-              <w:t>1</w:t>
-            </w:r>
-            <w:r>
-              <w:rPr>
-                <w:spacing w:val="-2"/>
-                <w:sz w:val="16"/>
-              </w:rPr>
-              <w:t>0</w:t>
-            </w:r>
-            <w:r>
-              <w:rPr>
-                <w:spacing w:val="-2"/>
-                <w:sz w:val="16"/>
-              </w:rPr>
-              <w:t>.0</w:t>
-            </w:r>
-            <w:r>
-              <w:rPr>
-                <w:spacing w:val="-2"/>
-                <w:sz w:val="16"/>
-              </w:rPr>
-              <w:t>4</w:t>
-            </w:r>
-            <w:r>
-              <w:rPr>
-                <w:spacing w:val="-2"/>
-                <w:sz w:val="16"/>
-              </w:rPr>
-              <w:t>.2026</w:t>
-            </w:r>
-          </w:p>
-        </w:tc>
-        <w:tc>
-          <w:tcPr>
-            <w:tcW w:w="1789" w:type="dxa"/>
-            <w:tcBorders>
-              <w:top w:val="single" w:sz="4" w:space="0" w:color="7E7E7E"/>
-              <w:bottom w:val="single" w:sz="4" w:space="0" w:color="7E7E7E"/>
-            </w:tcBorders>
-          </w:tcPr>
-          <w:p>
-            <w:pPr>
-              <w:pStyle w:val="TableParagraph"/>
-              <w:spacing w:before="54"/>
-              <w:ind w:left="144"/>
-              <w:rPr>
-                <w:spacing w:val="-2"/>
-                <w:sz w:val="16"/>
-              </w:rPr>
-            </w:pPr>
-            <w:r>
-              <w:rPr>
-                <w:spacing w:val="-2"/>
-                <w:sz w:val="16"/>
-              </w:rPr>
-              <w:t>С0113052</w:t>
-            </w:r>
-            <w:r>
-              <w:rPr>
-                <w:spacing w:val="-2"/>
-                <w:sz w:val="16"/>
-              </w:rPr>
-              <w:t>46622810</w:t>
-            </w:r>
-          </w:p>
-        </w:tc>
-        <w:tc>
-          <w:tcPr>
-            <w:tcW w:w="6430" w:type="dxa"/>
-            <w:tcBorders>
-              <w:top w:val="single" w:sz="4" w:space="0" w:color="7E7E7E"/>
-              <w:bottom w:val="single" w:sz="4" w:space="0" w:color="7E7E7E"/>
-            </w:tcBorders>
-          </w:tcPr>
-          <w:p>
-            <w:pPr>
-              <w:pStyle w:val="TableParagraph"/>
-              <w:spacing w:before="54" w:line="244" w:lineRule="auto"/>
-              <w:ind w:left="199" w:firstLine="195"/>
-              <w:rPr>
-                <w:spacing w:val="-2"/>
-                <w:sz w:val="16"/>
-              </w:rPr>
-            </w:pPr>
-            <w:r>
-              <w:rPr>
-                <w:spacing w:val="-2"/>
-                <w:sz w:val="16"/>
-              </w:rPr>
-              <w:t xml:space="preserve">Перевод </w:t>
-            </w:r>
-            <w:r>
-              <w:rPr>
-                <w:spacing w:val="-2"/>
-                <w:sz w:val="16"/>
-              </w:rPr>
-              <w:t xml:space="preserve">  </w:t>
-            </w:r>
-            <w:r>
-              <w:rPr>
-                <w:spacing w:val="-2"/>
-                <w:sz w:val="16"/>
-              </w:rPr>
-              <w:t xml:space="preserve">JSC*KWIKPAY </w:t>
-            </w:r>
-            <w:proofErr w:type="spellStart"/>
-            <w:r>
-              <w:rPr>
-                <w:spacing w:val="-2"/>
-                <w:sz w:val="16"/>
-              </w:rPr>
-              <w:t>online</w:t>
-            </w:r>
-            <w:proofErr w:type="spellEnd"/>
-            <w:r>
-              <w:rPr>
-                <w:spacing w:val="-5"/>
-                <w:sz w:val="16"/>
-              </w:rPr>
-              <w:t>.</w:t>
-            </w:r>
-          </w:p>
-        </w:tc>
-        <w:tc>
-          <w:tcPr>
-            <w:tcW w:w="1472" w:type="dxa"/>
-            <w:gridSpan w:val="2"/>
-            <w:tcBorders>
-              <w:top w:val="single" w:sz="4" w:space="0" w:color="7E7E7E"/>
-              <w:bottom w:val="single" w:sz="4" w:space="0" w:color="7E7E7E"/>
-            </w:tcBorders>
-          </w:tcPr>
-          <w:p>
-            <w:pPr>
-              <w:pStyle w:val="TableParagraph"/>
-              <w:spacing w:before="54"/>
-              <w:ind w:right="1"/>
-              <w:jc w:val="right"/>
-              <w:rPr>
-                <w:sz w:val="16"/>
-              </w:rPr>
-            </w:pPr>
-            <w:r>
-              <w:rPr>
-                <w:sz w:val="16"/>
-              </w:rPr>
-              <w:t>-2</w:t>
-            </w:r>
-            <w:r>
-              <w:rPr>
-                <w:sz w:val="16"/>
-              </w:rPr>
-              <w:t>88</w:t>
-            </w:r>
-            <w:r>
-              <w:rPr>
-                <w:sz w:val="16"/>
-              </w:rPr>
-              <w:t xml:space="preserve"> </w:t>
-            </w:r>
-            <w:r>
-              <w:rPr>
-                <w:sz w:val="16"/>
-              </w:rPr>
-              <w:t>040</w:t>
-            </w:r>
-            <w:r>
-              <w:rPr>
-                <w:sz w:val="16"/>
-              </w:rPr>
-              <w:t>,</w:t>
-            </w:r>
-            <w:r>
-              <w:rPr>
-                <w:sz w:val="16"/>
-              </w:rPr>
-              <w:t>22</w:t>
-            </w:r>
-            <w:r>
-              <w:rPr>
-                <w:spacing w:val="-3"/>
-                <w:sz w:val="16"/>
-              </w:rPr>
-              <w:t xml:space="preserve"> </w:t>
-            </w:r>
-            <w:r>
-              <w:rPr>
-                <w:spacing w:val="-5"/>
-                <w:sz w:val="16"/>
-              </w:rPr>
-              <w:t>RUR</w:t>
-            </w:r>
-          </w:p>
-        </w:tc>
-      </w:tr>
-      <w:tr>
-        <w:trPr>
-          <w:trHeight w:val="1249"/>
-        </w:trPr>
-        <w:tc>
-          <w:tcPr>
-            <w:tcW w:w="1239" w:type="dxa"/>
-            <w:shd w:val="clear" w:color="auto" w:fill="E8E8E8"/>
-          </w:tcPr>
-          <w:p>
-            <w:pPr>
-              <w:pStyle w:val="TableParagraph"/>
-              <w:spacing w:before="54"/>
-              <w:rPr>
-                <w:spacing w:val="-2"/>
-                <w:sz w:val="16"/>
-              </w:rPr>
-            </w:pPr>
-            <w:r>
-              <w:rPr>
-                <w:spacing w:val="-2"/>
-                <w:sz w:val="16"/>
-              </w:rPr>
-              <w:t>06.04.2026</w:t>
-            </w:r>
-          </w:p>
-        </w:tc>
-        <w:tc>
-          <w:tcPr>
-            <w:tcW w:w="1789" w:type="dxa"/>
-            <w:shd w:val="clear" w:color="auto" w:fill="E8E8E8"/>
-          </w:tcPr>
-          <w:p>
-            <w:pPr>
-              <w:pStyle w:val="TableParagraph"/>
-              <w:spacing w:before="54"/>
-              <w:ind w:left="144"/>
-              <w:rPr>
-                <w:spacing w:val="-2"/>
-                <w:sz w:val="16"/>
-              </w:rPr>
-            </w:pPr>
-            <w:r>
-              <w:rPr>
-                <w:spacing w:val="-2"/>
-                <w:sz w:val="16"/>
-              </w:rPr>
-              <w:t>C161305240761982</w:t>
-            </w:r>
-          </w:p>
-        </w:tc>
-        <w:tc>
-          <w:tcPr>
-            <w:tcW w:w="6430" w:type="dxa"/>
-            <w:shd w:val="clear" w:color="auto" w:fill="E8E8E8"/>
-          </w:tcPr>
-          <w:p>
-            <w:pPr>
-              <w:pStyle w:val="TableParagraph"/>
-              <w:spacing w:before="54" w:line="244" w:lineRule="auto"/>
-              <w:ind w:left="199" w:firstLine="195"/>
-              <w:rPr>
-                <w:sz w:val="16"/>
-              </w:rPr>
-            </w:pPr>
-            <w:r>
-              <w:rPr>
-                <w:sz w:val="16"/>
-              </w:rPr>
-              <w:t>Плательщик: ООО "Строительная компания СК10"</w:t>
-            </w:r>
-          </w:p>
-          <w:p>
-            <w:pPr>
-              <w:pStyle w:val="TableParagraph"/>
-              <w:spacing w:before="54" w:line="244" w:lineRule="auto"/>
-              <w:ind w:left="199" w:firstLine="195"/>
-              <w:rPr>
-                <w:sz w:val="16"/>
-              </w:rPr>
-            </w:pPr>
-            <w:r>
-              <w:rPr>
-                <w:sz w:val="16"/>
-              </w:rPr>
-              <w:t>ИНН плательщика: 6168006148</w:t>
-            </w:r>
-          </w:p>
-          <w:p>
-            <w:pPr>
-              <w:pStyle w:val="TableParagraph"/>
-              <w:spacing w:before="54" w:line="244" w:lineRule="auto"/>
-              <w:ind w:left="199" w:firstLine="195"/>
-              <w:rPr>
-                <w:sz w:val="16"/>
-              </w:rPr>
-            </w:pPr>
-            <w:r>
-              <w:rPr>
-                <w:sz w:val="16"/>
-              </w:rPr>
-              <w:t xml:space="preserve">Счет плательщика: </w:t>
-            </w:r>
-            <w:proofErr w:type="gramStart"/>
-            <w:r>
-              <w:rPr>
-                <w:sz w:val="16"/>
-              </w:rPr>
-              <w:t>40702810206640002909,  БИК</w:t>
-            </w:r>
-            <w:proofErr w:type="gramEnd"/>
-            <w:r>
-              <w:rPr>
-                <w:sz w:val="16"/>
-              </w:rPr>
-              <w:t xml:space="preserve"> 044525411</w:t>
-            </w:r>
-          </w:p>
-          <w:p>
-            <w:pPr>
-              <w:pStyle w:val="TableParagraph"/>
-              <w:spacing w:before="40" w:after="40"/>
-              <w:ind w:left="388"/>
-              <w:rPr>
-                <w:sz w:val="16"/>
-              </w:rPr>
-            </w:pPr>
-            <w:r>
-              <w:rPr>
-                <w:sz w:val="16"/>
-              </w:rPr>
-              <w:t xml:space="preserve">Назначение платежа: </w:t>
-            </w:r>
-            <w:r>
-              <w:rPr>
-                <w:sz w:val="16"/>
-              </w:rPr>
-              <w:t xml:space="preserve">Оплата за оказание </w:t>
-            </w:r>
-            <w:proofErr w:type="gramStart"/>
-            <w:r>
-              <w:rPr>
-                <w:sz w:val="16"/>
-              </w:rPr>
-              <w:t>услуг  по</w:t>
-            </w:r>
-            <w:proofErr w:type="gramEnd"/>
-            <w:r>
-              <w:rPr>
-                <w:sz w:val="16"/>
-              </w:rPr>
-              <w:t xml:space="preserve">  </w:t>
-            </w:r>
-            <w:proofErr w:type="gramStart"/>
-            <w:r>
-              <w:rPr>
-                <w:sz w:val="16"/>
-              </w:rPr>
-              <w:t>Договору  №</w:t>
-            </w:r>
-            <w:proofErr w:type="gramEnd"/>
-            <w:r>
-              <w:rPr>
-                <w:sz w:val="16"/>
-              </w:rPr>
-              <w:t>0</w:t>
-            </w:r>
-            <w:r>
-              <w:rPr>
-                <w:sz w:val="16"/>
-              </w:rPr>
-              <w:t>04</w:t>
-            </w:r>
-            <w:r>
-              <w:rPr>
-                <w:sz w:val="16"/>
-              </w:rPr>
-              <w:t>/</w:t>
-            </w:r>
-            <w:r>
-              <w:rPr>
-                <w:sz w:val="16"/>
-              </w:rPr>
-              <w:t>09</w:t>
-            </w:r>
-            <w:r>
-              <w:rPr>
-                <w:sz w:val="16"/>
-              </w:rPr>
-              <w:t>/2</w:t>
-            </w:r>
-            <w:r>
-              <w:rPr>
-                <w:sz w:val="16"/>
-              </w:rPr>
-              <w:t>5</w:t>
-            </w:r>
-            <w:r>
-              <w:rPr>
-                <w:sz w:val="16"/>
-              </w:rPr>
-              <w:t xml:space="preserve"> </w:t>
-            </w:r>
-            <w:proofErr w:type="gramStart"/>
-            <w:r>
-              <w:rPr>
-                <w:sz w:val="16"/>
-              </w:rPr>
-              <w:t xml:space="preserve">от </w:t>
-            </w:r>
-            <w:r>
-              <w:rPr>
-                <w:sz w:val="16"/>
-              </w:rPr>
-              <w:t xml:space="preserve"> </w:t>
-            </w:r>
-            <w:r>
-              <w:rPr>
-                <w:sz w:val="16"/>
-              </w:rPr>
-              <w:t>0</w:t>
-            </w:r>
-            <w:r>
-              <w:rPr>
-                <w:sz w:val="16"/>
-              </w:rPr>
-              <w:t>5</w:t>
-            </w:r>
-            <w:r>
-              <w:rPr>
-                <w:sz w:val="16"/>
-              </w:rPr>
-              <w:t>.</w:t>
-            </w:r>
-            <w:r>
-              <w:rPr>
-                <w:sz w:val="16"/>
-              </w:rPr>
-              <w:t>09</w:t>
-            </w:r>
-            <w:r>
-              <w:rPr>
-                <w:sz w:val="16"/>
-              </w:rPr>
-              <w:t>.25г</w:t>
-            </w:r>
-            <w:r>
-              <w:rPr>
-                <w:sz w:val="16"/>
-              </w:rPr>
-              <w:t>.</w:t>
-            </w:r>
-            <w:proofErr w:type="gramEnd"/>
-            <w:r>
-              <w:rPr>
-                <w:sz w:val="16"/>
-              </w:rPr>
-              <w:t xml:space="preserve"> </w:t>
-            </w:r>
-            <w:r>
-              <w:rPr>
-                <w:sz w:val="16"/>
-              </w:rPr>
-              <w:t>за период 01.</w:t>
-            </w:r>
-            <w:r>
-              <w:rPr>
-                <w:sz w:val="16"/>
-              </w:rPr>
-              <w:t>03</w:t>
-            </w:r>
-            <w:r>
-              <w:rPr>
-                <w:sz w:val="16"/>
-              </w:rPr>
-              <w:t>-3</w:t>
-            </w:r>
-            <w:r>
-              <w:rPr>
-                <w:sz w:val="16"/>
-              </w:rPr>
-              <w:t>1</w:t>
-            </w:r>
-            <w:r>
-              <w:rPr>
-                <w:sz w:val="16"/>
-              </w:rPr>
-              <w:t>.</w:t>
-            </w:r>
-            <w:r>
-              <w:rPr>
-                <w:sz w:val="16"/>
-              </w:rPr>
-              <w:t>03</w:t>
-            </w:r>
-            <w:r>
-              <w:rPr>
-                <w:sz w:val="16"/>
-              </w:rPr>
-              <w:t>.202</w:t>
-            </w:r>
-            <w:r>
-              <w:rPr>
-                <w:sz w:val="16"/>
-              </w:rPr>
-              <w:t>6</w:t>
-            </w:r>
-            <w:r>
-              <w:rPr>
-                <w:sz w:val="16"/>
-              </w:rPr>
-              <w:t>г., Акт №</w:t>
-            </w:r>
-            <w:r>
-              <w:rPr>
-                <w:sz w:val="16"/>
-              </w:rPr>
-              <w:t>3</w:t>
-            </w:r>
-            <w:r>
-              <w:rPr>
-                <w:sz w:val="16"/>
-              </w:rPr>
-              <w:t>/</w:t>
-            </w:r>
-            <w:proofErr w:type="gramStart"/>
-            <w:r>
-              <w:rPr>
-                <w:sz w:val="16"/>
-              </w:rPr>
-              <w:t>2</w:t>
-            </w:r>
-            <w:r>
-              <w:rPr>
-                <w:sz w:val="16"/>
-              </w:rPr>
-              <w:t>6</w:t>
-            </w:r>
-            <w:r>
-              <w:rPr>
-                <w:sz w:val="16"/>
-              </w:rPr>
-              <w:t xml:space="preserve">  от</w:t>
-            </w:r>
-            <w:proofErr w:type="gramEnd"/>
-            <w:r>
-              <w:rPr>
-                <w:sz w:val="16"/>
-              </w:rPr>
-              <w:t xml:space="preserve"> 3</w:t>
-            </w:r>
-            <w:r>
-              <w:rPr>
-                <w:sz w:val="16"/>
-              </w:rPr>
-              <w:t>1</w:t>
-            </w:r>
-            <w:r>
-              <w:rPr>
-                <w:sz w:val="16"/>
-              </w:rPr>
-              <w:t>.</w:t>
-            </w:r>
-            <w:r>
-              <w:rPr>
-                <w:sz w:val="16"/>
-              </w:rPr>
-              <w:t>03</w:t>
-            </w:r>
-            <w:r>
-              <w:rPr>
-                <w:sz w:val="16"/>
-              </w:rPr>
-              <w:t>.202</w:t>
-            </w:r>
-            <w:r>
-              <w:rPr>
-                <w:sz w:val="16"/>
-              </w:rPr>
-              <w:t>6</w:t>
-            </w:r>
-            <w:r>
-              <w:rPr>
-                <w:sz w:val="16"/>
-              </w:rPr>
-              <w:t>г.</w:t>
-            </w:r>
-            <w:r>
-              <w:rPr>
-                <w:sz w:val="16"/>
-              </w:rPr>
-              <w:t>,</w:t>
-            </w:r>
-            <w:r>
-              <w:rPr>
-                <w:sz w:val="16"/>
-              </w:rPr>
-              <w:t xml:space="preserve"> без НДС</w:t>
-            </w:r>
-            <w:r>
-              <w:rPr>
-                <w:sz w:val="16"/>
-              </w:rPr>
-              <w:t>.</w:t>
-            </w:r>
-            <w:r>
-              <w:rPr>
-                <w:sz w:val="16"/>
-              </w:rPr>
-              <w:t xml:space="preserve"> </w:t>
-            </w:r>
-          </w:p>
-        </w:tc>
-        <w:tc>
-          <w:tcPr>
-            <w:tcW w:w="1472" w:type="dxa"/>
-            <w:gridSpan w:val="2"/>
-            <w:shd w:val="clear" w:color="auto" w:fill="E8E8E8"/>
-          </w:tcPr>
-          <w:p>
-            <w:pPr>
-              <w:pStyle w:val="TableParagraph"/>
-              <w:spacing w:before="54"/>
-              <w:ind w:right="1"/>
-              <w:jc w:val="right"/>
-              <w:rPr>
-                <w:b/>
-                <w:sz w:val="16"/>
-              </w:rPr>
-            </w:pPr>
-            <w:r>
-              <w:rPr>
-                <w:b/>
-                <w:sz w:val="16"/>
-              </w:rPr>
-              <w:t xml:space="preserve">       </w:t>
-            </w:r>
-            <w:r>
-              <w:rPr>
-                <w:b/>
-                <w:sz w:val="16"/>
-              </w:rPr>
-              <w:t>300 000</w:t>
-            </w:r>
-            <w:r>
-              <w:rPr>
-                <w:b/>
-                <w:sz w:val="16"/>
-              </w:rPr>
-              <w:t>,00</w:t>
-            </w:r>
-            <w:r>
-              <w:rPr>
-                <w:b/>
-                <w:spacing w:val="-4"/>
-                <w:sz w:val="16"/>
-              </w:rPr>
-              <w:t xml:space="preserve"> </w:t>
-            </w:r>
-            <w:r>
-              <w:rPr>
-                <w:b/>
-                <w:spacing w:val="-5"/>
-                <w:sz w:val="16"/>
-              </w:rPr>
-              <w:t>RUR</w:t>
-            </w:r>
-          </w:p>
-        </w:tc>
-      </w:tr>
-      <w:tr>
-        <w:trPr>
-          <w:trHeight w:val="430"/>
-        </w:trPr>
-        <w:tc>
-          <w:tcPr>
-            <w:tcW w:w="1239" w:type="dxa"/>
-            <w:tcBorders>
-              <w:top w:val="single" w:sz="4" w:space="0" w:color="7E7E7E"/>
-            </w:tcBorders>
-          </w:tcPr>
-          <w:p>
-            <w:pPr>
-              <w:pStyle w:val="TableParagraph"/>
-              <w:spacing w:before="54"/>
-              <w:rPr>
-                <w:spacing w:val="-2"/>
-                <w:sz w:val="16"/>
-              </w:rPr>
-            </w:pPr>
-            <w:r>
-              <w:rPr>
-                <w:spacing w:val="-2"/>
-                <w:sz w:val="16"/>
-              </w:rPr>
-              <w:t>01.04.2026</w:t>
-            </w:r>
-          </w:p>
-        </w:tc>
-        <w:tc>
-          <w:tcPr>
-            <w:tcW w:w="1789" w:type="dxa"/>
-            <w:tcBorders>
-              <w:top w:val="single" w:sz="4" w:space="0" w:color="7E7E7E"/>
-            </w:tcBorders>
-          </w:tcPr>
-          <w:p>
-            <w:pPr>
-              <w:pStyle w:val="TableParagraph"/>
-              <w:spacing w:before="54"/>
-              <w:ind w:left="144"/>
-              <w:rPr>
-                <w:spacing w:val="-2"/>
-                <w:sz w:val="16"/>
-              </w:rPr>
-            </w:pPr>
-            <w:r>
-              <w:rPr>
-                <w:sz w:val="16"/>
-              </w:rPr>
-              <w:t xml:space="preserve"> MOSH</w:t>
-            </w:r>
-            <w:r>
-              <w:rPr>
-                <w:spacing w:val="-2"/>
-                <w:sz w:val="16"/>
-              </w:rPr>
-              <w:t xml:space="preserve"> 1940500209</w:t>
-            </w:r>
-          </w:p>
-        </w:tc>
-        <w:tc>
-          <w:tcPr>
-            <w:tcW w:w="6430" w:type="dxa"/>
-            <w:tcBorders>
-              <w:top w:val="single" w:sz="4" w:space="0" w:color="7E7E7E"/>
-            </w:tcBorders>
-          </w:tcPr>
-          <w:p>
-            <w:pPr>
-              <w:pStyle w:val="TableParagraph"/>
-              <w:spacing w:before="40" w:after="40"/>
-              <w:ind w:left="199" w:firstLine="195"/>
-              <w:rPr>
-                <w:sz w:val="16"/>
-              </w:rPr>
-            </w:pPr>
-            <w:r>
-              <w:rPr>
-                <w:sz w:val="16"/>
-              </w:rPr>
-              <w:t>Комиссия</w:t>
-            </w:r>
-            <w:r>
-              <w:rPr>
-                <w:spacing w:val="-11"/>
-                <w:sz w:val="16"/>
-              </w:rPr>
-              <w:t xml:space="preserve"> </w:t>
-            </w:r>
-            <w:r>
-              <w:rPr>
-                <w:sz w:val="16"/>
-              </w:rPr>
-              <w:t>за</w:t>
-            </w:r>
-            <w:r>
-              <w:rPr>
-                <w:spacing w:val="-10"/>
-                <w:sz w:val="16"/>
-              </w:rPr>
-              <w:t xml:space="preserve"> </w:t>
-            </w:r>
-            <w:r>
-              <w:rPr>
-                <w:sz w:val="16"/>
-              </w:rPr>
-              <w:t>пакет</w:t>
-            </w:r>
-            <w:r>
-              <w:rPr>
-                <w:spacing w:val="-10"/>
-                <w:sz w:val="16"/>
-              </w:rPr>
-              <w:t xml:space="preserve"> </w:t>
-            </w:r>
-            <w:r>
-              <w:rPr>
-                <w:sz w:val="16"/>
-              </w:rPr>
-              <w:t>услуг</w:t>
-            </w:r>
-            <w:r>
-              <w:rPr>
-                <w:spacing w:val="-11"/>
-                <w:sz w:val="16"/>
-              </w:rPr>
-              <w:t xml:space="preserve"> </w:t>
-            </w:r>
-            <w:r>
-              <w:rPr>
-                <w:sz w:val="16"/>
-              </w:rPr>
-              <w:t>за</w:t>
-            </w:r>
-            <w:r>
-              <w:rPr>
-                <w:spacing w:val="-10"/>
-                <w:sz w:val="16"/>
-              </w:rPr>
-              <w:t xml:space="preserve"> </w:t>
-            </w:r>
-            <w:r>
-              <w:rPr>
-                <w:sz w:val="16"/>
-              </w:rPr>
-              <w:t>март</w:t>
-            </w:r>
-            <w:r>
-              <w:rPr>
-                <w:spacing w:val="-10"/>
-                <w:sz w:val="16"/>
-              </w:rPr>
-              <w:t xml:space="preserve"> </w:t>
-            </w:r>
-            <w:r>
-              <w:rPr>
-                <w:sz w:val="16"/>
-              </w:rPr>
-              <w:t>2026</w:t>
-            </w:r>
-            <w:r>
-              <w:rPr>
-                <w:spacing w:val="-11"/>
-                <w:sz w:val="16"/>
-              </w:rPr>
-              <w:t xml:space="preserve"> </w:t>
-            </w:r>
-            <w:r>
-              <w:rPr>
-                <w:sz w:val="16"/>
-              </w:rPr>
-              <w:t>г.</w:t>
-            </w:r>
-            <w:r>
-              <w:rPr>
-                <w:spacing w:val="-10"/>
-                <w:sz w:val="16"/>
-              </w:rPr>
-              <w:t xml:space="preserve"> </w:t>
-            </w:r>
-            <w:r>
-              <w:rPr>
-                <w:sz w:val="16"/>
-              </w:rPr>
-              <w:t>Согласно</w:t>
-            </w:r>
-            <w:r>
-              <w:rPr>
-                <w:spacing w:val="-10"/>
-                <w:sz w:val="16"/>
-              </w:rPr>
-              <w:t xml:space="preserve"> </w:t>
-            </w:r>
-            <w:r>
-              <w:rPr>
-                <w:sz w:val="16"/>
-              </w:rPr>
-              <w:t>тарифам банка.</w:t>
-            </w:r>
-            <w:r>
-              <w:rPr>
-                <w:spacing w:val="-11"/>
-                <w:sz w:val="16"/>
-              </w:rPr>
-              <w:t xml:space="preserve"> </w:t>
-            </w:r>
-            <w:r>
-              <w:rPr>
-                <w:spacing w:val="-11"/>
-                <w:sz w:val="16"/>
-              </w:rPr>
-              <w:t xml:space="preserve"> </w:t>
-            </w:r>
-          </w:p>
-        </w:tc>
-        <w:tc>
-          <w:tcPr>
-            <w:tcW w:w="1472" w:type="dxa"/>
-            <w:gridSpan w:val="2"/>
-            <w:tcBorders>
-              <w:top w:val="single" w:sz="4" w:space="0" w:color="7E7E7E"/>
-            </w:tcBorders>
-          </w:tcPr>
-          <w:p>
-            <w:pPr>
-              <w:pStyle w:val="TableParagraph"/>
-              <w:spacing w:before="54"/>
-              <w:ind w:right="1"/>
-              <w:jc w:val="right"/>
-              <w:rPr>
-                <w:b/>
-                <w:sz w:val="16"/>
-              </w:rPr>
-            </w:pPr>
-            <w:r>
-              <w:rPr>
-                <w:sz w:val="16"/>
-              </w:rPr>
-              <w:t xml:space="preserve">  </w:t>
-            </w:r>
-            <w:r>
-              <w:rPr>
-                <w:sz w:val="16"/>
-              </w:rPr>
-              <w:t xml:space="preserve">    -</w:t>
-            </w:r>
-            <w:r>
-              <w:rPr>
-                <w:spacing w:val="-2"/>
-                <w:sz w:val="16"/>
-              </w:rPr>
-              <w:t xml:space="preserve"> 399</w:t>
-            </w:r>
-            <w:r>
-              <w:rPr>
-                <w:sz w:val="16"/>
-              </w:rPr>
-              <w:t>,00</w:t>
-            </w:r>
-            <w:r>
-              <w:rPr>
-                <w:spacing w:val="-2"/>
-                <w:sz w:val="16"/>
-              </w:rPr>
-              <w:t xml:space="preserve"> </w:t>
-            </w:r>
-            <w:r>
-              <w:rPr>
-                <w:spacing w:val="-5"/>
-                <w:sz w:val="16"/>
-              </w:rPr>
-              <w:t>RUR</w:t>
-            </w:r>
-          </w:p>
-        </w:tc>
-      </w:tr>
-      <w:tr>
-        <w:trPr>
-          <w:trHeight w:val="515"/>
-        </w:trPr>
-        <w:tc>
-          <w:tcPr>
-            <w:tcW w:w="1239" w:type="dxa"/>
-            <w:tcBorders>
-              <w:top w:val="single" w:sz="4" w:space="0" w:color="7E7E7E"/>
-              <w:bottom w:val="single" w:sz="4" w:space="0" w:color="7E7E7E"/>
-            </w:tcBorders>
-          </w:tcPr>
-          <w:p>
-            <w:pPr>
-              <w:pStyle w:val="TableParagraph"/>
-              <w:spacing w:before="54"/>
-              <w:rPr>
-                <w:spacing w:val="-2"/>
-                <w:sz w:val="16"/>
-              </w:rPr>
-            </w:pPr>
-            <w:r>
-              <w:rPr>
-                <w:spacing w:val="-2"/>
-                <w:sz w:val="16"/>
-              </w:rPr>
-              <w:t>20.03.2026</w:t>
-            </w:r>
-          </w:p>
-        </w:tc>
-        <w:tc>
-          <w:tcPr>
-            <w:tcW w:w="1789" w:type="dxa"/>
-            <w:tcBorders>
-              <w:top w:val="single" w:sz="4" w:space="0" w:color="7E7E7E"/>
-              <w:bottom w:val="single" w:sz="4" w:space="0" w:color="7E7E7E"/>
-            </w:tcBorders>
-          </w:tcPr>
-          <w:p>
-            <w:pPr>
-              <w:pStyle w:val="TableParagraph"/>
-              <w:spacing w:before="54"/>
-              <w:ind w:left="144"/>
-              <w:rPr>
-                <w:spacing w:val="-2"/>
-                <w:sz w:val="16"/>
-              </w:rPr>
-            </w:pPr>
-            <w:r>
-              <w:rPr>
-                <w:spacing w:val="-2"/>
-                <w:sz w:val="16"/>
-              </w:rPr>
-              <w:t>С011334780343002</w:t>
-            </w:r>
-          </w:p>
-        </w:tc>
-        <w:tc>
-          <w:tcPr>
-            <w:tcW w:w="6430" w:type="dxa"/>
-            <w:tcBorders>
-              <w:top w:val="single" w:sz="4" w:space="0" w:color="7E7E7E"/>
-              <w:bottom w:val="single" w:sz="4" w:space="0" w:color="7E7E7E"/>
-            </w:tcBorders>
-          </w:tcPr>
-          <w:p>
-            <w:pPr>
-              <w:pStyle w:val="TableParagraph"/>
-              <w:spacing w:before="40" w:after="40"/>
-              <w:ind w:left="199" w:firstLine="195"/>
-              <w:rPr>
-                <w:sz w:val="16"/>
-              </w:rPr>
-            </w:pPr>
-            <w:r>
-              <w:rPr>
-                <w:spacing w:val="-2"/>
-                <w:sz w:val="16"/>
-              </w:rPr>
-              <w:t xml:space="preserve">Единый налоговый платеж. Оплата НПД за </w:t>
-            </w:r>
-            <w:r>
-              <w:rPr>
-                <w:spacing w:val="-2"/>
-                <w:sz w:val="16"/>
-              </w:rPr>
-              <w:t>февраль</w:t>
-            </w:r>
-            <w:r>
-              <w:rPr>
-                <w:spacing w:val="-2"/>
-                <w:sz w:val="16"/>
-              </w:rPr>
-              <w:t xml:space="preserve"> 202</w:t>
-            </w:r>
-            <w:r>
-              <w:rPr>
-                <w:spacing w:val="-2"/>
-                <w:sz w:val="16"/>
-              </w:rPr>
-              <w:t>6</w:t>
-            </w:r>
-            <w:r>
-              <w:rPr>
-                <w:spacing w:val="-2"/>
-                <w:sz w:val="16"/>
-              </w:rPr>
-              <w:t xml:space="preserve">г.                                              </w:t>
-            </w:r>
-          </w:p>
-        </w:tc>
-        <w:tc>
-          <w:tcPr>
-            <w:tcW w:w="1472" w:type="dxa"/>
-            <w:gridSpan w:val="2"/>
-            <w:tcBorders>
-              <w:top w:val="single" w:sz="4" w:space="0" w:color="7E7E7E"/>
-              <w:bottom w:val="single" w:sz="4" w:space="0" w:color="7E7E7E"/>
-            </w:tcBorders>
-          </w:tcPr>
-          <w:p>
-            <w:pPr>
-              <w:pStyle w:val="TableParagraph"/>
-              <w:spacing w:before="54"/>
-              <w:ind w:right="1"/>
-              <w:jc w:val="right"/>
-              <w:rPr>
-                <w:b/>
-                <w:sz w:val="16"/>
-              </w:rPr>
-            </w:pPr>
-            <w:r>
-              <w:rPr>
-                <w:sz w:val="16"/>
-              </w:rPr>
-              <w:t xml:space="preserve">  </w:t>
-            </w:r>
-            <w:r>
-              <w:rPr>
-                <w:sz w:val="16"/>
-              </w:rPr>
-              <w:t>-1</w:t>
-            </w:r>
-            <w:r>
-              <w:rPr>
-                <w:sz w:val="16"/>
-              </w:rPr>
-              <w:t>8 00</w:t>
-            </w:r>
-            <w:r>
-              <w:rPr>
-                <w:sz w:val="16"/>
-              </w:rPr>
-              <w:t>0,00 RUR</w:t>
-            </w:r>
-          </w:p>
-        </w:tc>
-      </w:tr>
-      <w:tr>
-        <w:trPr>
-          <w:trHeight w:val="515"/>
-        </w:trPr>
-        <w:tc>
-          <w:tcPr>
-            <w:tcW w:w="1239" w:type="dxa"/>
-            <w:tcBorders>
-              <w:top w:val="single" w:sz="4" w:space="0" w:color="7E7E7E"/>
-              <w:bottom w:val="single" w:sz="4" w:space="0" w:color="7E7E7E"/>
-            </w:tcBorders>
-          </w:tcPr>
-          <w:p>
-            <w:pPr>
-              <w:pStyle w:val="TableParagraph"/>
-              <w:spacing w:before="54"/>
-              <w:rPr>
-                <w:spacing w:val="-2"/>
-                <w:sz w:val="16"/>
-              </w:rPr>
-            </w:pPr>
-            <w:r>
-              <w:rPr>
-                <w:spacing w:val="-2"/>
-                <w:sz w:val="16"/>
-              </w:rPr>
-              <w:t>1</w:t>
-            </w:r>
-            <w:r>
-              <w:rPr>
-                <w:spacing w:val="-2"/>
-                <w:sz w:val="16"/>
-              </w:rPr>
-              <w:t>2</w:t>
-            </w:r>
-            <w:r>
-              <w:rPr>
-                <w:spacing w:val="-2"/>
-                <w:sz w:val="16"/>
-              </w:rPr>
-              <w:t>.0</w:t>
-            </w:r>
-            <w:r>
-              <w:rPr>
-                <w:spacing w:val="-2"/>
-                <w:sz w:val="16"/>
-              </w:rPr>
-              <w:t>3</w:t>
-            </w:r>
-            <w:r>
-              <w:rPr>
-                <w:spacing w:val="-2"/>
-                <w:sz w:val="16"/>
-              </w:rPr>
-              <w:t>.2026</w:t>
-            </w:r>
-          </w:p>
-        </w:tc>
-        <w:tc>
-          <w:tcPr>
-            <w:tcW w:w="1789" w:type="dxa"/>
-            <w:tcBorders>
-              <w:top w:val="single" w:sz="4" w:space="0" w:color="7E7E7E"/>
-              <w:bottom w:val="single" w:sz="4" w:space="0" w:color="7E7E7E"/>
-            </w:tcBorders>
-          </w:tcPr>
-          <w:p>
-            <w:pPr>
-              <w:pStyle w:val="TableParagraph"/>
-              <w:spacing w:before="54"/>
-              <w:ind w:left="144"/>
-              <w:rPr>
-                <w:spacing w:val="-2"/>
-                <w:sz w:val="16"/>
-              </w:rPr>
-            </w:pPr>
-            <w:r>
-              <w:rPr>
-                <w:spacing w:val="-2"/>
-                <w:sz w:val="16"/>
-              </w:rPr>
-              <w:t>С011305</w:t>
-            </w:r>
-            <w:r>
-              <w:rPr>
-                <w:spacing w:val="-2"/>
-                <w:sz w:val="16"/>
-              </w:rPr>
-              <w:t>557389655</w:t>
-            </w:r>
-          </w:p>
-        </w:tc>
-        <w:tc>
-          <w:tcPr>
-            <w:tcW w:w="6430" w:type="dxa"/>
-            <w:tcBorders>
-              <w:top w:val="single" w:sz="4" w:space="0" w:color="7E7E7E"/>
-              <w:bottom w:val="single" w:sz="4" w:space="0" w:color="7E7E7E"/>
-            </w:tcBorders>
-          </w:tcPr>
-          <w:p>
-            <w:pPr>
-              <w:pStyle w:val="TableParagraph"/>
-              <w:spacing w:before="40" w:after="40"/>
-              <w:ind w:left="199" w:firstLine="195"/>
-              <w:rPr>
-                <w:spacing w:val="-2"/>
-                <w:sz w:val="16"/>
-              </w:rPr>
-            </w:pPr>
-            <w:r>
-              <w:rPr>
-                <w:spacing w:val="-2"/>
-                <w:sz w:val="16"/>
-              </w:rPr>
-              <w:t xml:space="preserve">Перевод </w:t>
-            </w:r>
-            <w:r>
-              <w:rPr>
-                <w:spacing w:val="-2"/>
-                <w:sz w:val="16"/>
-              </w:rPr>
-              <w:t xml:space="preserve">  </w:t>
-            </w:r>
-            <w:r>
-              <w:rPr>
-                <w:spacing w:val="-2"/>
-                <w:sz w:val="16"/>
-              </w:rPr>
-              <w:t xml:space="preserve">JSC*KWIKPAY </w:t>
-            </w:r>
-            <w:proofErr w:type="spellStart"/>
-            <w:r>
-              <w:rPr>
-                <w:spacing w:val="-2"/>
-                <w:sz w:val="16"/>
-              </w:rPr>
-              <w:t>online</w:t>
-            </w:r>
-            <w:proofErr w:type="spellEnd"/>
-            <w:r>
-              <w:rPr>
-                <w:spacing w:val="-5"/>
-                <w:sz w:val="16"/>
-              </w:rPr>
-              <w:t>.</w:t>
-            </w:r>
-          </w:p>
-        </w:tc>
-        <w:tc>
-          <w:tcPr>
-            <w:tcW w:w="1472" w:type="dxa"/>
-            <w:gridSpan w:val="2"/>
-            <w:tcBorders>
-              <w:top w:val="single" w:sz="4" w:space="0" w:color="7E7E7E"/>
-              <w:bottom w:val="single" w:sz="4" w:space="0" w:color="7E7E7E"/>
-            </w:tcBorders>
-          </w:tcPr>
-          <w:p>
-            <w:pPr>
-              <w:pStyle w:val="TableParagraph"/>
-              <w:spacing w:before="54"/>
-              <w:ind w:right="1"/>
-              <w:jc w:val="right"/>
-              <w:rPr>
-                <w:sz w:val="16"/>
-              </w:rPr>
-            </w:pPr>
-            <w:r>
-              <w:rPr>
-                <w:sz w:val="16"/>
-              </w:rPr>
-              <w:t>-2</w:t>
-            </w:r>
-            <w:r>
-              <w:rPr>
-                <w:sz w:val="16"/>
-              </w:rPr>
-              <w:t>70</w:t>
-            </w:r>
-            <w:r>
-              <w:rPr>
-                <w:sz w:val="16"/>
-              </w:rPr>
-              <w:t xml:space="preserve"> </w:t>
-            </w:r>
-            <w:r>
-              <w:rPr>
-                <w:sz w:val="16"/>
-              </w:rPr>
-              <w:t>733</w:t>
-            </w:r>
-            <w:r>
-              <w:rPr>
-                <w:sz w:val="16"/>
-              </w:rPr>
-              <w:t>,</w:t>
-            </w:r>
-            <w:r>
-              <w:rPr>
-                <w:sz w:val="16"/>
-              </w:rPr>
-              <w:t>91</w:t>
-            </w:r>
-            <w:r>
-              <w:rPr>
-                <w:spacing w:val="-3"/>
-                <w:sz w:val="16"/>
-              </w:rPr>
-              <w:t xml:space="preserve"> </w:t>
-            </w:r>
-            <w:r>
-              <w:rPr>
-                <w:spacing w:val="-5"/>
-                <w:sz w:val="16"/>
-              </w:rPr>
-              <w:t>RUR</w:t>
-            </w:r>
-          </w:p>
-        </w:tc>
-      </w:tr>
-      <w:tr>
-        <w:trPr>
-          <w:trHeight w:val="1152"/>
-        </w:trPr>
-        <w:tc>
-          <w:tcPr>
-            <w:tcW w:w="1239" w:type="dxa"/>
-            <w:tcBorders>
-              <w:top w:val="single" w:sz="4" w:space="0" w:color="7E7E7E"/>
-              <w:bottom w:val="single" w:sz="4" w:space="0" w:color="7E7E7E"/>
-            </w:tcBorders>
-            <w:shd w:val="clear" w:color="auto" w:fill="E8E8E8"/>
-          </w:tcPr>
-          <w:p>
-            <w:pPr>
-              <w:pStyle w:val="TableParagraph"/>
-              <w:spacing w:before="54"/>
-              <w:rPr>
-                <w:spacing w:val="-2"/>
-                <w:sz w:val="16"/>
-              </w:rPr>
-            </w:pPr>
-            <w:r>
-              <w:rPr>
-                <w:spacing w:val="-2"/>
-                <w:sz w:val="16"/>
-              </w:rPr>
-              <w:t>06.0</w:t>
-            </w:r>
-            <w:r>
-              <w:rPr>
-                <w:spacing w:val="-2"/>
-                <w:sz w:val="16"/>
-                <w:lang w:val="en-US"/>
-              </w:rPr>
-              <w:t>3</w:t>
-            </w:r>
-            <w:r>
-              <w:rPr>
-                <w:spacing w:val="-2"/>
-                <w:sz w:val="16"/>
-              </w:rPr>
-              <w:t>.2026</w:t>
-            </w:r>
-          </w:p>
-        </w:tc>
-        <w:tc>
-          <w:tcPr>
-            <w:tcW w:w="1789" w:type="dxa"/>
-            <w:tcBorders>
-              <w:top w:val="single" w:sz="4" w:space="0" w:color="7E7E7E"/>
-              <w:bottom w:val="single" w:sz="4" w:space="0" w:color="7E7E7E"/>
-            </w:tcBorders>
-            <w:shd w:val="clear" w:color="auto" w:fill="E8E8E8"/>
-          </w:tcPr>
-          <w:p>
-            <w:pPr>
-              <w:pStyle w:val="TableParagraph"/>
-              <w:spacing w:before="54"/>
-              <w:ind w:left="144"/>
-              <w:rPr>
-                <w:sz w:val="16"/>
-                <w:lang w:val="en-US"/>
-              </w:rPr>
-            </w:pPr>
-            <w:r>
-              <w:rPr>
-                <w:spacing w:val="-2"/>
-                <w:sz w:val="16"/>
-              </w:rPr>
-              <w:t>C16130524</w:t>
-            </w:r>
-            <w:r>
-              <w:rPr>
-                <w:spacing w:val="-2"/>
-                <w:sz w:val="16"/>
-                <w:lang w:val="en-US"/>
-              </w:rPr>
-              <w:t>2384665</w:t>
-            </w:r>
-          </w:p>
-        </w:tc>
-        <w:tc>
-          <w:tcPr>
-            <w:tcW w:w="6430" w:type="dxa"/>
-            <w:shd w:val="clear" w:color="auto" w:fill="E8E8E8"/>
-          </w:tcPr>
-          <w:p>
-            <w:pPr>
-              <w:pStyle w:val="TableParagraph"/>
-              <w:spacing w:before="40" w:after="40"/>
-              <w:ind w:left="199" w:firstLine="195"/>
-              <w:rPr>
-                <w:sz w:val="16"/>
-              </w:rPr>
-            </w:pPr>
-            <w:r>
-              <w:rPr>
-                <w:sz w:val="16"/>
-              </w:rPr>
-              <w:t>Плательщик: ООО "Строительная компания СК10"</w:t>
-            </w:r>
-          </w:p>
-          <w:p>
-            <w:pPr>
-              <w:pStyle w:val="TableParagraph"/>
-              <w:spacing w:before="40" w:after="40"/>
-              <w:ind w:left="199" w:firstLine="195"/>
-              <w:rPr>
-                <w:sz w:val="16"/>
-              </w:rPr>
-            </w:pPr>
-            <w:r>
-              <w:rPr>
-                <w:sz w:val="16"/>
-              </w:rPr>
-              <w:t>ИНН плательщика: 6168006148</w:t>
-            </w:r>
-          </w:p>
-          <w:p>
-            <w:pPr>
-              <w:pStyle w:val="TableParagraph"/>
-              <w:spacing w:before="40" w:after="40"/>
-              <w:ind w:left="199" w:firstLine="195"/>
-              <w:rPr>
-                <w:sz w:val="16"/>
-              </w:rPr>
-            </w:pPr>
-            <w:r>
-              <w:rPr>
-                <w:sz w:val="16"/>
-              </w:rPr>
-              <w:t xml:space="preserve">Счет плательщика: </w:t>
-            </w:r>
-            <w:proofErr w:type="gramStart"/>
-            <w:r>
-              <w:rPr>
-                <w:sz w:val="16"/>
-              </w:rPr>
-              <w:t>40702810206640002909,  БИК</w:t>
-            </w:r>
-            <w:proofErr w:type="gramEnd"/>
-            <w:r>
-              <w:rPr>
-                <w:sz w:val="16"/>
-              </w:rPr>
-              <w:t xml:space="preserve"> 044525411</w:t>
-            </w:r>
-          </w:p>
-          <w:p>
-            <w:pPr>
-              <w:pStyle w:val="TableParagraph"/>
-              <w:spacing w:before="54"/>
-              <w:ind w:left="388"/>
-              <w:rPr>
-                <w:sz w:val="16"/>
-              </w:rPr>
-            </w:pPr>
-            <w:r>
-              <w:rPr>
-                <w:sz w:val="16"/>
-              </w:rPr>
-              <w:t xml:space="preserve"> </w:t>
-            </w:r>
-            <w:r>
-              <w:rPr>
-                <w:sz w:val="16"/>
-              </w:rPr>
-              <w:t xml:space="preserve">Назначение платежа: </w:t>
-            </w:r>
-            <w:r>
-              <w:rPr>
-                <w:sz w:val="16"/>
-              </w:rPr>
-              <w:t xml:space="preserve">Оплата за оказание </w:t>
-            </w:r>
-            <w:proofErr w:type="gramStart"/>
-            <w:r>
-              <w:rPr>
-                <w:sz w:val="16"/>
-              </w:rPr>
-              <w:t>услуг  по</w:t>
-            </w:r>
-            <w:proofErr w:type="gramEnd"/>
-            <w:r>
-              <w:rPr>
-                <w:sz w:val="16"/>
-              </w:rPr>
-              <w:t xml:space="preserve">  </w:t>
-            </w:r>
-            <w:proofErr w:type="gramStart"/>
-            <w:r>
-              <w:rPr>
-                <w:sz w:val="16"/>
-              </w:rPr>
-              <w:t>Договору  №</w:t>
-            </w:r>
-            <w:proofErr w:type="gramEnd"/>
-            <w:r>
-              <w:rPr>
-                <w:sz w:val="16"/>
-              </w:rPr>
-              <w:t xml:space="preserve">004/09/25 </w:t>
-            </w:r>
-            <w:proofErr w:type="gramStart"/>
-            <w:r>
-              <w:rPr>
-                <w:sz w:val="16"/>
-              </w:rPr>
-              <w:t>от  05.09.25г.</w:t>
-            </w:r>
-            <w:proofErr w:type="gramEnd"/>
-            <w:r>
-              <w:rPr>
-                <w:sz w:val="16"/>
-              </w:rPr>
-              <w:t xml:space="preserve"> </w:t>
-            </w:r>
-            <w:r>
-              <w:rPr>
-                <w:sz w:val="16"/>
-              </w:rPr>
-              <w:t xml:space="preserve"> за период 01.</w:t>
-            </w:r>
-            <w:r>
-              <w:rPr>
-                <w:sz w:val="16"/>
-              </w:rPr>
-              <w:t>0</w:t>
-            </w:r>
-            <w:r>
-              <w:rPr>
-                <w:sz w:val="16"/>
-              </w:rPr>
-              <w:t>2</w:t>
-            </w:r>
-            <w:r>
-              <w:rPr>
-                <w:sz w:val="16"/>
-              </w:rPr>
-              <w:t>-</w:t>
-            </w:r>
-            <w:r>
-              <w:rPr>
-                <w:sz w:val="16"/>
-              </w:rPr>
-              <w:t>28</w:t>
-            </w:r>
-            <w:r>
-              <w:rPr>
-                <w:sz w:val="16"/>
-              </w:rPr>
-              <w:t>.</w:t>
-            </w:r>
-            <w:r>
-              <w:rPr>
-                <w:sz w:val="16"/>
-              </w:rPr>
-              <w:t>0</w:t>
-            </w:r>
-            <w:r>
-              <w:rPr>
-                <w:sz w:val="16"/>
-              </w:rPr>
-              <w:t>2</w:t>
-            </w:r>
-            <w:r>
-              <w:rPr>
-                <w:sz w:val="16"/>
-              </w:rPr>
-              <w:t>.202</w:t>
-            </w:r>
-            <w:r>
-              <w:rPr>
-                <w:sz w:val="16"/>
-              </w:rPr>
-              <w:t>6</w:t>
-            </w:r>
-            <w:r>
-              <w:rPr>
-                <w:sz w:val="16"/>
-              </w:rPr>
-              <w:t>г., Акт №</w:t>
-            </w:r>
-            <w:r>
-              <w:rPr>
-                <w:sz w:val="16"/>
-              </w:rPr>
-              <w:t>2</w:t>
-            </w:r>
-            <w:r>
-              <w:rPr>
-                <w:sz w:val="16"/>
-              </w:rPr>
-              <w:t>/</w:t>
-            </w:r>
-            <w:proofErr w:type="gramStart"/>
-            <w:r>
-              <w:rPr>
-                <w:sz w:val="16"/>
-              </w:rPr>
-              <w:t>26</w:t>
-            </w:r>
-            <w:r>
-              <w:rPr>
-                <w:sz w:val="16"/>
-              </w:rPr>
-              <w:t xml:space="preserve">  от</w:t>
-            </w:r>
-            <w:proofErr w:type="gramEnd"/>
-            <w:r>
-              <w:rPr>
-                <w:sz w:val="16"/>
-              </w:rPr>
-              <w:t xml:space="preserve"> </w:t>
-            </w:r>
-            <w:r>
-              <w:rPr>
-                <w:sz w:val="16"/>
-              </w:rPr>
-              <w:t>28</w:t>
-            </w:r>
-            <w:r>
-              <w:rPr>
-                <w:sz w:val="16"/>
-              </w:rPr>
-              <w:t>.</w:t>
-            </w:r>
-            <w:r>
-              <w:rPr>
-                <w:sz w:val="16"/>
-              </w:rPr>
-              <w:t>0</w:t>
-            </w:r>
-            <w:r>
-              <w:rPr>
-                <w:sz w:val="16"/>
-              </w:rPr>
-              <w:t>2</w:t>
-            </w:r>
-            <w:r>
-              <w:rPr>
-                <w:sz w:val="16"/>
-              </w:rPr>
-              <w:t>.202</w:t>
-            </w:r>
-            <w:r>
-              <w:rPr>
-                <w:sz w:val="16"/>
-              </w:rPr>
-              <w:t>6</w:t>
-            </w:r>
-            <w:r>
-              <w:rPr>
-                <w:sz w:val="16"/>
-              </w:rPr>
-              <w:t>г.</w:t>
-            </w:r>
-            <w:r>
-              <w:rPr>
-                <w:sz w:val="16"/>
-              </w:rPr>
-              <w:t>,</w:t>
-            </w:r>
-            <w:r>
-              <w:rPr>
-                <w:sz w:val="16"/>
-              </w:rPr>
-              <w:t xml:space="preserve"> без НДС</w:t>
-            </w:r>
-            <w:r>
-              <w:rPr>
-                <w:sz w:val="16"/>
-              </w:rPr>
-              <w:t>.</w:t>
-            </w:r>
-          </w:p>
-        </w:tc>
-        <w:tc>
-          <w:tcPr>
-            <w:tcW w:w="1472" w:type="dxa"/>
-            <w:gridSpan w:val="2"/>
-            <w:shd w:val="clear" w:color="auto" w:fill="E8E8E8"/>
-          </w:tcPr>
-          <w:p>
-            <w:pPr>
-              <w:pStyle w:val="TableParagraph"/>
-              <w:spacing w:before="54"/>
-              <w:ind w:right="1"/>
-              <w:jc w:val="right"/>
-              <w:rPr>
-                <w:sz w:val="16"/>
-              </w:rPr>
-            </w:pPr>
-            <w:r>
-              <w:rPr>
-                <w:b/>
-                <w:sz w:val="16"/>
-              </w:rPr>
-              <w:t xml:space="preserve">    </w:t>
-            </w:r>
-            <w:r>
-              <w:rPr>
-                <w:b/>
-                <w:sz w:val="16"/>
-              </w:rPr>
-              <w:t xml:space="preserve">  300 000</w:t>
-            </w:r>
-            <w:r>
-              <w:rPr>
-                <w:b/>
-                <w:sz w:val="16"/>
-              </w:rPr>
-              <w:t>,00</w:t>
-            </w:r>
-            <w:r>
-              <w:rPr>
-                <w:b/>
-                <w:spacing w:val="-4"/>
-                <w:sz w:val="16"/>
-              </w:rPr>
-              <w:t xml:space="preserve"> </w:t>
-            </w:r>
-            <w:r>
-              <w:rPr>
-                <w:b/>
-                <w:spacing w:val="-5"/>
-                <w:sz w:val="16"/>
-              </w:rPr>
-              <w:t>RUR</w:t>
-            </w:r>
-          </w:p>
-        </w:tc>
-      </w:tr>
-      <w:tr>
-        <w:trPr>
-          <w:trHeight w:val="383"/>
-        </w:trPr>
-        <w:tc>
-          <w:tcPr>
-            <w:tcW w:w="1239" w:type="dxa"/>
-            <w:tcBorders>
-              <w:top w:val="single" w:sz="4" w:space="0" w:color="7E7E7E"/>
-            </w:tcBorders>
-          </w:tcPr>
-          <w:p>
-            <w:pPr>
-              <w:pStyle w:val="TableParagraph"/>
-              <w:spacing w:before="54"/>
-              <w:rPr>
-                <w:spacing w:val="-2"/>
-                <w:sz w:val="16"/>
-              </w:rPr>
-            </w:pPr>
-            <w:r>
-              <w:rPr>
-                <w:spacing w:val="-2"/>
-                <w:sz w:val="16"/>
-              </w:rPr>
-              <w:t>01.03.2026</w:t>
-            </w:r>
-          </w:p>
-        </w:tc>
-        <w:tc>
-          <w:tcPr>
-            <w:tcW w:w="1789" w:type="dxa"/>
-            <w:tcBorders>
-              <w:top w:val="single" w:sz="4" w:space="0" w:color="7E7E7E"/>
-            </w:tcBorders>
-          </w:tcPr>
-          <w:p>
-            <w:pPr>
-              <w:pStyle w:val="TableParagraph"/>
-              <w:spacing w:before="54"/>
-              <w:ind w:left="144"/>
-              <w:rPr>
-                <w:spacing w:val="-2"/>
-                <w:sz w:val="16"/>
-              </w:rPr>
-            </w:pPr>
-            <w:r>
-              <w:rPr>
-                <w:sz w:val="16"/>
-              </w:rPr>
-              <w:t xml:space="preserve"> MOSH</w:t>
-            </w:r>
-            <w:r>
-              <w:rPr>
-                <w:spacing w:val="-2"/>
-                <w:sz w:val="16"/>
-              </w:rPr>
-              <w:t xml:space="preserve"> 1949145572</w:t>
-            </w:r>
-          </w:p>
-        </w:tc>
-        <w:tc>
-          <w:tcPr>
-            <w:tcW w:w="6430" w:type="dxa"/>
-            <w:tcBorders>
-              <w:top w:val="single" w:sz="4" w:space="0" w:color="7E7E7E"/>
-            </w:tcBorders>
-          </w:tcPr>
-          <w:p>
-            <w:pPr>
-              <w:pStyle w:val="TableParagraph"/>
-              <w:spacing w:before="54"/>
-              <w:ind w:left="193"/>
-              <w:rPr>
-                <w:spacing w:val="-2"/>
-                <w:sz w:val="16"/>
-              </w:rPr>
-            </w:pPr>
-            <w:r>
-              <w:rPr>
-                <w:sz w:val="16"/>
-              </w:rPr>
-              <w:t xml:space="preserve">     Комиссия</w:t>
-            </w:r>
-            <w:r>
-              <w:rPr>
-                <w:spacing w:val="-11"/>
-                <w:sz w:val="16"/>
-              </w:rPr>
-              <w:t xml:space="preserve"> </w:t>
-            </w:r>
-            <w:r>
-              <w:rPr>
-                <w:sz w:val="16"/>
-              </w:rPr>
-              <w:t>за</w:t>
-            </w:r>
-            <w:r>
-              <w:rPr>
-                <w:spacing w:val="-10"/>
-                <w:sz w:val="16"/>
-              </w:rPr>
-              <w:t xml:space="preserve"> </w:t>
-            </w:r>
-            <w:r>
-              <w:rPr>
-                <w:sz w:val="16"/>
-              </w:rPr>
-              <w:t>пакет</w:t>
-            </w:r>
-            <w:r>
-              <w:rPr>
-                <w:spacing w:val="-10"/>
-                <w:sz w:val="16"/>
-              </w:rPr>
-              <w:t xml:space="preserve"> </w:t>
-            </w:r>
-            <w:r>
-              <w:rPr>
-                <w:sz w:val="16"/>
-              </w:rPr>
-              <w:t>услуг</w:t>
-            </w:r>
-            <w:r>
-              <w:rPr>
-                <w:spacing w:val="-11"/>
-                <w:sz w:val="16"/>
-              </w:rPr>
-              <w:t xml:space="preserve"> </w:t>
-            </w:r>
-            <w:proofErr w:type="gramStart"/>
-            <w:r>
-              <w:rPr>
-                <w:sz w:val="16"/>
-              </w:rPr>
-              <w:t>за</w:t>
-            </w:r>
-            <w:r>
-              <w:rPr>
-                <w:spacing w:val="-10"/>
-                <w:sz w:val="16"/>
-              </w:rPr>
-              <w:t xml:space="preserve"> </w:t>
-            </w:r>
-            <w:r>
-              <w:rPr>
-                <w:sz w:val="16"/>
-              </w:rPr>
-              <w:t xml:space="preserve"> февраль</w:t>
-            </w:r>
-            <w:proofErr w:type="gramEnd"/>
-            <w:r>
-              <w:rPr>
-                <w:sz w:val="16"/>
-              </w:rPr>
-              <w:t xml:space="preserve"> </w:t>
-            </w:r>
-            <w:r>
-              <w:rPr>
-                <w:spacing w:val="-10"/>
-                <w:sz w:val="16"/>
-              </w:rPr>
-              <w:t xml:space="preserve"> </w:t>
-            </w:r>
-            <w:r>
-              <w:rPr>
-                <w:sz w:val="16"/>
-              </w:rPr>
-              <w:t>2026</w:t>
-            </w:r>
-            <w:r>
-              <w:rPr>
-                <w:spacing w:val="-11"/>
-                <w:sz w:val="16"/>
-              </w:rPr>
-              <w:t xml:space="preserve"> </w:t>
-            </w:r>
-            <w:r>
-              <w:rPr>
-                <w:sz w:val="16"/>
-              </w:rPr>
-              <w:t>г.</w:t>
-            </w:r>
-            <w:r>
-              <w:rPr>
-                <w:spacing w:val="-10"/>
-                <w:sz w:val="16"/>
-              </w:rPr>
-              <w:t xml:space="preserve"> </w:t>
-            </w:r>
-            <w:r>
-              <w:rPr>
-                <w:sz w:val="16"/>
-              </w:rPr>
-              <w:t>Согласно</w:t>
-            </w:r>
-            <w:r>
-              <w:rPr>
-                <w:spacing w:val="-10"/>
-                <w:sz w:val="16"/>
-              </w:rPr>
-              <w:t xml:space="preserve"> </w:t>
-            </w:r>
-            <w:r>
-              <w:rPr>
-                <w:sz w:val="16"/>
-              </w:rPr>
-              <w:t>тарифам банка</w:t>
-            </w:r>
-            <w:r>
-              <w:rPr>
-                <w:spacing w:val="-11"/>
-                <w:sz w:val="16"/>
-              </w:rPr>
-              <w:t xml:space="preserve"> </w:t>
-            </w:r>
-          </w:p>
-        </w:tc>
-        <w:tc>
-          <w:tcPr>
-            <w:tcW w:w="1472" w:type="dxa"/>
-            <w:gridSpan w:val="2"/>
-            <w:tcBorders>
-              <w:top w:val="single" w:sz="4" w:space="0" w:color="7E7E7E"/>
-            </w:tcBorders>
-          </w:tcPr>
-          <w:p>
-            <w:pPr>
-              <w:pStyle w:val="TableParagraph"/>
-              <w:spacing w:before="54"/>
-              <w:ind w:right="1"/>
-              <w:jc w:val="right"/>
-              <w:rPr>
-                <w:sz w:val="16"/>
-              </w:rPr>
-            </w:pPr>
-            <w:r>
-              <w:rPr>
-                <w:sz w:val="16"/>
-              </w:rPr>
-              <w:t>-</w:t>
-            </w:r>
-            <w:r>
-              <w:rPr>
-                <w:spacing w:val="-2"/>
-                <w:sz w:val="16"/>
-              </w:rPr>
-              <w:t xml:space="preserve"> 399</w:t>
-            </w:r>
-            <w:r>
-              <w:rPr>
-                <w:sz w:val="16"/>
-              </w:rPr>
-              <w:t>,00</w:t>
-            </w:r>
-            <w:r>
-              <w:rPr>
-                <w:spacing w:val="-2"/>
-                <w:sz w:val="16"/>
-              </w:rPr>
-              <w:t xml:space="preserve"> </w:t>
-            </w:r>
-            <w:r>
-              <w:rPr>
-                <w:spacing w:val="-5"/>
-                <w:sz w:val="16"/>
-              </w:rPr>
-              <w:t>RUR</w:t>
-            </w:r>
-          </w:p>
-        </w:tc>
-      </w:tr>
-      <w:tr>
-        <w:trPr>
-          <w:trHeight w:val="383"/>
-        </w:trPr>
-        <w:tc>
-          <w:tcPr>
-            <w:tcW w:w="1239" w:type="dxa"/>
-            <w:tcBorders>
-              <w:top w:val="single" w:sz="4" w:space="0" w:color="7E7E7E"/>
-              <w:bottom w:val="single" w:sz="4" w:space="0" w:color="7E7E7E"/>
-            </w:tcBorders>
-          </w:tcPr>
-          <w:p>
-            <w:pPr>
-              <w:pStyle w:val="TableParagraph"/>
-              <w:spacing w:before="54"/>
-              <w:rPr>
-                <w:sz w:val="16"/>
-              </w:rPr>
-            </w:pPr>
-            <w:r>
-              <w:rPr>
-                <w:spacing w:val="-2"/>
-                <w:sz w:val="16"/>
-              </w:rPr>
-              <w:t>20.02.2026</w:t>
-            </w:r>
-          </w:p>
-        </w:tc>
-        <w:tc>
-          <w:tcPr>
-            <w:tcW w:w="1789" w:type="dxa"/>
-            <w:tcBorders>
-              <w:top w:val="single" w:sz="4" w:space="0" w:color="7E7E7E"/>
-              <w:bottom w:val="single" w:sz="4" w:space="0" w:color="7E7E7E"/>
-            </w:tcBorders>
-          </w:tcPr>
-          <w:p>
-            <w:pPr>
-              <w:pStyle w:val="TableParagraph"/>
-              <w:spacing w:before="54"/>
-              <w:ind w:left="144"/>
-              <w:rPr>
-                <w:sz w:val="16"/>
-                <w:lang w:val="en-US"/>
-              </w:rPr>
-            </w:pPr>
-            <w:r>
-              <w:rPr>
-                <w:spacing w:val="-2"/>
-                <w:sz w:val="16"/>
-              </w:rPr>
-              <w:t>С011305240842792</w:t>
-            </w:r>
-          </w:p>
-        </w:tc>
-        <w:tc>
-          <w:tcPr>
-            <w:tcW w:w="6430" w:type="dxa"/>
-            <w:tcBorders>
-              <w:top w:val="single" w:sz="4" w:space="0" w:color="7E7E7E"/>
-              <w:bottom w:val="single" w:sz="4" w:space="0" w:color="7E7E7E"/>
-            </w:tcBorders>
-          </w:tcPr>
-          <w:p>
-            <w:pPr>
-              <w:pStyle w:val="TableParagraph"/>
-              <w:spacing w:before="54"/>
-              <w:ind w:left="388"/>
-              <w:rPr>
-                <w:sz w:val="16"/>
-              </w:rPr>
-            </w:pPr>
-            <w:r>
-              <w:rPr>
-                <w:spacing w:val="-2"/>
-                <w:sz w:val="16"/>
-              </w:rPr>
-              <w:t xml:space="preserve">Единый налоговый платеж. Оплата НПД за январь 2026г.                                             </w:t>
-            </w:r>
-            <w:r>
-              <w:rPr>
-                <w:spacing w:val="-2"/>
-                <w:sz w:val="16"/>
-              </w:rPr>
-              <w:t xml:space="preserve"> </w:t>
-            </w:r>
-          </w:p>
-        </w:tc>
-        <w:tc>
-          <w:tcPr>
-            <w:tcW w:w="1472" w:type="dxa"/>
-            <w:gridSpan w:val="2"/>
-            <w:tcBorders>
-              <w:top w:val="single" w:sz="4" w:space="0" w:color="7E7E7E"/>
-              <w:bottom w:val="single" w:sz="4" w:space="0" w:color="7E7E7E"/>
-            </w:tcBorders>
-          </w:tcPr>
-          <w:p>
-            <w:pPr>
-              <w:pStyle w:val="TableParagraph"/>
-              <w:spacing w:before="54"/>
-              <w:ind w:right="1"/>
-              <w:jc w:val="right"/>
-              <w:rPr>
-                <w:sz w:val="16"/>
-              </w:rPr>
-            </w:pPr>
-            <w:r>
-              <w:rPr>
-                <w:sz w:val="16"/>
-              </w:rPr>
-              <w:t>-18 000,00</w:t>
-            </w:r>
-            <w:r>
-              <w:rPr>
-                <w:spacing w:val="-3"/>
-                <w:sz w:val="16"/>
-              </w:rPr>
-              <w:t xml:space="preserve"> </w:t>
-            </w:r>
-            <w:r>
-              <w:rPr>
-                <w:spacing w:val="-5"/>
-                <w:sz w:val="16"/>
-              </w:rPr>
-              <w:t>RUR</w:t>
-            </w:r>
-          </w:p>
-        </w:tc>
-      </w:tr>
-      <w:tr>
-        <w:trPr>
-          <w:trHeight w:val="383"/>
-        </w:trPr>
-        <w:tc>
-          <w:tcPr>
-            <w:tcW w:w="1239" w:type="dxa"/>
-            <w:tcBorders>
-              <w:top w:val="single" w:sz="4" w:space="0" w:color="7E7E7E"/>
-              <w:bottom w:val="single" w:sz="4" w:space="0" w:color="7E7E7E"/>
-            </w:tcBorders>
-          </w:tcPr>
-          <w:p>
-            <w:pPr>
-              <w:pStyle w:val="TableParagraph"/>
-              <w:spacing w:before="54"/>
-              <w:rPr>
-                <w:spacing w:val="-2"/>
-                <w:sz w:val="16"/>
-              </w:rPr>
-            </w:pPr>
-            <w:r>
-              <w:rPr>
-                <w:spacing w:val="-2"/>
-                <w:sz w:val="16"/>
-              </w:rPr>
-              <w:t>13.02.2026</w:t>
-            </w:r>
-          </w:p>
-        </w:tc>
-        <w:tc>
-          <w:tcPr>
-            <w:tcW w:w="1789" w:type="dxa"/>
-            <w:tcBorders>
-              <w:top w:val="single" w:sz="4" w:space="0" w:color="7E7E7E"/>
-              <w:bottom w:val="single" w:sz="4" w:space="0" w:color="7E7E7E"/>
-            </w:tcBorders>
-          </w:tcPr>
-          <w:p>
-            <w:pPr>
-              <w:pStyle w:val="TableParagraph"/>
-              <w:spacing w:before="54"/>
-              <w:ind w:left="144"/>
-              <w:rPr>
-                <w:spacing w:val="-2"/>
-                <w:sz w:val="16"/>
-                <w:lang w:val="en-US"/>
-              </w:rPr>
-            </w:pPr>
-            <w:r>
-              <w:rPr>
-                <w:spacing w:val="-2"/>
-                <w:sz w:val="16"/>
-              </w:rPr>
-              <w:t>С011305240820612</w:t>
-            </w:r>
-          </w:p>
-        </w:tc>
-        <w:tc>
-          <w:tcPr>
-            <w:tcW w:w="6430" w:type="dxa"/>
-            <w:tcBorders>
-              <w:top w:val="single" w:sz="4" w:space="0" w:color="7E7E7E"/>
-              <w:bottom w:val="single" w:sz="4" w:space="0" w:color="7E7E7E"/>
-            </w:tcBorders>
-          </w:tcPr>
-          <w:p>
-            <w:pPr>
-              <w:pStyle w:val="TableParagraph"/>
-              <w:spacing w:before="54"/>
-              <w:ind w:left="193" w:firstLine="196"/>
-              <w:rPr>
-                <w:spacing w:val="-2"/>
-                <w:sz w:val="16"/>
-              </w:rPr>
-            </w:pPr>
-            <w:r>
-              <w:rPr>
-                <w:spacing w:val="-2"/>
-                <w:sz w:val="16"/>
-              </w:rPr>
-              <w:t xml:space="preserve">Перевод </w:t>
-            </w:r>
-            <w:r>
-              <w:rPr>
-                <w:spacing w:val="-2"/>
-                <w:sz w:val="16"/>
-              </w:rPr>
-              <w:t xml:space="preserve">  </w:t>
-            </w:r>
-            <w:r>
-              <w:rPr>
-                <w:spacing w:val="-2"/>
-                <w:sz w:val="16"/>
-              </w:rPr>
-              <w:t xml:space="preserve">JSC*KWIKPAY </w:t>
-            </w:r>
-            <w:proofErr w:type="spellStart"/>
-            <w:r>
-              <w:rPr>
-                <w:spacing w:val="-2"/>
-                <w:sz w:val="16"/>
-              </w:rPr>
-              <w:t>online</w:t>
-            </w:r>
-            <w:proofErr w:type="spellEnd"/>
-            <w:r>
-              <w:rPr>
-                <w:spacing w:val="-5"/>
-                <w:sz w:val="16"/>
-              </w:rPr>
-              <w:t>.</w:t>
-            </w:r>
-          </w:p>
-        </w:tc>
-        <w:tc>
-          <w:tcPr>
-            <w:tcW w:w="1472" w:type="dxa"/>
-            <w:gridSpan w:val="2"/>
-            <w:tcBorders>
-              <w:top w:val="single" w:sz="4" w:space="0" w:color="7E7E7E"/>
-              <w:bottom w:val="single" w:sz="4" w:space="0" w:color="7E7E7E"/>
-            </w:tcBorders>
-          </w:tcPr>
-          <w:p>
-            <w:pPr>
-              <w:pStyle w:val="TableParagraph"/>
-              <w:spacing w:before="54"/>
-              <w:ind w:right="1"/>
-              <w:jc w:val="right"/>
-              <w:rPr>
-                <w:sz w:val="16"/>
-              </w:rPr>
-            </w:pPr>
-            <w:r>
-              <w:rPr>
-                <w:sz w:val="16"/>
-              </w:rPr>
-              <w:t>-25</w:t>
-            </w:r>
-            <w:r>
-              <w:rPr>
-                <w:sz w:val="16"/>
-                <w:lang w:val="en-US"/>
-              </w:rPr>
-              <w:t>8</w:t>
-            </w:r>
-            <w:r>
-              <w:rPr>
-                <w:sz w:val="16"/>
-              </w:rPr>
-              <w:t xml:space="preserve"> 607,23</w:t>
-            </w:r>
-            <w:r>
-              <w:rPr>
-                <w:spacing w:val="-3"/>
-                <w:sz w:val="16"/>
-              </w:rPr>
-              <w:t xml:space="preserve"> </w:t>
-            </w:r>
-            <w:r>
-              <w:rPr>
-                <w:spacing w:val="-5"/>
-                <w:sz w:val="16"/>
-              </w:rPr>
-              <w:t>RUR</w:t>
-            </w:r>
-          </w:p>
-        </w:tc>
-      </w:tr>
-      <w:tr>
-        <w:trPr>
-          <w:trHeight w:val="1223"/>
-        </w:trPr>
-        <w:tc>
-          <w:tcPr>
-            <w:tcW w:w="1239" w:type="dxa"/>
-            <w:tcBorders>
-              <w:top w:val="single" w:sz="4" w:space="0" w:color="7E7E7E"/>
-              <w:bottom w:val="single" w:sz="4" w:space="0" w:color="7E7E7E"/>
-            </w:tcBorders>
-            <w:shd w:val="clear" w:color="auto" w:fill="E8E8E8"/>
-          </w:tcPr>
-          <w:p>
-            <w:pPr>
-              <w:pStyle w:val="TableParagraph"/>
-              <w:spacing w:before="54"/>
-              <w:rPr>
-                <w:sz w:val="16"/>
-              </w:rPr>
-            </w:pPr>
-            <w:r>
-              <w:rPr>
-                <w:spacing w:val="-2"/>
-                <w:sz w:val="16"/>
-              </w:rPr>
-              <w:t>09.02.2026</w:t>
-            </w:r>
-          </w:p>
-        </w:tc>
-        <w:tc>
-          <w:tcPr>
-            <w:tcW w:w="1789" w:type="dxa"/>
-            <w:tcBorders>
-              <w:top w:val="single" w:sz="4" w:space="0" w:color="7E7E7E"/>
-              <w:bottom w:val="single" w:sz="4" w:space="0" w:color="7E7E7E"/>
-            </w:tcBorders>
-            <w:shd w:val="clear" w:color="auto" w:fill="E8E8E8"/>
-          </w:tcPr>
-          <w:p>
-            <w:pPr>
-              <w:pStyle w:val="TableParagraph"/>
-              <w:spacing w:before="54"/>
-              <w:rPr>
-                <w:sz w:val="16"/>
-                <w:lang w:val="en-US"/>
-              </w:rPr>
-            </w:pPr>
-            <w:r>
-              <w:rPr>
-                <w:spacing w:val="-2"/>
-                <w:sz w:val="16"/>
-              </w:rPr>
-              <w:t xml:space="preserve">    </w:t>
-            </w:r>
-            <w:r>
-              <w:rPr>
-                <w:spacing w:val="-2"/>
-                <w:sz w:val="16"/>
-              </w:rPr>
-              <w:t>C1613052408</w:t>
-            </w:r>
-            <w:r>
-              <w:rPr>
-                <w:spacing w:val="-2"/>
-                <w:sz w:val="16"/>
-              </w:rPr>
-              <w:t>15432</w:t>
-            </w:r>
-          </w:p>
-        </w:tc>
-        <w:tc>
-          <w:tcPr>
-            <w:tcW w:w="6430" w:type="dxa"/>
-            <w:tcBorders>
-              <w:bottom w:val="single" w:sz="4" w:space="0" w:color="7E7E7E"/>
-            </w:tcBorders>
-            <w:shd w:val="clear" w:color="auto" w:fill="E8E8E8"/>
-          </w:tcPr>
-          <w:p>
-            <w:pPr>
-              <w:pStyle w:val="TableParagraph"/>
-              <w:spacing w:before="40" w:after="40"/>
-              <w:ind w:left="199" w:firstLine="195"/>
-              <w:rPr>
-                <w:sz w:val="16"/>
-              </w:rPr>
-            </w:pPr>
-            <w:r>
-              <w:rPr>
-                <w:sz w:val="16"/>
-              </w:rPr>
-              <w:t>Плательщик: ООО "Строительная компания СК10"</w:t>
-            </w:r>
-          </w:p>
-          <w:p>
-            <w:pPr>
-              <w:pStyle w:val="TableParagraph"/>
-              <w:spacing w:before="40" w:after="40"/>
-              <w:ind w:left="199" w:firstLine="195"/>
-              <w:rPr>
-                <w:sz w:val="16"/>
-              </w:rPr>
-            </w:pPr>
-            <w:r>
-              <w:rPr>
-                <w:sz w:val="16"/>
-              </w:rPr>
-              <w:t>ИНН плательщика: 6168006148</w:t>
-            </w:r>
-          </w:p>
-          <w:p>
-            <w:pPr>
-              <w:pStyle w:val="TableParagraph"/>
-              <w:spacing w:before="40" w:after="40"/>
-              <w:ind w:left="199" w:firstLine="195"/>
-              <w:rPr>
-                <w:sz w:val="16"/>
-              </w:rPr>
-            </w:pPr>
-            <w:r>
-              <w:rPr>
-                <w:sz w:val="16"/>
-              </w:rPr>
-              <w:t xml:space="preserve">Счет плательщика: </w:t>
-            </w:r>
-            <w:proofErr w:type="gramStart"/>
-            <w:r>
-              <w:rPr>
-                <w:sz w:val="16"/>
-              </w:rPr>
-              <w:t>40702810206640002909,  БИК</w:t>
-            </w:r>
-            <w:proofErr w:type="gramEnd"/>
-            <w:r>
-              <w:rPr>
-                <w:sz w:val="16"/>
-              </w:rPr>
-              <w:t xml:space="preserve"> 044525411</w:t>
-            </w:r>
-          </w:p>
-          <w:p>
-            <w:pPr>
-              <w:pStyle w:val="TableParagraph"/>
-              <w:spacing w:before="40" w:after="40"/>
-              <w:ind w:left="394" w:hanging="1"/>
-              <w:rPr>
-                <w:sz w:val="16"/>
-              </w:rPr>
-            </w:pPr>
-            <w:r>
-              <w:rPr>
-                <w:sz w:val="16"/>
-              </w:rPr>
-              <w:t xml:space="preserve">Назначение платежа: Оплата за оказание </w:t>
-            </w:r>
-            <w:proofErr w:type="gramStart"/>
-            <w:r>
-              <w:rPr>
-                <w:sz w:val="16"/>
-              </w:rPr>
-              <w:t>услуг  по</w:t>
-            </w:r>
-            <w:proofErr w:type="gramEnd"/>
-            <w:r>
-              <w:rPr>
-                <w:sz w:val="16"/>
-              </w:rPr>
-              <w:t xml:space="preserve"> </w:t>
-            </w:r>
-            <w:proofErr w:type="gramStart"/>
-            <w:r>
-              <w:rPr>
-                <w:sz w:val="16"/>
-              </w:rPr>
-              <w:t>Договору  №</w:t>
-            </w:r>
-            <w:proofErr w:type="gramEnd"/>
-            <w:r>
-              <w:rPr>
-                <w:sz w:val="16"/>
-              </w:rPr>
-              <w:t xml:space="preserve">004/09/25 </w:t>
-            </w:r>
-            <w:proofErr w:type="gramStart"/>
-            <w:r>
-              <w:rPr>
-                <w:sz w:val="16"/>
-              </w:rPr>
-              <w:t>от  05.09.25г.</w:t>
-            </w:r>
-            <w:proofErr w:type="gramEnd"/>
-            <w:r>
-              <w:rPr>
-                <w:sz w:val="16"/>
-              </w:rPr>
-              <w:t xml:space="preserve"> </w:t>
-            </w:r>
-            <w:r>
-              <w:rPr>
-                <w:sz w:val="16"/>
-              </w:rPr>
-              <w:t>за период 01.</w:t>
-            </w:r>
-            <w:r>
-              <w:rPr>
-                <w:sz w:val="16"/>
-              </w:rPr>
-              <w:t>0</w:t>
-            </w:r>
-            <w:r>
-              <w:rPr>
-                <w:sz w:val="16"/>
-              </w:rPr>
-              <w:t>1-3</w:t>
-            </w:r>
-            <w:r>
-              <w:rPr>
-                <w:sz w:val="16"/>
-              </w:rPr>
-              <w:t>1</w:t>
-            </w:r>
-            <w:r>
-              <w:rPr>
-                <w:sz w:val="16"/>
-              </w:rPr>
-              <w:t>.</w:t>
-            </w:r>
-            <w:r>
-              <w:rPr>
-                <w:sz w:val="16"/>
-              </w:rPr>
-              <w:t>0</w:t>
-            </w:r>
-            <w:r>
-              <w:rPr>
-                <w:sz w:val="16"/>
-              </w:rPr>
-              <w:t>1.202</w:t>
-            </w:r>
-            <w:r>
-              <w:rPr>
-                <w:sz w:val="16"/>
-              </w:rPr>
-              <w:t>6</w:t>
-            </w:r>
-            <w:r>
-              <w:rPr>
-                <w:sz w:val="16"/>
-              </w:rPr>
-              <w:t>г., Акт №</w:t>
-            </w:r>
-            <w:r>
-              <w:rPr>
-                <w:sz w:val="16"/>
-              </w:rPr>
-              <w:t>1/</w:t>
-            </w:r>
-            <w:proofErr w:type="gramStart"/>
-            <w:r>
-              <w:rPr>
-                <w:sz w:val="16"/>
-              </w:rPr>
-              <w:t>26</w:t>
-            </w:r>
-            <w:r>
-              <w:rPr>
-                <w:sz w:val="16"/>
-              </w:rPr>
-              <w:t xml:space="preserve">  от</w:t>
-            </w:r>
-            <w:proofErr w:type="gramEnd"/>
-            <w:r>
-              <w:rPr>
-                <w:sz w:val="16"/>
-              </w:rPr>
-              <w:t xml:space="preserve"> 3</w:t>
-            </w:r>
-            <w:r>
-              <w:rPr>
-                <w:sz w:val="16"/>
-              </w:rPr>
-              <w:t>1</w:t>
-            </w:r>
-            <w:r>
-              <w:rPr>
-                <w:sz w:val="16"/>
-              </w:rPr>
-              <w:t>.</w:t>
-            </w:r>
-            <w:r>
-              <w:rPr>
-                <w:sz w:val="16"/>
-              </w:rPr>
-              <w:t>0</w:t>
-            </w:r>
-            <w:r>
-              <w:rPr>
-                <w:sz w:val="16"/>
-              </w:rPr>
-              <w:t>1.202</w:t>
-            </w:r>
-            <w:r>
-              <w:rPr>
-                <w:sz w:val="16"/>
-              </w:rPr>
-              <w:t>6</w:t>
-            </w:r>
-            <w:r>
-              <w:rPr>
-                <w:sz w:val="16"/>
-              </w:rPr>
-              <w:t>г.</w:t>
-            </w:r>
-            <w:r>
-              <w:rPr>
-                <w:sz w:val="16"/>
-              </w:rPr>
-              <w:t>,</w:t>
-            </w:r>
-            <w:r>
-              <w:rPr>
-                <w:sz w:val="16"/>
-              </w:rPr>
-              <w:t xml:space="preserve"> без НДС</w:t>
-            </w:r>
-            <w:r>
-              <w:rPr>
-                <w:sz w:val="16"/>
-              </w:rPr>
-              <w:t>.</w:t>
-            </w:r>
-          </w:p>
-        </w:tc>
-        <w:tc>
-          <w:tcPr>
-            <w:tcW w:w="1472" w:type="dxa"/>
-            <w:gridSpan w:val="2"/>
-            <w:tcBorders>
-              <w:bottom w:val="single" w:sz="4" w:space="0" w:color="7E7E7E"/>
-            </w:tcBorders>
-            <w:shd w:val="clear" w:color="auto" w:fill="E8E8E8"/>
-          </w:tcPr>
-          <w:p>
-            <w:pPr>
-              <w:pStyle w:val="TableParagraph"/>
-              <w:spacing w:before="52"/>
-              <w:rPr>
-                <w:b/>
-                <w:sz w:val="16"/>
-              </w:rPr>
-            </w:pPr>
-            <w:r>
-              <w:rPr>
-                <w:b/>
-                <w:sz w:val="16"/>
-              </w:rPr>
-              <w:t xml:space="preserve">    </w:t>
-            </w:r>
-            <w:r>
-              <w:rPr>
-                <w:b/>
-                <w:sz w:val="16"/>
-              </w:rPr>
-              <w:t xml:space="preserve">  </w:t>
-            </w:r>
-            <w:r>
-              <w:rPr>
-                <w:b/>
-                <w:sz w:val="16"/>
-              </w:rPr>
-              <w:t xml:space="preserve"> </w:t>
-            </w:r>
-            <w:r>
-              <w:rPr>
-                <w:b/>
-                <w:sz w:val="16"/>
-              </w:rPr>
-              <w:t>300 000</w:t>
-            </w:r>
-            <w:r>
-              <w:rPr>
-                <w:b/>
-                <w:sz w:val="16"/>
-              </w:rPr>
-              <w:t>,00</w:t>
-            </w:r>
-            <w:r>
-              <w:rPr>
-                <w:b/>
-                <w:spacing w:val="-4"/>
-                <w:sz w:val="16"/>
-              </w:rPr>
-              <w:t xml:space="preserve"> </w:t>
-            </w:r>
-            <w:r>
-              <w:rPr>
-                <w:b/>
-                <w:spacing w:val="-5"/>
-                <w:sz w:val="16"/>
-              </w:rPr>
-              <w:t>RUR</w:t>
-            </w:r>
-          </w:p>
-        </w:tc>
-      </w:tr>
-      <w:tr>
-        <w:trPr>
-          <w:trHeight w:val="418"/>
-        </w:trPr>
-        <w:tc>
-          <w:tcPr>
-            <w:tcW w:w="1239" w:type="dxa"/>
-            <w:tcBorders>
-              <w:top w:val="single" w:sz="4" w:space="0" w:color="7E7E7E"/>
-              <w:bottom w:val="single" w:sz="4" w:space="0" w:color="7E7E7E"/>
-            </w:tcBorders>
-          </w:tcPr>
-          <w:p>
-            <w:pPr>
-              <w:pStyle w:val="TableParagraph"/>
-              <w:spacing w:before="54" w:line="164" w:lineRule="exact"/>
-              <w:rPr>
-                <w:sz w:val="16"/>
-              </w:rPr>
-            </w:pPr>
-            <w:r>
-              <w:rPr>
-                <w:spacing w:val="-2"/>
-                <w:sz w:val="16"/>
-              </w:rPr>
-              <w:lastRenderedPageBreak/>
-              <w:t>01.02.2026</w:t>
-            </w:r>
-          </w:p>
-        </w:tc>
-        <w:tc>
-          <w:tcPr>
-            <w:tcW w:w="1789" w:type="dxa"/>
-            <w:tcBorders>
-              <w:top w:val="single" w:sz="4" w:space="0" w:color="7E7E7E"/>
-              <w:bottom w:val="single" w:sz="4" w:space="0" w:color="7E7E7E"/>
-            </w:tcBorders>
-          </w:tcPr>
-          <w:p>
-            <w:pPr>
-              <w:pStyle w:val="TableParagraph"/>
-              <w:spacing w:before="54" w:line="164" w:lineRule="exact"/>
-              <w:rPr>
-                <w:sz w:val="16"/>
-              </w:rPr>
-            </w:pPr>
-            <w:r>
-              <w:rPr>
-                <w:sz w:val="16"/>
-              </w:rPr>
-              <w:t xml:space="preserve">    MOSH</w:t>
-            </w:r>
-            <w:r>
-              <w:rPr>
-                <w:spacing w:val="-2"/>
-                <w:sz w:val="16"/>
-              </w:rPr>
-              <w:t xml:space="preserve"> 1940765083</w:t>
-            </w:r>
-          </w:p>
-        </w:tc>
-        <w:tc>
-          <w:tcPr>
-            <w:tcW w:w="6430" w:type="dxa"/>
-            <w:tcBorders>
-              <w:top w:val="single" w:sz="4" w:space="0" w:color="7E7E7E"/>
-              <w:bottom w:val="single" w:sz="4" w:space="0" w:color="7E7E7E"/>
-            </w:tcBorders>
-          </w:tcPr>
-          <w:p>
-            <w:pPr>
-              <w:pStyle w:val="TableParagraph"/>
-              <w:spacing w:before="54" w:line="164" w:lineRule="exact"/>
-              <w:ind w:left="168"/>
-              <w:rPr>
-                <w:sz w:val="16"/>
-              </w:rPr>
-            </w:pPr>
-            <w:r>
-              <w:rPr>
-                <w:sz w:val="16"/>
-              </w:rPr>
-              <w:t xml:space="preserve">     Комиссия</w:t>
-            </w:r>
-            <w:r>
-              <w:rPr>
-                <w:spacing w:val="-11"/>
-                <w:sz w:val="16"/>
-              </w:rPr>
-              <w:t xml:space="preserve"> </w:t>
-            </w:r>
-            <w:r>
-              <w:rPr>
-                <w:sz w:val="16"/>
-              </w:rPr>
-              <w:t>за</w:t>
-            </w:r>
-            <w:r>
-              <w:rPr>
-                <w:spacing w:val="-10"/>
-                <w:sz w:val="16"/>
-              </w:rPr>
-              <w:t xml:space="preserve"> </w:t>
-            </w:r>
-            <w:r>
-              <w:rPr>
-                <w:sz w:val="16"/>
-              </w:rPr>
-              <w:t>пакет</w:t>
-            </w:r>
-            <w:r>
-              <w:rPr>
-                <w:spacing w:val="-10"/>
-                <w:sz w:val="16"/>
-              </w:rPr>
-              <w:t xml:space="preserve"> </w:t>
-            </w:r>
-            <w:r>
-              <w:rPr>
-                <w:sz w:val="16"/>
-              </w:rPr>
-              <w:t>услуг</w:t>
-            </w:r>
-            <w:r>
-              <w:rPr>
-                <w:spacing w:val="-11"/>
-                <w:sz w:val="16"/>
-              </w:rPr>
-              <w:t xml:space="preserve"> </w:t>
-            </w:r>
-            <w:proofErr w:type="gramStart"/>
-            <w:r>
-              <w:rPr>
-                <w:sz w:val="16"/>
-              </w:rPr>
-              <w:t>за</w:t>
-            </w:r>
-            <w:r>
-              <w:rPr>
-                <w:spacing w:val="-10"/>
-                <w:sz w:val="16"/>
-              </w:rPr>
-              <w:t xml:space="preserve"> </w:t>
-            </w:r>
-            <w:r>
-              <w:rPr>
-                <w:sz w:val="16"/>
-              </w:rPr>
-              <w:t xml:space="preserve"> январь</w:t>
-            </w:r>
-            <w:proofErr w:type="gramEnd"/>
-            <w:r>
-              <w:rPr>
-                <w:spacing w:val="-10"/>
-                <w:sz w:val="16"/>
-              </w:rPr>
-              <w:t xml:space="preserve"> </w:t>
-            </w:r>
-            <w:r>
-              <w:rPr>
-                <w:sz w:val="16"/>
-              </w:rPr>
-              <w:t>2026</w:t>
-            </w:r>
-            <w:r>
-              <w:rPr>
-                <w:spacing w:val="-11"/>
-                <w:sz w:val="16"/>
-              </w:rPr>
-              <w:t xml:space="preserve"> </w:t>
-            </w:r>
-            <w:r>
-              <w:rPr>
-                <w:sz w:val="16"/>
-              </w:rPr>
-              <w:t>г.</w:t>
-            </w:r>
-            <w:r>
-              <w:rPr>
-                <w:spacing w:val="-10"/>
-                <w:sz w:val="16"/>
-              </w:rPr>
-              <w:t xml:space="preserve"> </w:t>
-            </w:r>
-            <w:r>
-              <w:rPr>
-                <w:sz w:val="16"/>
-              </w:rPr>
-              <w:t>Согласно</w:t>
-            </w:r>
-            <w:r>
-              <w:rPr>
-                <w:spacing w:val="-10"/>
-                <w:sz w:val="16"/>
-              </w:rPr>
-              <w:t xml:space="preserve"> </w:t>
-            </w:r>
-            <w:proofErr w:type="gramStart"/>
-            <w:r>
-              <w:rPr>
-                <w:sz w:val="16"/>
-              </w:rPr>
-              <w:t>тарифам  банка</w:t>
-            </w:r>
-            <w:proofErr w:type="gramEnd"/>
-            <w:r>
-              <w:rPr>
-                <w:sz w:val="16"/>
-              </w:rPr>
-              <w:t>.</w:t>
-            </w:r>
-            <w:r>
-              <w:rPr>
-                <w:spacing w:val="-11"/>
-                <w:sz w:val="16"/>
-              </w:rPr>
-              <w:t xml:space="preserve"> </w:t>
-            </w:r>
-          </w:p>
-        </w:tc>
-        <w:tc>
-          <w:tcPr>
-            <w:tcW w:w="1472" w:type="dxa"/>
-            <w:gridSpan w:val="2"/>
-            <w:tcBorders>
-              <w:top w:val="single" w:sz="4" w:space="0" w:color="7E7E7E"/>
-              <w:bottom w:val="single" w:sz="4" w:space="0" w:color="7E7E7E"/>
-            </w:tcBorders>
-          </w:tcPr>
-          <w:p>
-            <w:pPr>
-              <w:pStyle w:val="TableParagraph"/>
-              <w:spacing w:before="54" w:line="164" w:lineRule="exact"/>
-              <w:ind w:right="10"/>
-              <w:jc w:val="right"/>
-              <w:rPr>
-                <w:sz w:val="16"/>
-              </w:rPr>
-            </w:pPr>
-            <w:r>
-              <w:rPr>
-                <w:sz w:val="16"/>
-              </w:rPr>
-              <w:t>-</w:t>
-            </w:r>
-            <w:r>
-              <w:rPr>
-                <w:spacing w:val="-2"/>
-                <w:sz w:val="16"/>
-              </w:rPr>
-              <w:t xml:space="preserve"> 399</w:t>
-            </w:r>
-            <w:r>
-              <w:rPr>
-                <w:sz w:val="16"/>
-              </w:rPr>
-              <w:t>,00</w:t>
-            </w:r>
-            <w:r>
-              <w:rPr>
-                <w:spacing w:val="-2"/>
-                <w:sz w:val="16"/>
-              </w:rPr>
-              <w:t xml:space="preserve"> </w:t>
-            </w:r>
-            <w:r>
-              <w:rPr>
-                <w:spacing w:val="-5"/>
-                <w:sz w:val="16"/>
-              </w:rPr>
-              <w:t>RUR</w:t>
-            </w:r>
-          </w:p>
-        </w:tc>
-      </w:tr>
-      <w:tr>
-        <w:trPr>
-          <w:trHeight w:val="419"/>
-        </w:trPr>
-        <w:tc>
-          <w:tcPr>
-            <w:tcW w:w="1239" w:type="dxa"/>
-            <w:tcBorders>
-              <w:top w:val="single" w:sz="4" w:space="0" w:color="7E7E7E"/>
-              <w:bottom w:val="single" w:sz="4" w:space="0" w:color="7E7E7E"/>
-            </w:tcBorders>
-          </w:tcPr>
-          <w:p>
-            <w:pPr>
-              <w:pStyle w:val="TableParagraph"/>
-              <w:spacing w:before="54"/>
-              <w:rPr>
-                <w:sz w:val="16"/>
-              </w:rPr>
-            </w:pPr>
-            <w:r>
-              <w:rPr>
-                <w:spacing w:val="-2"/>
-                <w:sz w:val="16"/>
-              </w:rPr>
-              <w:t>22.01.2026</w:t>
-            </w:r>
-          </w:p>
-        </w:tc>
-        <w:tc>
-          <w:tcPr>
-            <w:tcW w:w="1789" w:type="dxa"/>
-            <w:tcBorders>
-              <w:top w:val="single" w:sz="4" w:space="0" w:color="7E7E7E"/>
-              <w:bottom w:val="single" w:sz="4" w:space="0" w:color="7E7E7E"/>
-            </w:tcBorders>
-          </w:tcPr>
-          <w:p>
-            <w:pPr>
-              <w:pStyle w:val="TableParagraph"/>
-              <w:spacing w:before="54"/>
-              <w:ind w:left="144"/>
-              <w:rPr>
-                <w:sz w:val="16"/>
-              </w:rPr>
-            </w:pPr>
-            <w:r>
-              <w:rPr>
-                <w:spacing w:val="-2"/>
-                <w:sz w:val="16"/>
-              </w:rPr>
-              <w:t>С011325240345860</w:t>
-            </w:r>
-          </w:p>
-        </w:tc>
-        <w:tc>
-          <w:tcPr>
-            <w:tcW w:w="6430" w:type="dxa"/>
-            <w:tcBorders>
-              <w:top w:val="single" w:sz="4" w:space="0" w:color="7E7E7E"/>
-              <w:bottom w:val="single" w:sz="4" w:space="0" w:color="7E7E7E"/>
-            </w:tcBorders>
-          </w:tcPr>
-          <w:p>
-            <w:pPr>
-              <w:pStyle w:val="TableParagraph"/>
-              <w:spacing w:before="54"/>
-              <w:ind w:left="193" w:firstLine="196"/>
-              <w:rPr>
-                <w:sz w:val="16"/>
-              </w:rPr>
-            </w:pPr>
-            <w:r>
-              <w:rPr>
-                <w:spacing w:val="-2"/>
-                <w:sz w:val="16"/>
-              </w:rPr>
-              <w:t xml:space="preserve">Единый налоговый платеж. Оплата НПД за </w:t>
-            </w:r>
-            <w:r>
-              <w:rPr>
-                <w:spacing w:val="-2"/>
-                <w:sz w:val="16"/>
-              </w:rPr>
-              <w:t>декабрь</w:t>
-            </w:r>
-            <w:r>
-              <w:rPr>
-                <w:spacing w:val="-2"/>
-                <w:sz w:val="16"/>
-              </w:rPr>
-              <w:t xml:space="preserve"> 202</w:t>
-            </w:r>
-            <w:r>
-              <w:rPr>
-                <w:spacing w:val="-2"/>
-                <w:sz w:val="16"/>
-              </w:rPr>
-              <w:t>5</w:t>
-            </w:r>
-            <w:r>
-              <w:rPr>
-                <w:spacing w:val="-2"/>
-                <w:sz w:val="16"/>
-              </w:rPr>
-              <w:t xml:space="preserve">г.                                              </w:t>
-            </w:r>
-          </w:p>
-        </w:tc>
-        <w:tc>
-          <w:tcPr>
-            <w:tcW w:w="1472" w:type="dxa"/>
-            <w:gridSpan w:val="2"/>
-            <w:tcBorders>
-              <w:top w:val="single" w:sz="4" w:space="0" w:color="7E7E7E"/>
-              <w:bottom w:val="single" w:sz="4" w:space="0" w:color="7E7E7E"/>
-            </w:tcBorders>
-          </w:tcPr>
-          <w:p>
-            <w:pPr>
-              <w:pStyle w:val="TableParagraph"/>
-              <w:spacing w:before="54"/>
-              <w:ind w:right="1"/>
-              <w:jc w:val="right"/>
-              <w:rPr>
-                <w:sz w:val="16"/>
-              </w:rPr>
-            </w:pPr>
-            <w:r>
-              <w:rPr>
-                <w:sz w:val="16"/>
-              </w:rPr>
-              <w:t>-18 000,00</w:t>
-            </w:r>
-            <w:r>
-              <w:rPr>
-                <w:spacing w:val="-3"/>
-                <w:sz w:val="16"/>
-              </w:rPr>
-              <w:t xml:space="preserve"> </w:t>
-            </w:r>
-            <w:r>
-              <w:rPr>
-                <w:spacing w:val="-5"/>
-                <w:sz w:val="16"/>
-              </w:rPr>
-              <w:t>RUR</w:t>
-            </w:r>
-          </w:p>
-        </w:tc>
-      </w:tr>
-      <w:tr>
-        <w:trPr>
-          <w:trHeight w:val="419"/>
-        </w:trPr>
-        <w:tc>
-          <w:tcPr>
-            <w:tcW w:w="1239" w:type="dxa"/>
-            <w:tcBorders>
-              <w:top w:val="single" w:sz="4" w:space="0" w:color="7E7E7E"/>
-              <w:bottom w:val="single" w:sz="4" w:space="0" w:color="7E7E7E"/>
-            </w:tcBorders>
-          </w:tcPr>
-          <w:p>
-            <w:pPr>
-              <w:pStyle w:val="TableParagraph"/>
-              <w:spacing w:before="54" w:line="164" w:lineRule="exact"/>
-              <w:rPr>
-                <w:sz w:val="16"/>
-              </w:rPr>
-            </w:pPr>
-            <w:r>
-              <w:rPr>
-                <w:spacing w:val="-2"/>
-                <w:sz w:val="16"/>
-              </w:rPr>
-              <w:t>19.01.2026</w:t>
-            </w:r>
-          </w:p>
-        </w:tc>
-        <w:tc>
-          <w:tcPr>
-            <w:tcW w:w="1789" w:type="dxa"/>
-            <w:tcBorders>
-              <w:top w:val="single" w:sz="4" w:space="0" w:color="7E7E7E"/>
-              <w:bottom w:val="single" w:sz="4" w:space="0" w:color="7E7E7E"/>
-            </w:tcBorders>
-          </w:tcPr>
-          <w:p>
-            <w:pPr>
-              <w:pStyle w:val="TableParagraph"/>
-              <w:spacing w:before="54"/>
-              <w:ind w:left="144"/>
-              <w:rPr>
-                <w:sz w:val="16"/>
-                <w:lang w:val="en-US"/>
-              </w:rPr>
-            </w:pPr>
-            <w:r>
-              <w:rPr>
-                <w:spacing w:val="-2"/>
-                <w:sz w:val="16"/>
-              </w:rPr>
-              <w:t>С011325240755337</w:t>
-            </w:r>
-          </w:p>
-        </w:tc>
-        <w:tc>
-          <w:tcPr>
-            <w:tcW w:w="6430" w:type="dxa"/>
-            <w:tcBorders>
-              <w:top w:val="single" w:sz="4" w:space="0" w:color="7E7E7E"/>
-              <w:bottom w:val="single" w:sz="4" w:space="0" w:color="7E7E7E"/>
-            </w:tcBorders>
-          </w:tcPr>
-          <w:p>
-            <w:pPr>
-              <w:pStyle w:val="TableParagraph"/>
-              <w:spacing w:before="54"/>
-              <w:ind w:left="193" w:firstLine="196"/>
-              <w:rPr>
-                <w:sz w:val="16"/>
-              </w:rPr>
-            </w:pPr>
-            <w:r>
-              <w:rPr>
-                <w:spacing w:val="-2"/>
-                <w:sz w:val="16"/>
-              </w:rPr>
-              <w:t xml:space="preserve">Перевод   JSC*KWIKPAY </w:t>
-            </w:r>
-            <w:proofErr w:type="spellStart"/>
-            <w:r>
-              <w:rPr>
-                <w:spacing w:val="-2"/>
-                <w:sz w:val="16"/>
-              </w:rPr>
-              <w:t>online</w:t>
-            </w:r>
-            <w:proofErr w:type="spellEnd"/>
-            <w:r>
-              <w:rPr>
-                <w:spacing w:val="-2"/>
-                <w:sz w:val="16"/>
-              </w:rPr>
-              <w:t>.</w:t>
-            </w:r>
-          </w:p>
-        </w:tc>
-        <w:tc>
-          <w:tcPr>
-            <w:tcW w:w="1472" w:type="dxa"/>
-            <w:gridSpan w:val="2"/>
-            <w:tcBorders>
-              <w:top w:val="single" w:sz="4" w:space="0" w:color="7E7E7E"/>
-              <w:bottom w:val="single" w:sz="4" w:space="0" w:color="7E7E7E"/>
-            </w:tcBorders>
-          </w:tcPr>
-          <w:p>
-            <w:pPr>
-              <w:pStyle w:val="TableParagraph"/>
-              <w:spacing w:before="54"/>
-              <w:ind w:right="1"/>
-              <w:jc w:val="right"/>
-              <w:rPr>
-                <w:sz w:val="16"/>
-              </w:rPr>
-            </w:pPr>
-            <w:r>
-              <w:rPr>
-                <w:sz w:val="16"/>
-              </w:rPr>
-              <w:t>-281 200,18</w:t>
-            </w:r>
-            <w:r>
-              <w:rPr>
-                <w:spacing w:val="-3"/>
-                <w:sz w:val="16"/>
-              </w:rPr>
-              <w:t xml:space="preserve"> </w:t>
-            </w:r>
-            <w:r>
-              <w:rPr>
-                <w:spacing w:val="-5"/>
-                <w:sz w:val="16"/>
-              </w:rPr>
-              <w:t>RUR</w:t>
+              <w:t xml:space="preserve">__TX_AMOUNT__</w:t>
             </w:r>
           </w:p>
         </w:tc>

</xml_diff>

<commit_message>
Pack 16.4: fix bank statement — balance fields, multi-line description, remove gap before signature
</commit_message>
<xml_diff>
--- a/templates/docx/bank_statement_template.docx
+++ b/templates/docx/bank_statement_template.docx
@@ -1150,64 +1150,9 @@
         <w:ind w:left="5812"/>
       </w:pPr>
       <w:r>
-        <w:t>Входящий</w:t>
-      </w:r>
-      <w:r>
-        <w:rPr>
-          <w:spacing w:val="-6"/>
-        </w:rPr>
-        <w:t xml:space="preserve"> </w:t>
-      </w:r>
-      <w:r>
-        <w:rPr>
-          <w:spacing w:val="-2"/>
-        </w:rPr>
-        <w:t>остаток</w:t>
-      </w:r>
-      <w:r>
-        <w:rPr>
-          <w:spacing w:val="-2"/>
-        </w:rPr>
-        <w:t xml:space="preserve">                                                              </w:t>
-      </w:r>
-      <w:r>
-        <w:rPr>
-          <w:spacing w:val="-2"/>
-        </w:rPr>
-        <w:t xml:space="preserve"> </w:t>
-      </w:r>
-      <w:r>
-        <w:rPr>
-          <w:spacing w:val="-2"/>
-        </w:rPr>
-        <w:t>301</w:t>
-      </w:r>
-      <w:r>
-        <w:rPr>
-          <w:spacing w:val="-2"/>
-        </w:rPr>
-        <w:t xml:space="preserve"> </w:t>
-      </w:r>
-      <w:r>
-        <w:rPr>
-          <w:spacing w:val="-2"/>
-        </w:rPr>
-        <w:t>018</w:t>
-      </w:r>
-      <w:r>
-        <w:t>,</w:t>
-      </w:r>
-      <w:r>
-        <w:t>66</w:t>
-      </w:r>
-      <w:r>
-        <w:t xml:space="preserve"> </w:t>
-      </w:r>
-      <w:r>
-        <w:rPr>
-          <w:spacing w:val="-5"/>
-        </w:rPr>
-        <w:t>RUR</w:t>
+        <w:t xml:space="preserve">Входящий остаток</w:t>
+        <w:tab/>
+        <w:t xml:space="preserve">{{ bank.opening_balance_formatted }}</w:t>
       </w:r>
     </w:p>
     <w:p>
@@ -1320,46 +1265,9 @@
         <w:rPr>
           <w:spacing w:val="-2"/>
         </w:rPr>
-        <w:t>Поступления</w:t>
-      </w:r>
-      <w:r>
+        <w:t xml:space="preserve">Поступления</w:t>
         <w:tab/>
-      </w:r>
-      <w:r>
-        <w:t xml:space="preserve">   </w:t>
-      </w:r>
-      <w:r>
-        <w:t>9</w:t>
-      </w:r>
-      <w:r>
-        <w:t>00</w:t>
-      </w:r>
-      <w:r>
-        <w:t xml:space="preserve"> </w:t>
-      </w:r>
-      <w:r>
-        <w:t>0</w:t>
-      </w:r>
-      <w:r>
-        <w:t>0</w:t>
-      </w:r>
-      <w:r>
-        <w:t>0</w:t>
-      </w:r>
-      <w:r>
-        <w:t>,00</w:t>
-      </w:r>
-      <w:r>
-        <w:rPr>
-          <w:spacing w:val="-1"/>
-        </w:rPr>
-        <w:t xml:space="preserve"> </w:t>
-      </w:r>
-      <w:r>
-        <w:rPr>
-          <w:spacing w:val="-5"/>
-        </w:rPr>
-        <w:t>RUR</w:t>
+        <w:t xml:space="preserve">{{ bank.total_income_formatted }}</w:t>
       </w:r>
     </w:p>
     <w:p>
@@ -1472,7 +1380,6 @@
         <w:rPr>
           <w:spacing w:val="-2"/>
         </w:rPr>
-        <w:tab/>
         <w:t xml:space="preserve">Расходы</w:t>
         <w:tab/>
         <w:t xml:space="preserve">{{ bank.total_expense_formatted }}</w:t>
@@ -1587,49 +1494,9 @@
         <w:ind w:left="5812" w:right="139"/>
       </w:pPr>
       <w:r>
-        <w:t>Исходящий остаток</w:t>
-      </w:r>
-      <w:r>
-        <w:t xml:space="preserve">                          </w:t>
-      </w:r>
-      <w:r>
-        <w:t xml:space="preserve">                </w:t>
-      </w:r>
-      <w:r>
-        <w:t xml:space="preserve"> </w:t>
-      </w:r>
-      <w:r>
-        <w:t xml:space="preserve">      </w:t>
-      </w:r>
-      <w:r>
-        <w:t xml:space="preserve">  </w:t>
-      </w:r>
-      <w:r>
-        <w:t xml:space="preserve">      </w:t>
-      </w:r>
-      <w:r>
-        <w:t xml:space="preserve">  29</w:t>
-      </w:r>
-      <w:r>
-        <w:t xml:space="preserve"> </w:t>
-      </w:r>
-      <w:r>
-        <w:t>240</w:t>
-      </w:r>
-      <w:r>
-        <w:t>,</w:t>
-      </w:r>
-      <w:r>
-        <w:t>12</w:t>
-      </w:r>
-      <w:r>
-        <w:rPr>
-          <w:spacing w:val="-11"/>
-        </w:rPr>
-        <w:t xml:space="preserve"> </w:t>
-      </w:r>
-      <w:r>
-        <w:t xml:space="preserve">RUR </w:t>
+        <w:t xml:space="preserve">Исходящий остаток</w:t>
+        <w:tab/>
+        <w:t xml:space="preserve">{{ bank.closing_balance_formatted }}</w:t>
       </w:r>
     </w:p>
     <w:p>

</xml_diff>

<commit_message>
Pack 16.5: bank statement — surgical balance replacement, gray shading on income rows, auto row height
</commit_message>
<xml_diff>
--- a/templates/docx/bank_statement_template.docx
+++ b/templates/docx/bank_statement_template.docx
@@ -1150,9 +1150,31 @@
         <w:ind w:left="5812"/>
       </w:pPr>
       <w:r>
-        <w:t xml:space="preserve">Входящий остаток</w:t>
-        <w:tab/>
-        <w:t xml:space="preserve">{{ bank.opening_balance_formatted }}</w:t>
+        <w:t>Входящий</w:t>
+      </w:r>
+      <w:r>
+        <w:rPr>
+          <w:spacing w:val="-6"/>
+        </w:rPr>
+        <w:t xml:space="preserve"> </w:t>
+      </w:r>
+      <w:r>
+        <w:rPr>
+          <w:spacing w:val="-2"/>
+        </w:rPr>
+        <w:t>остаток</w:t>
+      </w:r>
+      <w:r>
+        <w:rPr>
+          <w:spacing w:val="-2"/>
+        </w:rPr>
+        <w:t xml:space="preserve">                                                              </w:t>
+      </w:r>
+      <w:r>
+        <w:rPr>
+          <w:spacing w:val="-5"/>
+        </w:rPr>
+        <w:t xml:space="preserve">{{ bank.opening_balance_formatted }} RUR</w:t>
       </w:r>
     </w:p>
     <w:p>
@@ -1265,9 +1287,19 @@
         <w:rPr>
           <w:spacing w:val="-2"/>
         </w:rPr>
-        <w:t xml:space="preserve">Поступления</w:t>
+        <w:t>Поступления</w:t>
+      </w:r>
+      <w:r>
         <w:tab/>
-        <w:t xml:space="preserve">{{ bank.total_income_formatted }}</w:t>
+      </w:r>
+      <w:r>
+        <w:t xml:space="preserve">   </w:t>
+      </w:r>
+      <w:r>
+        <w:rPr>
+          <w:spacing w:val="-5"/>
+        </w:rPr>
+        <w:t xml:space="preserve">{{ bank.total_income_formatted }} RUR</w:t>
       </w:r>
     </w:p>
     <w:p>
@@ -1380,9 +1412,16 @@
         <w:rPr>
           <w:spacing w:val="-2"/>
         </w:rPr>
-        <w:t xml:space="preserve">Расходы</w:t>
+        <w:t>Расходы</w:t>
+      </w:r>
+      <w:r>
         <w:tab/>
-        <w:t xml:space="preserve">{{ bank.total_expense_formatted }}</w:t>
+      </w:r>
+      <w:r>
+        <w:rPr>
+          <w:spacing w:val="-5"/>
+        </w:rPr>
+        <w:t xml:space="preserve">{{ bank.total_expense_formatted }} RUR</w:t>
       </w:r>
     </w:p>
     <w:p>
@@ -1494,9 +1533,28 @@
         <w:ind w:left="5812" w:right="139"/>
       </w:pPr>
       <w:r>
-        <w:t xml:space="preserve">Исходящий остаток</w:t>
-        <w:tab/>
-        <w:t xml:space="preserve">{{ bank.closing_balance_formatted }}</w:t>
+        <w:t>Исходящий остаток</w:t>
+      </w:r>
+      <w:r>
+        <w:t xml:space="preserve">                          </w:t>
+      </w:r>
+      <w:r>
+        <w:t xml:space="preserve">                </w:t>
+      </w:r>
+      <w:r>
+        <w:t xml:space="preserve"> </w:t>
+      </w:r>
+      <w:r>
+        <w:t xml:space="preserve">      </w:t>
+      </w:r>
+      <w:r>
+        <w:t xml:space="preserve">  </w:t>
+      </w:r>
+      <w:r>
+        <w:t xml:space="preserve">      </w:t>
+      </w:r>
+      <w:r>
+        <w:t xml:space="preserve">{{ bank.closing_balance_formatted }} RUR</w:t>
       </w:r>
     </w:p>
     <w:p>
@@ -1804,9 +1862,7 @@
         </w:tc>
       </w:tr>
       <w:tr>
-        <w:trPr>
-          <w:trHeight w:val="442"/>
-        </w:trPr>
+        <w:trPr/>
         <w:tc>
           <w:tcPr>
             <w:tcW w:w="1239" w:type="dxa"/>

</xml_diff>

<commit_message>
Pack 16.5: bank statement — fix double RUR, cantSplit on rows
</commit_message>
<xml_diff>
--- a/templates/docx/bank_statement_template.docx
+++ b/templates/docx/bank_statement_template.docx
@@ -1174,7 +1174,7 @@
         <w:rPr>
           <w:spacing w:val="-5"/>
         </w:rPr>
-        <w:t xml:space="preserve">{{ bank.opening_balance_formatted }} RUR</w:t>
+        <w:t xml:space="preserve">{{ bank.opening_balance_formatted }}</w:t>
       </w:r>
     </w:p>
     <w:p>
@@ -1299,7 +1299,7 @@
         <w:rPr>
           <w:spacing w:val="-5"/>
         </w:rPr>
-        <w:t xml:space="preserve">{{ bank.total_income_formatted }} RUR</w:t>
+        <w:t xml:space="preserve">{{ bank.total_income_formatted }}</w:t>
       </w:r>
     </w:p>
     <w:p>
@@ -1421,7 +1421,7 @@
         <w:rPr>
           <w:spacing w:val="-5"/>
         </w:rPr>
-        <w:t xml:space="preserve">{{ bank.total_expense_formatted }} RUR</w:t>
+        <w:t xml:space="preserve">{{ bank.total_expense_formatted }}</w:t>
       </w:r>
     </w:p>
     <w:p>
@@ -1554,7 +1554,7 @@
         <w:t xml:space="preserve">      </w:t>
       </w:r>
       <w:r>
-        <w:t xml:space="preserve">{{ bank.closing_balance_formatted }} RUR</w:t>
+        <w:t xml:space="preserve">{{ bank.closing_balance_formatted }}</w:t>
       </w:r>
     </w:p>
     <w:p>

</xml_diff>

<commit_message>
Pack 16.5 final: orphan control on last operation row, fix None in address
</commit_message>
<xml_diff>
--- a/templates/docx/bank_statement_template.docx
+++ b/templates/docx/bank_statement_template.docx
@@ -1862,7 +1862,9 @@
         </w:tc>
       </w:tr>
       <w:tr>
-        <w:trPr/>
+        <w:trPr>
+          <w:trHeight w:val="442" w:hRule="auto"/>
+        </w:trPr>
         <w:tc>
           <w:tcPr>
             <w:tcW w:w="1239" w:type="dxa"/>

</xml_diff>

<commit_message>
Pack 16.5 final: orphan control + fix None in address + enlarge client info textbox
</commit_message>
<xml_diff>
--- a/templates/docx/bank_statement_template.docx
+++ b/templates/docx/bank_statement_template.docx
@@ -65,7 +65,7 @@
                 <wp:positionV relativeFrom="paragraph">
                   <wp:posOffset>67310</wp:posOffset>
                 </wp:positionV>
-                <wp:extent cx="3252470" cy="1714500"/>
+                <wp:extent cx="3252470" cy="2700000"/>
                 <wp:effectExtent l="0" t="0" r="5080" b="0"/>
                 <wp:wrapNone/>
                 <wp:docPr id="5" name="Group 5"/>
@@ -81,7 +81,7 @@
                       <wpg:grpSpPr>
                         <a:xfrm>
                           <a:off x="0" y="0"/>
-                          <a:ext cx="3252470" cy="1714500"/>
+                          <a:ext cx="3252470" cy="2700000"/>
                           <a:chOff x="0" y="0"/>
                           <a:chExt cx="3253104" cy="1598930"/>
                         </a:xfrm>
@@ -565,7 +565,7 @@
           <mc:Fallback>
             <w:pict>
               <v:group w14:anchorId="1A6F9CA8" id="Group 5" o:spid="_x0000_s1026" style="position:absolute;margin-left:28.8pt;margin-top:5.3pt;width:256.1pt;height:135pt;z-index:15732224;mso-wrap-distance-left:0;mso-wrap-distance-right:0;mso-position-horizontal-relative:page;mso-height-relative:margin" coordsize="32531,15989" o:gfxdata="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">
-                <v:shape id="Graphic 6" o:spid="_x0000_s1027" style="position:absolute;width:32531;height:15989;visibility:visible;mso-wrap-style:square;v-text-anchor:top" coordsize="3253104,1598930" o:gfxdata="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" path="m3253105,r-12700,l3240405,12700r,1573466l12700,1586166r,-1573466l3240405,12700r,-12700l,,,12700,,1586166r,12700l12700,1598866r3227705,l3253105,1598866r,-12700l3253105,12700r,-12688l3253105,xe" fillcolor="#7f7f7f" stroked="f">
+                <v:shape id="Graphic 6" o:spid="_x0000_s1027" style="position:absolute;width:32531;height:25000;visibility:visible;mso-wrap-style:square;v-text-anchor:top" coordsize="3253104,2500000" o:gfxdata="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" path="m3253105,r-12700,l3240405,12700r,1573466l12700,1586166r,-1573466l3240405,12700r,-12700l,,,12700,,1586166r,12700l12700,1598866r3227705,l3253105,1598866r,-12700l3253105,12700r,-12688l3253105,xe" fillcolor="#7f7f7f" stroked="f">
                   <v:path arrowok="t"/>
                 </v:shape>
                 <v:shapetype id="_x0000_t202" coordsize="21600,21600" o:spt="202" path="m,l,21600r21600,l21600,xe">
@@ -846,7 +846,7 @@
                     </w:txbxContent>
                   </v:textbox>
                 </v:shape>
-                <v:shape id="Textbox 9" o:spid="_x0000_s1030" type="#_x0000_t202" style="position:absolute;left:13718;top:8866;width:18216;height:6696;visibility:visible;mso-wrap-style:square;v-text-anchor:top" o:gfxdata="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" filled="f" stroked="f">
+                <v:shape id="Textbox 9" o:spid="_x0000_s1030" type="#_x0000_t202" style="position:absolute;left:13718;top:8866;width:18216;height:16000;visibility:visible;mso-wrap-style:square;v-text-anchor:top" o:gfxdata="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" filled="f" stroked="f">
                   <v:textbox inset="0,0,0,0">
                     <w:txbxContent>
                       <w:p>

</xml_diff>

<commit_message>
Pack 16.5 final: address abbreviation per Минфин 171н — fits long addresses in textbox
</commit_message>
<xml_diff>
--- a/templates/docx/bank_statement_template.docx
+++ b/templates/docx/bank_statement_template.docx
@@ -65,7 +65,7 @@
                 <wp:positionV relativeFrom="paragraph">
                   <wp:posOffset>67310</wp:posOffset>
                 </wp:positionV>
-                <wp:extent cx="3252470" cy="2700000"/>
+                <wp:extent cx="3252470" cy="1714500"/>
                 <wp:effectExtent l="0" t="0" r="5080" b="0"/>
                 <wp:wrapNone/>
                 <wp:docPr id="5" name="Group 5"/>
@@ -81,7 +81,7 @@
                       <wpg:grpSpPr>
                         <a:xfrm>
                           <a:off x="0" y="0"/>
-                          <a:ext cx="3252470" cy="2700000"/>
+                          <a:ext cx="3252470" cy="1714500"/>
                           <a:chOff x="0" y="0"/>
                           <a:chExt cx="3253104" cy="1598930"/>
                         </a:xfrm>
@@ -565,7 +565,7 @@
           <mc:Fallback>
             <w:pict>
               <v:group w14:anchorId="1A6F9CA8" id="Group 5" o:spid="_x0000_s1026" style="position:absolute;margin-left:28.8pt;margin-top:5.3pt;width:256.1pt;height:135pt;z-index:15732224;mso-wrap-distance-left:0;mso-wrap-distance-right:0;mso-position-horizontal-relative:page;mso-height-relative:margin" coordsize="32531,15989" o:gfxdata="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">
-                <v:shape id="Graphic 6" o:spid="_x0000_s1027" style="position:absolute;width:32531;height:25000;visibility:visible;mso-wrap-style:square;v-text-anchor:top" coordsize="3253104,2500000" o:gfxdata="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" path="m3253105,r-12700,l3240405,12700r,1573466l12700,1586166r,-1573466l3240405,12700r,-12700l,,,12700,,1586166r,12700l12700,1598866r3227705,l3253105,1598866r,-12700l3253105,12700r,-12688l3253105,xe" fillcolor="#7f7f7f" stroked="f">
+                <v:shape id="Graphic 6" o:spid="_x0000_s1027" style="position:absolute;width:32531;height:15989;visibility:visible;mso-wrap-style:square;v-text-anchor:top" coordsize="3253104,1598930" o:gfxdata="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" path="m3253105,r-12700,l3240405,12700r,1573466l12700,1586166r,-1573466l3240405,12700r,-12700l,,,12700,,1586166r,12700l12700,1598866r3227705,l3253105,1598866r,-12700l3253105,12700r,-12688l3253105,xe" fillcolor="#7f7f7f" stroked="f">
                   <v:path arrowok="t"/>
                 </v:shape>
                 <v:shapetype id="_x0000_t202" coordsize="21600,21600" o:spt="202" path="m,l,21600r21600,l21600,xe">
@@ -846,7 +846,7 @@
                     </w:txbxContent>
                   </v:textbox>
                 </v:shape>
-                <v:shape id="Textbox 9" o:spid="_x0000_s1030" type="#_x0000_t202" style="position:absolute;left:13718;top:8866;width:18216;height:16000;visibility:visible;mso-wrap-style:square;v-text-anchor:top" o:gfxdata="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" filled="f" stroked="f">
+                <v:shape id="Textbox 9" o:spid="_x0000_s1030" type="#_x0000_t202" style="position:absolute;left:13718;top:8866;width:18216;height:6696;visibility:visible;mso-wrap-style:square;v-text-anchor:top" o:gfxdata="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" filled="f" stroked="f">
                   <v:textbox inset="0,0,0,0">
                     <w:txbxContent>
                       <w:p>
@@ -1143,10 +1143,10 @@
     <w:p>
       <w:pPr>
         <w:pStyle w:val="a3"/>
+        <w:tabs>
+          <w:tab w:val="left" w:pos="9812"/>
+        </w:tabs>
         <w:spacing w:before="44"/>
-        <w:tabs>
-          <w:tab w:val="right" w:pos="10921"/>
-        </w:tabs>
         <w:ind w:left="5812"/>
       </w:pPr>
       <w:r>
@@ -1165,7 +1165,10 @@
         <w:t>остаток</w:t>
       </w:r>
       <w:r>
-        <w:tab/>
+        <w:rPr>
+          <w:spacing w:val="-2"/>
+        </w:rPr>
+        <w:t xml:space="preserve">                                                              </w:t>
       </w:r>
       <w:r>
         <w:rPr>
@@ -1274,11 +1277,11 @@
     <w:p>
       <w:pPr>
         <w:pStyle w:val="a3"/>
+        <w:tabs>
+          <w:tab w:val="left" w:pos="9589"/>
+        </w:tabs>
         <w:spacing w:before="54"/>
-        <w:tabs>
-          <w:tab w:val="right" w:pos="10921"/>
-        </w:tabs>
-        <w:ind w:left="5812"/>
+        <w:ind w:left="5897"/>
       </w:pPr>
       <w:r>
         <w:rPr>
@@ -1288,6 +1291,9 @@
       </w:r>
       <w:r>
         <w:tab/>
+      </w:r>
+      <w:r>
+        <w:t xml:space="preserve">   </w:t>
       </w:r>
       <w:r>
         <w:rPr>
@@ -1396,11 +1402,11 @@
     <w:p>
       <w:pPr>
         <w:pStyle w:val="a3"/>
+        <w:tabs>
+          <w:tab w:val="left" w:pos="9589"/>
+        </w:tabs>
         <w:spacing w:before="54"/>
-        <w:tabs>
-          <w:tab w:val="right" w:pos="10921"/>
-        </w:tabs>
-        <w:ind w:left="5812"/>
+        <w:ind w:left="5897"/>
       </w:pPr>
       <w:r>
         <w:rPr>
@@ -1519,17 +1525,33 @@
     <w:p>
       <w:pPr>
         <w:pStyle w:val="a3"/>
+        <w:tabs>
+          <w:tab w:val="left" w:pos="9812"/>
+          <w:tab w:val="left" w:pos="10212"/>
+        </w:tabs>
         <w:spacing w:before="54" w:line="451" w:lineRule="auto"/>
-        <w:tabs>
-          <w:tab w:val="right" w:pos="10921"/>
-        </w:tabs>
-        <w:ind w:left="5812"/>
+        <w:ind w:left="5812" w:right="139"/>
       </w:pPr>
       <w:r>
         <w:t>Исходящий остаток</w:t>
       </w:r>
       <w:r>
-        <w:tab/>
+        <w:t xml:space="preserve">                          </w:t>
+      </w:r>
+      <w:r>
+        <w:t xml:space="preserve">                </w:t>
+      </w:r>
+      <w:r>
+        <w:t xml:space="preserve"> </w:t>
+      </w:r>
+      <w:r>
+        <w:t xml:space="preserve">      </w:t>
+      </w:r>
+      <w:r>
+        <w:t xml:space="preserve">  </w:t>
+      </w:r>
+      <w:r>
+        <w:t xml:space="preserve">      </w:t>
       </w:r>
       <w:r>
         <w:t xml:space="preserve">{{ bank.closing_balance_formatted }}</w:t>

</xml_diff>

<commit_message>
Pack 16.5 final: address abbreviation + unified right tab stop for balances
</commit_message>
<xml_diff>
--- a/templates/docx/bank_statement_template.docx
+++ b/templates/docx/bank_statement_template.docx
@@ -1143,10 +1143,10 @@
     <w:p>
       <w:pPr>
         <w:pStyle w:val="a3"/>
+        <w:spacing w:before="44"/>
         <w:tabs>
-          <w:tab w:val="left" w:pos="9812"/>
+          <w:tab w:val="right" w:pos="10921"/>
         </w:tabs>
-        <w:spacing w:before="44"/>
         <w:ind w:left="5812"/>
       </w:pPr>
       <w:r>
@@ -1165,10 +1165,7 @@
         <w:t>остаток</w:t>
       </w:r>
       <w:r>
-        <w:rPr>
-          <w:spacing w:val="-2"/>
-        </w:rPr>
-        <w:t xml:space="preserve">                                                              </w:t>
+        <w:tab/>
       </w:r>
       <w:r>
         <w:rPr>
@@ -1277,11 +1274,11 @@
     <w:p>
       <w:pPr>
         <w:pStyle w:val="a3"/>
+        <w:spacing w:before="54"/>
         <w:tabs>
-          <w:tab w:val="left" w:pos="9589"/>
+          <w:tab w:val="right" w:pos="10921"/>
         </w:tabs>
-        <w:spacing w:before="54"/>
-        <w:ind w:left="5897"/>
+        <w:ind w:left="5812"/>
       </w:pPr>
       <w:r>
         <w:rPr>
@@ -1291,9 +1288,6 @@
       </w:r>
       <w:r>
         <w:tab/>
-      </w:r>
-      <w:r>
-        <w:t xml:space="preserve">   </w:t>
       </w:r>
       <w:r>
         <w:rPr>
@@ -1402,11 +1396,11 @@
     <w:p>
       <w:pPr>
         <w:pStyle w:val="a3"/>
+        <w:spacing w:before="54"/>
         <w:tabs>
-          <w:tab w:val="left" w:pos="9589"/>
+          <w:tab w:val="right" w:pos="10921"/>
         </w:tabs>
-        <w:spacing w:before="54"/>
-        <w:ind w:left="5897"/>
+        <w:ind w:left="5812"/>
       </w:pPr>
       <w:r>
         <w:rPr>
@@ -1525,33 +1519,17 @@
     <w:p>
       <w:pPr>
         <w:pStyle w:val="a3"/>
+        <w:spacing w:before="54" w:line="451" w:lineRule="auto"/>
         <w:tabs>
-          <w:tab w:val="left" w:pos="9812"/>
-          <w:tab w:val="left" w:pos="10212"/>
+          <w:tab w:val="right" w:pos="10921"/>
         </w:tabs>
-        <w:spacing w:before="54" w:line="451" w:lineRule="auto"/>
-        <w:ind w:left="5812" w:right="139"/>
+        <w:ind w:left="5812"/>
       </w:pPr>
       <w:r>
         <w:t>Исходящий остаток</w:t>
       </w:r>
       <w:r>
-        <w:t xml:space="preserve">                          </w:t>
-      </w:r>
-      <w:r>
-        <w:t xml:space="preserve">                </w:t>
-      </w:r>
-      <w:r>
-        <w:t xml:space="preserve"> </w:t>
-      </w:r>
-      <w:r>
-        <w:t xml:space="preserve">      </w:t>
-      </w:r>
-      <w:r>
-        <w:t xml:space="preserve">  </w:t>
-      </w:r>
-      <w:r>
-        <w:t xml:space="preserve">      </w:t>
+        <w:tab/>
       </w:r>
       <w:r>
         <w:t xml:space="preserve">{{ bank.closing_balance_formatted }}</w:t>

</xml_diff>

<commit_message>
Pack 25.0: fix bank statement regression (Aliev row spacing/borders + bold income amounts)
</commit_message>
<xml_diff>
--- a/templates/docx/bank_statement_template.docx
+++ b/templates/docx/bank_statement_template.docx
@@ -1841,20 +1841,19 @@
       </w:tr>
       <w:tr>
         <w:trPr>
-          <w:trHeight w:val="442" w:hRule="auto"/>
+          <w:trHeight w:val="442"/>
         </w:trPr>
         <w:tc>
           <w:tcPr>
             <w:tcW w:w="1239" w:type="dxa"/>
             <w:tcBorders>
               <w:top w:val="single" w:sz="4" w:space="0" w:color="7E7E7E"/>
-              <w:bottom w:val="single" w:sz="4" w:space="0" w:color="7E7E7E"/>
             </w:tcBorders>
           </w:tcPr>
           <w:p>
             <w:pPr>
               <w:pStyle w:val="TableParagraph"/>
-              <w:spacing w:before="54"/>
+              <w:spacing w:before="40" w:after="40"/>
               <w:rPr>
                 <w:spacing w:val="-2"/>
                 <w:sz w:val="16"/>
@@ -1874,13 +1873,12 @@
             <w:tcW w:w="1789" w:type="dxa"/>
             <w:tcBorders>
               <w:top w:val="single" w:sz="4" w:space="0" w:color="7E7E7E"/>
-              <w:bottom w:val="single" w:sz="4" w:space="0" w:color="7E7E7E"/>
             </w:tcBorders>
           </w:tcPr>
           <w:p>
             <w:pPr>
               <w:pStyle w:val="TableParagraph"/>
-              <w:spacing w:before="54"/>
+              <w:spacing w:before="40" w:after="40"/>
               <w:ind w:left="144"/>
               <w:rPr>
                 <w:spacing w:val="-2"/>
@@ -1901,7 +1899,6 @@
             <w:tcW w:w="6430" w:type="dxa"/>
             <w:tcBorders>
               <w:top w:val="single" w:sz="4" w:space="0" w:color="7E7E7E"/>
-              <w:bottom w:val="single" w:sz="4" w:space="0" w:color="7E7E7E"/>
             </w:tcBorders>
           </w:tcPr>
           <w:p>
@@ -1928,13 +1925,12 @@
             <w:gridSpan w:val="2"/>
             <w:tcBorders>
               <w:top w:val="single" w:sz="4" w:space="0" w:color="7E7E7E"/>
-              <w:bottom w:val="single" w:sz="4" w:space="0" w:color="7E7E7E"/>
             </w:tcBorders>
           </w:tcPr>
           <w:p>
             <w:pPr>
               <w:pStyle w:val="TableParagraph"/>
-              <w:spacing w:before="54"/>
+              <w:spacing w:before="40" w:after="40"/>
               <w:ind w:right="1"/>
               <w:jc w:val="right"/>
               <w:rPr>

</xml_diff>

<commit_message>
Pack 25.2: restore <w:bottom> in all cells (matches Aliev)
</commit_message>
<xml_diff>
--- a/templates/docx/bank_statement_template.docx
+++ b/templates/docx/bank_statement_template.docx
@@ -1848,6 +1848,7 @@
             <w:tcW w:w="1239" w:type="dxa"/>
             <w:tcBorders>
               <w:top w:val="single" w:sz="4" w:space="0" w:color="7E7E7E"/>
+              <w:bottom w:val="single" w:sz="4" w:space="0" w:color="7E7E7E"/>
             </w:tcBorders>
           </w:tcPr>
           <w:p>
@@ -1873,6 +1874,7 @@
             <w:tcW w:w="1789" w:type="dxa"/>
             <w:tcBorders>
               <w:top w:val="single" w:sz="4" w:space="0" w:color="7E7E7E"/>
+              <w:bottom w:val="single" w:sz="4" w:space="0" w:color="7E7E7E"/>
             </w:tcBorders>
           </w:tcPr>
           <w:p>
@@ -1899,6 +1901,7 @@
             <w:tcW w:w="6430" w:type="dxa"/>
             <w:tcBorders>
               <w:top w:val="single" w:sz="4" w:space="0" w:color="7E7E7E"/>
+              <w:bottom w:val="single" w:sz="4" w:space="0" w:color="7E7E7E"/>
             </w:tcBorders>
           </w:tcPr>
           <w:p>
@@ -1925,6 +1928,7 @@
             <w:gridSpan w:val="2"/>
             <w:tcBorders>
               <w:top w:val="single" w:sz="4" w:space="0" w:color="7E7E7E"/>
+              <w:bottom w:val="single" w:sz="4" w:space="0" w:color="7E7E7E"/>
             </w:tcBorders>
           </w:tcPr>
           <w:p>

</xml_diff>

<commit_message>
Pack 25.9: replace hardcoded period in bank statement header with placeholders
</commit_message>
<xml_diff>
--- a/templates/docx/bank_statement_template.docx
+++ b/templates/docx/bank_statement_template.docx
@@ -1,6 +1,6 @@
 
 <file path=word/document.xml><?xml version="1.0" encoding="utf-8"?>
-<w:document xmlns:wpc="http://schemas.microsoft.com/office/word/2010/wordprocessingCanvas" xmlns:cx="http://schemas.microsoft.com/office/drawing/2014/chartex" xmlns:cx1="http://schemas.microsoft.com/office/drawing/2015/9/8/chartex" xmlns:cx2="http://schemas.microsoft.com/office/drawing/2015/10/21/chartex" xmlns:cx3="http://schemas.microsoft.com/office/drawing/2016/5/9/chartex" xmlns:cx4="http://schemas.microsoft.com/office/drawing/2016/5/10/chartex" xmlns:cx5="http://schemas.microsoft.com/office/drawing/2016/5/11/chartex" xmlns:cx6="http://schemas.microsoft.com/office/drawing/2016/5/12/chartex" xmlns:cx7="http://schemas.microsoft.com/office/drawing/2016/5/13/chartex" xmlns:cx8="http://schemas.microsoft.com/office/drawing/2016/5/14/chartex" xmlns:mc="http://schemas.openxmlformats.org/markup-compatibility/2006" xmlns:aink="http://schemas.microsoft.com/office/drawing/2016/ink" xmlns:am3d="http://schemas.microsoft.com/office/drawing/2017/model3d" xmlns:o="urn:schemas-microsoft-com:office:office" xmlns:oel="http://schemas.microsoft.com/office/2019/extlst" xmlns:r="http://schemas.openxmlformats.org/officeDocument/2006/relationships" xmlns:m="http://schemas.openxmlformats.org/officeDocument/2006/math" xmlns:v="urn:schemas-microsoft-com:vml" xmlns:wp14="http://schemas.microsoft.com/office/word/2010/wordprocessingDrawing" xmlns:wp="http://schemas.openxmlformats.org/drawingml/2006/wordprocessingDrawing" xmlns:w10="urn:schemas-microsoft-com:office:word" xmlns:w="http://schemas.openxmlformats.org/wordprocessingml/2006/main" xmlns:w14="http://schemas.microsoft.com/office/word/2010/wordml" xmlns:w15="http://schemas.microsoft.com/office/word/2012/wordml" xmlns:w16cex="http://schemas.microsoft.com/office/word/2018/wordml/cex" xmlns:w16cid="http://schemas.microsoft.com/office/word/2016/wordml/cid" xmlns:w16="http://schemas.microsoft.com/office/word/2018/wordml" xmlns:w16du="http://schemas.microsoft.com/office/word/2023/wordml/word16du" xmlns:w16sdtdh="http://schemas.microsoft.com/office/word/2020/wordml/sdtdatahash" xmlns:w16sdtfl="http://schemas.microsoft.com/office/word/2024/wordml/sdtformatlock" xmlns:w16se="http://schemas.microsoft.com/office/word/2015/wordml/symex" xmlns:wpg="http://schemas.microsoft.com/office/word/2010/wordprocessingGroup" xmlns:wpi="http://schemas.microsoft.com/office/word/2010/wordprocessingInk" xmlns:wne="http://schemas.microsoft.com/office/word/2006/wordml" xmlns:wps="http://schemas.microsoft.com/office/word/2010/wordprocessingShape" mc:Ignorable="w14 w15 w16se w16cid w16 w16cex w16sdtdh w16sdtfl w16du wp14">
+<w:document xmlns:wpc="http://schemas.microsoft.com/office/word/2010/wordprocessingCanvas" xmlns:cx="http://schemas.microsoft.com/office/drawing/2014/chartex" xmlns:cx1="http://schemas.microsoft.com/office/drawing/2015/9/8/chartex" xmlns:cx2="http://schemas.microsoft.com/office/drawing/2015/10/21/chartex" xmlns:cx3="http://schemas.microsoft.com/office/drawing/2016/5/9/chartex" xmlns:cx4="http://schemas.microsoft.com/office/drawing/2016/5/10/chartex" xmlns:cx5="http://schemas.microsoft.com/office/drawing/2016/5/11/chartex" xmlns:cx6="http://schemas.microsoft.com/office/drawing/2016/5/12/chartex" xmlns:cx7="http://schemas.microsoft.com/office/drawing/2016/5/13/chartex" xmlns:cx8="http://schemas.microsoft.com/office/drawing/2016/5/14/chartex" xmlns:mc="http://schemas.openxmlformats.org/markup-compatibility/2006" xmlns:aink="http://schemas.microsoft.com/office/drawing/2016/ink" xmlns:am3d="http://schemas.microsoft.com/office/drawing/2017/model3d" xmlns:o="urn:schemas-microsoft-com:office:office" xmlns:r="http://schemas.openxmlformats.org/officeDocument/2006/relationships" xmlns:m="http://schemas.openxmlformats.org/officeDocument/2006/math" xmlns:v="urn:schemas-microsoft-com:vml" xmlns:wp14="http://schemas.microsoft.com/office/word/2010/wordprocessingDrawing" xmlns:wp="http://schemas.openxmlformats.org/drawingml/2006/wordprocessingDrawing" xmlns:w10="urn:schemas-microsoft-com:office:word" xmlns:w="http://schemas.openxmlformats.org/wordprocessingml/2006/main" xmlns:w14="http://schemas.microsoft.com/office/word/2010/wordml" xmlns:w15="http://schemas.microsoft.com/office/word/2012/wordml" xmlns:w16cid="http://schemas.microsoft.com/office/word/2016/wordml/cid" xmlns:w16se="http://schemas.microsoft.com/office/word/2015/wordml/symex" xmlns:wpg="http://schemas.microsoft.com/office/word/2010/wordprocessingGroup" xmlns:wpi="http://schemas.microsoft.com/office/word/2010/wordprocessingInk" xmlns:wne="http://schemas.microsoft.com/office/word/2006/wordml" xmlns:wps="http://schemas.microsoft.com/office/word/2010/wordprocessingShape" mc:Ignorable="w14 w15 w16se w16cid wp14">
   <w:body>
     <w:p>
       <w:pPr>
@@ -395,14 +395,16 @@
                                 <w:spacing w:before="36"/>
                                 <w:rPr>
                                   <w:sz w:val="16"/>
+                                  <w:lang w:val="en-US"/>
                                 </w:rPr>
                               </w:pPr>
                               <w:r>
                                 <w:rPr>
                                   <w:spacing w:val="-2"/>
                                   <w:sz w:val="16"/>
+                                  <w:lang w:val="en-US"/>
                                 </w:rPr>
-                                <w:t xml:space="preserve">{{ applicant.bank_account }} {{ bank.account_open_date_formatted }}</w:t>
+                                <w:t>{{ applicant.bank_account }} {{ bank.account_open_date_formatted }}</w:t>
                               </w:r>
                             </w:p>
                             <w:p>
@@ -410,12 +412,14 @@
                                 <w:spacing w:before="46"/>
                                 <w:rPr>
                                   <w:sz w:val="16"/>
+                                  <w:lang w:val="en-US"/>
                                 </w:rPr>
                               </w:pPr>
                               <w:r>
                                 <w:rPr>
                                   <w:spacing w:val="-5"/>
                                   <w:sz w:val="16"/>
+                                  <w:lang w:val="en-US"/>
                                 </w:rPr>
                                 <w:t>RUR</w:t>
                               </w:r>
@@ -427,6 +431,7 @@
                                 <w:rPr>
                                   <w:spacing w:val="-2"/>
                                   <w:sz w:val="16"/>
+                                  <w:lang w:val="en-US"/>
                                 </w:rPr>
                               </w:pPr>
                               <w:r>
@@ -440,6 +445,7 @@
                                 <w:rPr>
                                   <w:spacing w:val="-9"/>
                                   <w:sz w:val="16"/>
+                                  <w:lang w:val="en-US"/>
                                 </w:rPr>
                                 <w:t xml:space="preserve"> </w:t>
                               </w:r>
@@ -457,14 +463,16 @@
                                 <w:ind w:right="43"/>
                                 <w:rPr>
                                   <w:sz w:val="16"/>
+                                  <w:lang w:val="en-US"/>
                                 </w:rPr>
                               </w:pPr>
                               <w:r>
                                 <w:rPr>
                                   <w:spacing w:val="-2"/>
                                   <w:sz w:val="16"/>
+                                  <w:lang w:val="en-US"/>
                                 </w:rPr>
-                                <w:t xml:space="preserve">{{ bank.statement_date_formatted }}</w:t>
+                                <w:t>{{ bank.statement_date_formatted }}</w:t>
                               </w:r>
                             </w:p>
                           </w:txbxContent>
@@ -494,6 +502,7 @@
                                   <w:b/>
                                   <w:bCs/>
                                   <w:sz w:val="16"/>
+                                  <w:lang w:val="en-US"/>
                                 </w:rPr>
                               </w:pPr>
                               <w:r>
@@ -501,8 +510,9 @@
                                   <w:b/>
                                   <w:bCs/>
                                   <w:sz w:val="16"/>
+                                  <w:lang w:val="en-US"/>
                                 </w:rPr>
-                                <w:t xml:space="preserve">{{ applicant.full_name_native }}</w:t>
+                                <w:t>{{ applicant.full_name_native }}</w:t>
                               </w:r>
                             </w:p>
                             <w:p>
@@ -510,13 +520,21 @@
                                 <w:spacing w:before="60" w:after="60" w:line="178" w:lineRule="exact"/>
                                 <w:rPr>
                                   <w:sz w:val="16"/>
+                                  <w:lang w:val="en-US"/>
                                 </w:rPr>
                               </w:pPr>
                               <w:r>
                                 <w:rPr>
                                   <w:sz w:val="16"/>
                                 </w:rPr>
-                                <w:t xml:space="preserve">Паспорт {{ applicant.nationality }} {{ applicant.passport_number }}</w:t>
+                                <w:t>Паспорт</w:t>
+                              </w:r>
+                              <w:r>
+                                <w:rPr>
+                                  <w:sz w:val="16"/>
+                                  <w:lang w:val="en-US"/>
+                                </w:rPr>
+                                <w:t xml:space="preserve"> {{ applicant.nationality }} {{ applicant.passport_number }}</w:t>
                               </w:r>
                             </w:p>
                             <w:p>
@@ -524,13 +542,15 @@
                                 <w:spacing w:before="60" w:after="60" w:line="178" w:lineRule="exact"/>
                                 <w:rPr>
                                   <w:sz w:val="16"/>
+                                  <w:lang w:val="en-US"/>
                                 </w:rPr>
                               </w:pPr>
                               <w:r>
                                 <w:rPr>
                                   <w:sz w:val="16"/>
+                                  <w:lang w:val="en-US"/>
                                 </w:rPr>
-                                <w:t xml:space="preserve">{{ applicant.home_address_line1 }}</w:t>
+                                <w:t>{{ applicant.home_address_line1 }}</w:t>
                               </w:r>
                             </w:p>
                             <w:p>
@@ -538,13 +558,15 @@
                                 <w:spacing w:before="60" w:after="60" w:line="178" w:lineRule="exact"/>
                                 <w:rPr>
                                   <w:sz w:val="16"/>
+                                  <w:lang w:val="en-US"/>
                                 </w:rPr>
                               </w:pPr>
                               <w:r>
                                 <w:rPr>
                                   <w:sz w:val="16"/>
+                                  <w:lang w:val="en-US"/>
                                 </w:rPr>
-                                <w:t xml:space="preserve">{{ applicant.home_address_line2 }}</w:t>
+                                <w:t>{{ applicant.home_address_line2 }}</w:t>
                               </w:r>
                             </w:p>
                           </w:txbxContent>
@@ -564,7 +586,7 @@
           </mc:Choice>
           <mc:Fallback>
             <w:pict>
-              <v:group w14:anchorId="1A6F9CA8" id="Group 5" o:spid="_x0000_s1026" style="position:absolute;margin-left:28.8pt;margin-top:5.3pt;width:256.1pt;height:135pt;z-index:15732224;mso-wrap-distance-left:0;mso-wrap-distance-right:0;mso-position-horizontal-relative:page;mso-height-relative:margin" coordsize="32531,15989" o:gfxdata="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">
+              <v:group w14:anchorId="1A6F9CA8" id="Group 5" o:spid="_x0000_s1026" style="position:absolute;margin-left:28.8pt;margin-top:5.3pt;width:256.1pt;height:135pt;z-index:15732224;mso-wrap-distance-left:0;mso-wrap-distance-right:0;mso-position-horizontal-relative:page;mso-height-relative:margin" coordsize="32531,15989" o:gfxdata="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">
                 <v:shape id="Graphic 6" o:spid="_x0000_s1027" style="position:absolute;width:32531;height:15989;visibility:visible;mso-wrap-style:square;v-text-anchor:top" coordsize="3253104,1598930" o:gfxdata="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" path="m3253105,r-12700,l3240405,12700r,1573466l12700,1586166r,-1573466l3240405,12700r,-12700l,,,12700,,1586166r,12700l12700,1598866r3227705,l3253105,1598866r,-12700l3253105,12700r,-12688l3253105,xe" fillcolor="#7f7f7f" stroked="f">
                   <v:path arrowok="t"/>
                 </v:shape>
@@ -771,14 +793,16 @@
                           <w:spacing w:before="36"/>
                           <w:rPr>
                             <w:sz w:val="16"/>
+                            <w:lang w:val="en-US"/>
                           </w:rPr>
                         </w:pPr>
                         <w:r>
                           <w:rPr>
                             <w:spacing w:val="-2"/>
                             <w:sz w:val="16"/>
+                            <w:lang w:val="en-US"/>
                           </w:rPr>
-                          <w:t xml:space="preserve">{{ applicant.bank_account }} {{ bank.account_open_date_formatted }}</w:t>
+                          <w:t>{{ applicant.bank_account }} {{ bank.account_open_date_formatted }}</w:t>
                         </w:r>
                       </w:p>
                       <w:p>
@@ -786,12 +810,14 @@
                           <w:spacing w:before="46"/>
                           <w:rPr>
                             <w:sz w:val="16"/>
+                            <w:lang w:val="en-US"/>
                           </w:rPr>
                         </w:pPr>
                         <w:r>
                           <w:rPr>
                             <w:spacing w:val="-5"/>
                             <w:sz w:val="16"/>
+                            <w:lang w:val="en-US"/>
                           </w:rPr>
                           <w:t>RUR</w:t>
                         </w:r>
@@ -803,6 +829,7 @@
                           <w:rPr>
                             <w:spacing w:val="-2"/>
                             <w:sz w:val="16"/>
+                            <w:lang w:val="en-US"/>
                           </w:rPr>
                         </w:pPr>
                         <w:r>
@@ -816,6 +843,7 @@
                           <w:rPr>
                             <w:spacing w:val="-9"/>
                             <w:sz w:val="16"/>
+                            <w:lang w:val="en-US"/>
                           </w:rPr>
                           <w:t xml:space="preserve"> </w:t>
                         </w:r>
@@ -833,14 +861,16 @@
                           <w:ind w:right="43"/>
                           <w:rPr>
                             <w:sz w:val="16"/>
+                            <w:lang w:val="en-US"/>
                           </w:rPr>
                         </w:pPr>
                         <w:r>
                           <w:rPr>
                             <w:spacing w:val="-2"/>
                             <w:sz w:val="16"/>
+                            <w:lang w:val="en-US"/>
                           </w:rPr>
-                          <w:t xml:space="preserve">{{ bank.statement_date_formatted }}</w:t>
+                          <w:t>{{ bank.statement_date_formatted }}</w:t>
                         </w:r>
                       </w:p>
                     </w:txbxContent>
@@ -856,6 +886,7 @@
                             <w:b/>
                             <w:bCs/>
                             <w:sz w:val="16"/>
+                            <w:lang w:val="en-US"/>
                           </w:rPr>
                         </w:pPr>
                         <w:r>
@@ -863,8 +894,9 @@
                             <w:b/>
                             <w:bCs/>
                             <w:sz w:val="16"/>
+                            <w:lang w:val="en-US"/>
                           </w:rPr>
-                          <w:t xml:space="preserve">{{ applicant.full_name_native }}</w:t>
+                          <w:t>{{ applicant.full_name_native }}</w:t>
                         </w:r>
                       </w:p>
                       <w:p>
@@ -872,13 +904,21 @@
                           <w:spacing w:before="60" w:after="60" w:line="178" w:lineRule="exact"/>
                           <w:rPr>
                             <w:sz w:val="16"/>
+                            <w:lang w:val="en-US"/>
                           </w:rPr>
                         </w:pPr>
                         <w:r>
                           <w:rPr>
                             <w:sz w:val="16"/>
                           </w:rPr>
-                          <w:t xml:space="preserve">Паспорт {{ applicant.nationality }} {{ applicant.passport_number }}</w:t>
+                          <w:t>Паспорт</w:t>
+                        </w:r>
+                        <w:r>
+                          <w:rPr>
+                            <w:sz w:val="16"/>
+                            <w:lang w:val="en-US"/>
+                          </w:rPr>
+                          <w:t xml:space="preserve"> {{ applicant.nationality }} {{ applicant.passport_number }}</w:t>
                         </w:r>
                       </w:p>
                       <w:p>
@@ -886,13 +926,15 @@
                           <w:spacing w:before="60" w:after="60" w:line="178" w:lineRule="exact"/>
                           <w:rPr>
                             <w:sz w:val="16"/>
+                            <w:lang w:val="en-US"/>
                           </w:rPr>
                         </w:pPr>
                         <w:r>
                           <w:rPr>
                             <w:sz w:val="16"/>
+                            <w:lang w:val="en-US"/>
                           </w:rPr>
-                          <w:t xml:space="preserve">{{ applicant.home_address_line1 }}</w:t>
+                          <w:t>{{ applicant.home_address_line1 }}</w:t>
                         </w:r>
                       </w:p>
                       <w:p>
@@ -900,13 +942,15 @@
                           <w:spacing w:before="60" w:after="60" w:line="178" w:lineRule="exact"/>
                           <w:rPr>
                             <w:sz w:val="16"/>
+                            <w:lang w:val="en-US"/>
                           </w:rPr>
                         </w:pPr>
                         <w:r>
                           <w:rPr>
                             <w:sz w:val="16"/>
+                            <w:lang w:val="en-US"/>
                           </w:rPr>
-                          <w:t xml:space="preserve">{{ applicant.home_address_line2 }}</w:t>
+                          <w:t>{{ applicant.home_address_line2 }}</w:t>
                         </w:r>
                       </w:p>
                     </w:txbxContent>
@@ -924,6 +968,9 @@
         <w:pStyle w:val="a3"/>
         <w:spacing w:after="60"/>
         <w:ind w:left="5812"/>
+        <w:rPr>
+          <w:lang w:val="en-US"/>
+        </w:rPr>
       </w:pPr>
       <w:r>
         <w:t>За</w:t>
@@ -931,6 +978,7 @@
       <w:r>
         <w:rPr>
           <w:spacing w:val="-6"/>
+          <w:lang w:val="en-US"/>
         </w:rPr>
         <w:t xml:space="preserve"> </w:t>
       </w:r>
@@ -940,6 +988,7 @@
       <w:r>
         <w:rPr>
           <w:spacing w:val="-5"/>
+          <w:lang w:val="en-US"/>
         </w:rPr>
         <w:t xml:space="preserve"> </w:t>
       </w:r>
@@ -950,91 +999,83 @@
       <w:r>
         <w:rPr>
           <w:spacing w:val="-5"/>
+          <w:lang w:val="en-US"/>
         </w:rPr>
         <w:t xml:space="preserve"> </w:t>
       </w:r>
       <w:r>
         <w:rPr>
           <w:spacing w:val="-5"/>
+          <w:lang w:val="en-US"/>
         </w:rPr>
         <w:t xml:space="preserve"> </w:t>
       </w:r>
       <w:r>
         <w:rPr>
+          <w:lang w:val="en-US"/>
+        </w:rPr>
+        <w:t>{</w:t>
+      </w:r>
+      <w:proofErr w:type="gramEnd"/>
+      <w:r>
+        <w:rPr>
+          <w:lang w:val="en-US"/>
+        </w:rPr>
+        <w:t xml:space="preserve">{ </w:t>
+      </w:r>
+      <w:proofErr w:type="spellStart"/>
+      <w:r>
+        <w:rPr>
+          <w:lang w:val="en-US"/>
+        </w:rPr>
+        <w:t>bank.period_start_formatted</w:t>
+      </w:r>
+      <w:proofErr w:type="spellEnd"/>
+      <w:r>
+        <w:rPr>
+          <w:lang w:val="en-US"/>
+        </w:rPr>
+        <w:t xml:space="preserve"> }}</w:t>
+      </w:r>
+      <w:r>
+        <w:rPr>
           <w:spacing w:val="-5"/>
-        </w:rPr>
-        <w:t>20</w:t>
-      </w:r>
-      <w:r>
-        <w:t>.</w:t>
-      </w:r>
-      <w:r>
-        <w:t>01</w:t>
-      </w:r>
-      <w:r>
-        <w:t>.202</w:t>
-      </w:r>
-      <w:r>
-        <w:t>6</w:t>
-      </w:r>
-      <w:proofErr w:type="gramEnd"/>
+          <w:lang w:val="en-US"/>
+        </w:rPr>
+        <w:t xml:space="preserve"> </w:t>
+      </w:r>
+      <w:r>
+        <w:t>по</w:t>
+      </w:r>
       <w:r>
         <w:rPr>
           <w:spacing w:val="-5"/>
+          <w:lang w:val="en-US"/>
         </w:rPr>
         <w:t xml:space="preserve"> </w:t>
       </w:r>
       <w:r>
-        <w:t>по</w:t>
-      </w:r>
-      <w:r>
-        <w:rPr>
-          <w:spacing w:val="-5"/>
-        </w:rPr>
-        <w:t xml:space="preserve"> </w:t>
-      </w:r>
-      <w:r>
-        <w:rPr>
-          <w:spacing w:val="-5"/>
-        </w:rPr>
-        <w:t>1</w:t>
-      </w:r>
-      <w:r>
-        <w:rPr>
-          <w:spacing w:val="-5"/>
-        </w:rPr>
-        <w:t>9</w:t>
-      </w:r>
-      <w:r>
-        <w:rPr>
-          <w:spacing w:val="-2"/>
-        </w:rPr>
-        <w:t>.</w:t>
-      </w:r>
-      <w:r>
-        <w:rPr>
-          <w:spacing w:val="-2"/>
-        </w:rPr>
-        <w:t>0</w:t>
-      </w:r>
-      <w:r>
-        <w:rPr>
-          <w:spacing w:val="-2"/>
-        </w:rPr>
-        <w:t>4</w:t>
-      </w:r>
-      <w:r>
-        <w:rPr>
-          <w:spacing w:val="-2"/>
-        </w:rPr>
-        <w:t>.202</w:t>
-      </w:r>
-      <w:r>
-        <w:rPr>
-          <w:spacing w:val="-2"/>
-        </w:rPr>
-        <w:t>6</w:t>
-      </w:r>
+        <w:rPr>
+          <w:lang w:val="en-US"/>
+        </w:rPr>
+        <w:t xml:space="preserve">{{ </w:t>
+      </w:r>
+      <w:proofErr w:type="spellStart"/>
+      <w:r>
+        <w:rPr>
+          <w:lang w:val="en-US"/>
+        </w:rPr>
+        <w:t>bank.period_end_formatted</w:t>
+      </w:r>
+      <w:proofErr w:type="spellEnd"/>
+      <w:r>
+        <w:rPr>
+          <w:lang w:val="en-US"/>
+        </w:rPr>
+        <w:t xml:space="preserve"> }}</w:t>
+      </w:r>
+      <w:bookmarkStart w:id="0" w:name="_GoBack"/>
+      <w:bookmarkEnd w:id="0"/>
     </w:p>
     <w:p>
       <w:pPr>
@@ -1127,7 +1168,7 @@
               </wp:inline>
             </w:drawing>
           </mc:Choice>
-          <mc:Fallback>
+          <mc:Fallback xmlns:w16sdtfl="http://schemas.microsoft.com/office/word/2024/wordml/sdtformatlock" xmlns:w16sdtdh="http://schemas.microsoft.com/office/word/2020/wordml/sdtdatahash" xmlns:w16du="http://schemas.microsoft.com/office/word/2023/wordml/word16du" xmlns:w16="http://schemas.microsoft.com/office/word/2018/wordml" xmlns:w16cex="http://schemas.microsoft.com/office/word/2018/wordml/cex" xmlns:oel="http://schemas.microsoft.com/office/2019/extlst">
             <w:pict>
               <v:group w14:anchorId="3BA04462" id="Group 10" o:spid="_x0000_s1026" style="width:255.15pt;height:1.5pt;mso-position-horizontal-relative:char;mso-position-vertical-relative:line" coordsize="32404,190" o:gfxdata="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">
                 <v:shape id="Graphic 11" o:spid="_x0000_s1027" style="position:absolute;width:32404;height:190;visibility:visible;mso-wrap-style:square;v-text-anchor:top" coordsize="3240405,19050" o:gfxdata="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" path="m3240404,l,,,19050r3240404,l3240404,xe" fillcolor="#7e7e7e" stroked="f">
@@ -1143,11 +1184,14 @@
     <w:p>
       <w:pPr>
         <w:pStyle w:val="a3"/>
-        <w:spacing w:before="44"/>
         <w:tabs>
           <w:tab w:val="right" w:pos="10921"/>
         </w:tabs>
+        <w:spacing w:before="44"/>
         <w:ind w:left="5812"/>
+        <w:rPr>
+          <w:lang w:val="en-US"/>
+        </w:rPr>
       </w:pPr>
       <w:r>
         <w:t>Входящий</w:t>
@@ -1155,6 +1199,7 @@
       <w:r>
         <w:rPr>
           <w:spacing w:val="-6"/>
+          <w:lang w:val="en-US"/>
         </w:rPr>
         <w:t xml:space="preserve"> </w:t>
       </w:r>
@@ -1165,13 +1210,42 @@
         <w:t>остаток</w:t>
       </w:r>
       <w:r>
+        <w:rPr>
+          <w:lang w:val="en-US"/>
+        </w:rPr>
         <w:tab/>
       </w:r>
+      <w:proofErr w:type="gramStart"/>
       <w:r>
         <w:rPr>
           <w:spacing w:val="-5"/>
-        </w:rPr>
-        <w:t xml:space="preserve">{{ bank.opening_balance_formatted }}</w:t>
+          <w:lang w:val="en-US"/>
+        </w:rPr>
+        <w:t xml:space="preserve">{{ </w:t>
+      </w:r>
+      <w:proofErr w:type="spellStart"/>
+      <w:r>
+        <w:rPr>
+          <w:spacing w:val="-5"/>
+          <w:lang w:val="en-US"/>
+        </w:rPr>
+        <w:t>bank</w:t>
+      </w:r>
+      <w:proofErr w:type="gramEnd"/>
+      <w:r>
+        <w:rPr>
+          <w:spacing w:val="-5"/>
+          <w:lang w:val="en-US"/>
+        </w:rPr>
+        <w:t>.opening_balance_formatted</w:t>
+      </w:r>
+      <w:proofErr w:type="spellEnd"/>
+      <w:r>
+        <w:rPr>
+          <w:spacing w:val="-5"/>
+          <w:lang w:val="en-US"/>
+        </w:rPr>
+        <w:t xml:space="preserve"> }}</w:t>
       </w:r>
     </w:p>
     <w:p>
@@ -1180,6 +1254,7 @@
         <w:spacing w:before="4"/>
         <w:rPr>
           <w:sz w:val="6"/>
+          <w:lang w:val="en-US"/>
         </w:rPr>
       </w:pPr>
       <w:r>
@@ -1260,7 +1335,7 @@
               </wp:anchor>
             </w:drawing>
           </mc:Choice>
-          <mc:Fallback>
+          <mc:Fallback xmlns:w16sdtfl="http://schemas.microsoft.com/office/word/2024/wordml/sdtformatlock" xmlns:w16sdtdh="http://schemas.microsoft.com/office/word/2020/wordml/sdtdatahash" xmlns:w16du="http://schemas.microsoft.com/office/word/2023/wordml/word16du" xmlns:w16="http://schemas.microsoft.com/office/word/2018/wordml" xmlns:w16cex="http://schemas.microsoft.com/office/word/2018/wordml/cex" xmlns:oel="http://schemas.microsoft.com/office/2019/extlst">
             <w:pict>
               <v:shape w14:anchorId="6BD67767" id="Graphic 12" o:spid="_x0000_s1026" style="position:absolute;margin-left:311.85pt;margin-top:4.8pt;width:255.15pt;height:.5pt;z-index:-15728128;visibility:visible;mso-wrap-style:square;mso-wrap-distance-left:0;mso-wrap-distance-top:0;mso-wrap-distance-right:0;mso-wrap-distance-bottom:0;mso-position-horizontal:absolute;mso-position-horizontal-relative:page;mso-position-vertical:absolute;mso-position-vertical-relative:text;v-text-anchor:top" coordsize="3240405,6350" o:gfxdata="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" path="m3240404,l,,,6350r3240404,l3240404,xe" fillcolor="#7e7e7e" stroked="f">
                 <v:path arrowok="t"/>
@@ -1274,11 +1349,14 @@
     <w:p>
       <w:pPr>
         <w:pStyle w:val="a3"/>
-        <w:spacing w:before="54"/>
         <w:tabs>
           <w:tab w:val="right" w:pos="10921"/>
         </w:tabs>
+        <w:spacing w:before="54"/>
         <w:ind w:left="5812"/>
+        <w:rPr>
+          <w:lang w:val="en-US"/>
+        </w:rPr>
       </w:pPr>
       <w:r>
         <w:rPr>
@@ -1287,13 +1365,42 @@
         <w:t>Поступления</w:t>
       </w:r>
       <w:r>
+        <w:rPr>
+          <w:lang w:val="en-US"/>
+        </w:rPr>
         <w:tab/>
       </w:r>
+      <w:proofErr w:type="gramStart"/>
       <w:r>
         <w:rPr>
           <w:spacing w:val="-5"/>
-        </w:rPr>
-        <w:t xml:space="preserve">{{ bank.total_income_formatted }}</w:t>
+          <w:lang w:val="en-US"/>
+        </w:rPr>
+        <w:t xml:space="preserve">{{ </w:t>
+      </w:r>
+      <w:proofErr w:type="spellStart"/>
+      <w:r>
+        <w:rPr>
+          <w:spacing w:val="-5"/>
+          <w:lang w:val="en-US"/>
+        </w:rPr>
+        <w:t>bank</w:t>
+      </w:r>
+      <w:proofErr w:type="gramEnd"/>
+      <w:r>
+        <w:rPr>
+          <w:spacing w:val="-5"/>
+          <w:lang w:val="en-US"/>
+        </w:rPr>
+        <w:t>.total_income_formatted</w:t>
+      </w:r>
+      <w:proofErr w:type="spellEnd"/>
+      <w:r>
+        <w:rPr>
+          <w:spacing w:val="-5"/>
+          <w:lang w:val="en-US"/>
+        </w:rPr>
+        <w:t xml:space="preserve"> }}</w:t>
       </w:r>
     </w:p>
     <w:p>
@@ -1302,6 +1409,7 @@
         <w:spacing w:before="4"/>
         <w:rPr>
           <w:sz w:val="6"/>
+          <w:lang w:val="en-US"/>
         </w:rPr>
       </w:pPr>
       <w:r>
@@ -1382,7 +1490,7 @@
               </wp:anchor>
             </w:drawing>
           </mc:Choice>
-          <mc:Fallback>
+          <mc:Fallback xmlns:w16sdtfl="http://schemas.microsoft.com/office/word/2024/wordml/sdtformatlock" xmlns:w16sdtdh="http://schemas.microsoft.com/office/word/2020/wordml/sdtdatahash" xmlns:w16du="http://schemas.microsoft.com/office/word/2023/wordml/word16du" xmlns:w16="http://schemas.microsoft.com/office/word/2018/wordml" xmlns:w16cex="http://schemas.microsoft.com/office/word/2018/wordml/cex" xmlns:oel="http://schemas.microsoft.com/office/2019/extlst">
             <w:pict>
               <v:shape w14:anchorId="40A7C630" id="Graphic 13" o:spid="_x0000_s1026" style="position:absolute;margin-left:311.85pt;margin-top:4.8pt;width:255.15pt;height:.5pt;z-index:-15727616;visibility:visible;mso-wrap-style:square;mso-wrap-distance-left:0;mso-wrap-distance-top:0;mso-wrap-distance-right:0;mso-wrap-distance-bottom:0;mso-position-horizontal:absolute;mso-position-horizontal-relative:page;mso-position-vertical:absolute;mso-position-vertical-relative:text;v-text-anchor:top" coordsize="3240405,6350" o:gfxdata="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" path="m3240404,l,,,6350r3240404,l3240404,xe" fillcolor="#7e7e7e" stroked="f">
                 <v:path arrowok="t"/>
@@ -1396,11 +1504,14 @@
     <w:p>
       <w:pPr>
         <w:pStyle w:val="a3"/>
-        <w:spacing w:before="54"/>
         <w:tabs>
           <w:tab w:val="right" w:pos="10921"/>
         </w:tabs>
+        <w:spacing w:before="54"/>
         <w:ind w:left="5812"/>
+        <w:rPr>
+          <w:lang w:val="en-US"/>
+        </w:rPr>
       </w:pPr>
       <w:r>
         <w:rPr>
@@ -1409,13 +1520,42 @@
         <w:t>Расходы</w:t>
       </w:r>
       <w:r>
+        <w:rPr>
+          <w:lang w:val="en-US"/>
+        </w:rPr>
         <w:tab/>
       </w:r>
+      <w:proofErr w:type="gramStart"/>
       <w:r>
         <w:rPr>
           <w:spacing w:val="-5"/>
-        </w:rPr>
-        <w:t xml:space="preserve">{{ bank.total_expense_formatted }}</w:t>
+          <w:lang w:val="en-US"/>
+        </w:rPr>
+        <w:t xml:space="preserve">{{ </w:t>
+      </w:r>
+      <w:proofErr w:type="spellStart"/>
+      <w:r>
+        <w:rPr>
+          <w:spacing w:val="-5"/>
+          <w:lang w:val="en-US"/>
+        </w:rPr>
+        <w:t>bank</w:t>
+      </w:r>
+      <w:proofErr w:type="gramEnd"/>
+      <w:r>
+        <w:rPr>
+          <w:spacing w:val="-5"/>
+          <w:lang w:val="en-US"/>
+        </w:rPr>
+        <w:t>.total_expense_formatted</w:t>
+      </w:r>
+      <w:proofErr w:type="spellEnd"/>
+      <w:r>
+        <w:rPr>
+          <w:spacing w:val="-5"/>
+          <w:lang w:val="en-US"/>
+        </w:rPr>
+        <w:t xml:space="preserve"> }}</w:t>
       </w:r>
     </w:p>
     <w:p>
@@ -1425,6 +1565,7 @@
         <w:rPr>
           <w:color w:val="EE0000"/>
           <w:sz w:val="6"/>
+          <w:lang w:val="en-US"/>
         </w:rPr>
       </w:pPr>
       <w:r>
@@ -1505,7 +1646,7 @@
               </wp:anchor>
             </w:drawing>
           </mc:Choice>
-          <mc:Fallback>
+          <mc:Fallback xmlns:w16sdtfl="http://schemas.microsoft.com/office/word/2024/wordml/sdtformatlock" xmlns:w16sdtdh="http://schemas.microsoft.com/office/word/2020/wordml/sdtdatahash" xmlns:w16du="http://schemas.microsoft.com/office/word/2023/wordml/word16du" xmlns:w16="http://schemas.microsoft.com/office/word/2018/wordml" xmlns:w16cex="http://schemas.microsoft.com/office/word/2018/wordml/cex" xmlns:oel="http://schemas.microsoft.com/office/2019/extlst">
             <w:pict>
               <v:shape w14:anchorId="15700253" id="Graphic 14" o:spid="_x0000_s1026" style="position:absolute;margin-left:311.85pt;margin-top:4.8pt;width:255.15pt;height:.5pt;z-index:-15727104;visibility:visible;mso-wrap-style:square;mso-wrap-distance-left:0;mso-wrap-distance-top:0;mso-wrap-distance-right:0;mso-wrap-distance-bottom:0;mso-position-horizontal:absolute;mso-position-horizontal-relative:page;mso-position-vertical:absolute;mso-position-vertical-relative:text;v-text-anchor:top" coordsize="3240405,6350" o:gfxdata="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" path="m3240404,l,,,6350r3240404,l3240404,xe" fillcolor="#7e7e7e" stroked="f">
                 <v:path arrowok="t"/>
@@ -1519,20 +1660,60 @@
     <w:p>
       <w:pPr>
         <w:pStyle w:val="a3"/>
-        <w:spacing w:before="54" w:line="451" w:lineRule="auto"/>
         <w:tabs>
           <w:tab w:val="right" w:pos="10921"/>
         </w:tabs>
+        <w:spacing w:before="54" w:line="451" w:lineRule="auto"/>
         <w:ind w:left="5812"/>
+        <w:rPr>
+          <w:lang w:val="en-US"/>
+        </w:rPr>
       </w:pPr>
       <w:r>
-        <w:t>Исходящий остаток</w:t>
-      </w:r>
-      <w:r>
+        <w:t>Исходящий</w:t>
+      </w:r>
+      <w:r>
+        <w:rPr>
+          <w:lang w:val="en-US"/>
+        </w:rPr>
+        <w:t xml:space="preserve"> </w:t>
+      </w:r>
+      <w:r>
+        <w:t>остаток</w:t>
+      </w:r>
+      <w:r>
+        <w:rPr>
+          <w:lang w:val="en-US"/>
+        </w:rPr>
         <w:tab/>
       </w:r>
-      <w:r>
-        <w:t xml:space="preserve">{{ bank.closing_balance_formatted }}</w:t>
+      <w:proofErr w:type="gramStart"/>
+      <w:r>
+        <w:rPr>
+          <w:lang w:val="en-US"/>
+        </w:rPr>
+        <w:t xml:space="preserve">{{ </w:t>
+      </w:r>
+      <w:proofErr w:type="spellStart"/>
+      <w:r>
+        <w:rPr>
+          <w:lang w:val="en-US"/>
+        </w:rPr>
+        <w:t>bank</w:t>
+      </w:r>
+      <w:proofErr w:type="gramEnd"/>
+      <w:r>
+        <w:rPr>
+          <w:lang w:val="en-US"/>
+        </w:rPr>
+        <w:t>.closing_balance_formatted</w:t>
+      </w:r>
+      <w:proofErr w:type="spellEnd"/>
+      <w:r>
+        <w:rPr>
+          <w:lang w:val="en-US"/>
+        </w:rPr>
+        <w:t xml:space="preserve"> }}</w:t>
       </w:r>
     </w:p>
     <w:p>
@@ -1544,6 +1725,9 @@
         </w:tabs>
         <w:spacing w:before="54" w:line="451" w:lineRule="auto"/>
         <w:ind w:left="5812" w:right="139"/>
+        <w:rPr>
+          <w:lang w:val="en-US"/>
+        </w:rPr>
       </w:pPr>
     </w:p>
     <w:p>
@@ -1555,6 +1739,9 @@
         </w:tabs>
         <w:spacing w:before="54" w:line="451" w:lineRule="auto"/>
         <w:ind w:left="5812" w:right="139"/>
+        <w:rPr>
+          <w:lang w:val="en-US"/>
+        </w:rPr>
       </w:pPr>
     </w:p>
     <w:p>
@@ -1564,6 +1751,7 @@
         <w:rPr>
           <w:rFonts w:ascii="Courier New"/>
           <w:sz w:val="24"/>
+          <w:lang w:val="en-US"/>
         </w:rPr>
       </w:pPr>
     </w:p>
@@ -1574,6 +1762,7 @@
           <w:rFonts w:ascii="Arial" w:hAnsi="Arial"/>
           <w:b/>
           <w:sz w:val="24"/>
+          <w:lang w:val="en-US"/>
         </w:rPr>
       </w:pPr>
     </w:p>
@@ -1865,7 +2054,7 @@
                 <w:spacing w:val="-2"/>
                 <w:sz w:val="16"/>
               </w:rPr>
-              <w:t xml:space="preserve">__TX_DATE__</w:t>
+              <w:t>__TX_DATE__</w:t>
             </w:r>
           </w:p>
         </w:tc>
@@ -1892,7 +2081,7 @@
                 <w:spacing w:val="-2"/>
                 <w:sz w:val="16"/>
               </w:rPr>
-              <w:t xml:space="preserve">__TX_CODE__</w:t>
+              <w:t>__TX_CODE__</w:t>
             </w:r>
           </w:p>
         </w:tc>
@@ -1918,7 +2107,7 @@
                 <w:spacing w:val="-2"/>
                 <w:sz w:val="16"/>
               </w:rPr>
-              <w:t xml:space="preserve">__TX_DESCRIPTION__</w:t>
+              <w:t>__TX_DESCRIPTION__</w:t>
             </w:r>
           </w:p>
         </w:tc>
@@ -1946,7 +2135,7 @@
               <w:rPr>
                 <w:sz w:val="16"/>
               </w:rPr>
-              <w:t xml:space="preserve">__TX_AMOUNT__</w:t>
+              <w:t>__TX_AMOUNT__</w:t>
             </w:r>
           </w:p>
         </w:tc>
@@ -3136,7 +3325,7 @@
                     </wp:inline>
                   </w:drawing>
                 </mc:Choice>
-                <mc:Fallback>
+                <mc:Fallback xmlns:w16sdtfl="http://schemas.microsoft.com/office/word/2024/wordml/sdtformatlock" xmlns:w16sdtdh="http://schemas.microsoft.com/office/word/2020/wordml/sdtdatahash" xmlns:w16du="http://schemas.microsoft.com/office/word/2023/wordml/word16du" xmlns:w16="http://schemas.microsoft.com/office/word/2018/wordml" xmlns:w16cex="http://schemas.microsoft.com/office/word/2018/wordml/cex" xmlns:oel="http://schemas.microsoft.com/office/2019/extlst">
                   <w:pict>
                     <v:group w14:anchorId="00FB0B2F" id="Group 23" o:spid="_x0000_s1026" style="width:74.8pt;height:7pt;mso-position-horizontal-relative:char;mso-position-vertical-relative:line" coordsize="9499,889" o:gfxdata="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">
                       <v:shape id="Graphic 24" o:spid="_x0000_s1027" style="position:absolute;width:9499;height:889;visibility:visible;mso-wrap-style:square;v-text-anchor:top" coordsize="949960,88900" o:gfxdata="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" path="m31369,29972r-13081,l,56642,18669,83947r12700,l16002,56642,31369,29972xem54610,29972r-13081,l23241,56642,41910,83947r12700,l39243,56642,54610,29972xem148463,87757l140677,68072,134848,53340,122148,21209,116205,6172r,47168l92456,53340,104267,21209r11938,32131l116205,6172,114173,1016r-18542,l61341,87757r18669,l87122,68072r34671,l129413,87757r19050,xem224663,1016r-59817,l164846,71247r-1905,1397l160655,73914r-2540,508l155575,74168r-3937,l151638,87757r2235,l162814,88265,180771,74422r712,-6858l181864,60071r-127,-7366l181737,15621r25400,l207137,87757r17526,l224663,15621r,-14605xem315493,59791l297815,37439r,20854l297561,61722r,2540l296672,66802r-3175,3683l291592,71755r-2286,635l284734,73152r-1143,l281686,73279r-3810,-127l260731,73152r,-22987l278638,50165r5080,-381l288671,50800r4572,2159l296164,54864r1651,3429l297815,37439r-788,-355l290741,35725r-30010,l260731,1016r-17653,l243128,35725r77,52032l284226,87757r5588,254l312801,73279r1993,-4585l315493,59791xem419188,43053r-215,-3810l418858,37172r-1625,-6273l402463,14376r,32614l401701,50927r-1524,3556l398526,57277r-2413,2159l393192,60706r-3683,1651l385445,63119r-4064,l381381,24384r1003,l402463,46990r,-32614l396976,11836r-7467,-1816l390499,10020r-9118,-368l381381,1016r-17145,l364236,9652r,15240l364236,63004r-9170,-1181l348513,58331r-3924,-5728l343281,44704r-381,-5461l344678,33909r3556,-4064l352679,26162r5715,-1778l364236,24892r,-15240l328396,30594r-1981,12459l326453,44704r29807,32575l364236,77597r,10160l381381,87757r,-10160l389382,77279,414388,62357r101,-127l417207,56426r1600,-6236l419150,44704r38,-1651xem511556,87757l503618,68072,497687,53340,484759,21209,479298,7645r,45695l455676,53340,467360,21209r11938,32131l479298,7645,476631,1016r-18288,l424561,87757r18542,l450342,68072r34671,l492506,87757r19050,xem551561,48006r-32639,l518922,64643r32639,l551561,48006xem634111,61785r-1143,-7772l630974,49784r-1435,-3048l626872,42799r-3810,-3048l618617,37973r-2540,-801l616077,58293r-127,5969l603123,73152r-1207,l599948,73279r-3810,-127l579120,73152r,-22987l596900,50165r5080,-381l607060,50673r4572,2286l614426,54991r1651,3302l616077,37172r-2667,-850l608952,35687r-29832,l579120,15494r47371,l626491,1016r-64897,l561594,87757r41021,l608203,88011,631202,73279r1766,-3709l634111,61785xem726567,87757l718832,68072,713054,53340,700443,21209,694309,5562r,47778l670687,53340,682371,21209r11938,32131l694309,5562,692531,1016r-19177,l639572,87757r18542,l665226,68072r34798,l707517,87757r19050,xem805307,1016r-17526,l787781,35179r-34290,l753491,1016r-17526,l735965,87757r17526,l753491,49657r34290,l787781,87757r17526,l805307,1016xem887476,87376l864870,46101r-7239,-3429l860298,41402r8636,-15621l870458,22098r11049,-9144l886587,13081r,-12700l884047,381,877951,r-5969,1143l866521,3810r-5334,4699l857377,14605r-1778,6731l853948,26035r-2159,4572l849249,34925r-2286,1905l844169,37846r-2921,l841248,1016r-17526,l823722,87503r17526,l841248,49403r2286,-254l853440,59055r3175,5842l866902,87376r20574,xem926338,57277l907542,29972r-12700,l910209,56896,894842,83566r13589,l926338,57277xem949452,57277l930783,29972r-12700,l933450,56896,918083,83566r12700,381l949452,57277xe" fillcolor="#527aff" stroked="f">
@@ -3246,7 +3435,7 @@
                     </wp:anchor>
                   </w:drawing>
                 </mc:Choice>
-                <mc:Fallback>
+                <mc:Fallback xmlns:w16sdtfl="http://schemas.microsoft.com/office/word/2024/wordml/sdtformatlock" xmlns:w16sdtdh="http://schemas.microsoft.com/office/word/2020/wordml/sdtdatahash" xmlns:w16du="http://schemas.microsoft.com/office/word/2023/wordml/word16du" xmlns:w16="http://schemas.microsoft.com/office/word/2018/wordml" xmlns:w16cex="http://schemas.microsoft.com/office/word/2018/wordml/cex" xmlns:oel="http://schemas.microsoft.com/office/2019/extlst">
                   <w:pict>
                     <v:group w14:anchorId="01022342" id="Group 25" o:spid="_x0000_s1026" style="position:absolute;margin-left:47.85pt;margin-top:14.95pt;width:130.85pt;height:9.75pt;z-index:487591424;mso-wrap-distance-left:0;mso-wrap-distance-right:0" coordsize="16617,1238" o:gfxdata="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">
                       <v:shapetype id="_x0000_t75" coordsize="21600,21600" o:spt="75" o:preferrelative="t" path="m@4@5l@4@11@9@11@9@5xe" filled="f" stroked="f">
@@ -3491,7 +3680,7 @@
                     </wp:anchor>
                   </w:drawing>
                 </mc:Choice>
-                <mc:Fallback>
+                <mc:Fallback xmlns:w16sdtfl="http://schemas.microsoft.com/office/word/2024/wordml/sdtformatlock" xmlns:w16sdtdh="http://schemas.microsoft.com/office/word/2020/wordml/sdtdatahash" xmlns:w16du="http://schemas.microsoft.com/office/word/2023/wordml/word16du" xmlns:w16="http://schemas.microsoft.com/office/word/2018/wordml" xmlns:w16cex="http://schemas.microsoft.com/office/word/2018/wordml/cex" xmlns:oel="http://schemas.microsoft.com/office/2019/extlst">
                   <w:pict>
                     <v:group w14:anchorId="002D2B1A" id="Group 28" o:spid="_x0000_s1026" style="position:absolute;margin-left:32.55pt;margin-top:-.5pt;width:160.2pt;height:7.85pt;z-index:487592448;mso-wrap-distance-left:0;mso-wrap-distance-right:0" coordsize="20345,996" o:gfxdata="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">
                       <v:shape id="Image 29" o:spid="_x0000_s1027" type="#_x0000_t75" style="position:absolute;width:20340;height:993;visibility:visible;mso-wrap-style:square" o:gfxdata="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">
@@ -3682,7 +3871,7 @@
 </file>
 
 <file path=word/endnotes.xml><?xml version="1.0" encoding="utf-8"?>
-<w:endnotes xmlns:wpc="http://schemas.microsoft.com/office/word/2010/wordprocessingCanvas" xmlns:cx="http://schemas.microsoft.com/office/drawing/2014/chartex" xmlns:cx1="http://schemas.microsoft.com/office/drawing/2015/9/8/chartex" xmlns:cx2="http://schemas.microsoft.com/office/drawing/2015/10/21/chartex" xmlns:cx3="http://schemas.microsoft.com/office/drawing/2016/5/9/chartex" xmlns:cx4="http://schemas.microsoft.com/office/drawing/2016/5/10/chartex" xmlns:cx5="http://schemas.microsoft.com/office/drawing/2016/5/11/chartex" xmlns:cx6="http://schemas.microsoft.com/office/drawing/2016/5/12/chartex" xmlns:cx7="http://schemas.microsoft.com/office/drawing/2016/5/13/chartex" xmlns:cx8="http://schemas.microsoft.com/office/drawing/2016/5/14/chartex" xmlns:mc="http://schemas.openxmlformats.org/markup-compatibility/2006" xmlns:aink="http://schemas.microsoft.com/office/drawing/2016/ink" xmlns:am3d="http://schemas.microsoft.com/office/drawing/2017/model3d" xmlns:o="urn:schemas-microsoft-com:office:office" xmlns:oel="http://schemas.microsoft.com/office/2019/extlst" xmlns:r="http://schemas.openxmlformats.org/officeDocument/2006/relationships" xmlns:m="http://schemas.openxmlformats.org/officeDocument/2006/math" xmlns:v="urn:schemas-microsoft-com:vml" xmlns:wp14="http://schemas.microsoft.com/office/word/2010/wordprocessingDrawing" xmlns:wp="http://schemas.openxmlformats.org/drawingml/2006/wordprocessingDrawing" xmlns:w10="urn:schemas-microsoft-com:office:word" xmlns:w="http://schemas.openxmlformats.org/wordprocessingml/2006/main" xmlns:w14="http://schemas.microsoft.com/office/word/2010/wordml" xmlns:w15="http://schemas.microsoft.com/office/word/2012/wordml" xmlns:w16cex="http://schemas.microsoft.com/office/word/2018/wordml/cex" xmlns:w16cid="http://schemas.microsoft.com/office/word/2016/wordml/cid" xmlns:w16="http://schemas.microsoft.com/office/word/2018/wordml" xmlns:w16du="http://schemas.microsoft.com/office/word/2023/wordml/word16du" xmlns:w16sdtdh="http://schemas.microsoft.com/office/word/2020/wordml/sdtdatahash" xmlns:w16sdtfl="http://schemas.microsoft.com/office/word/2024/wordml/sdtformatlock" xmlns:w16se="http://schemas.microsoft.com/office/word/2015/wordml/symex" xmlns:wpg="http://schemas.microsoft.com/office/word/2010/wordprocessingGroup" xmlns:wpi="http://schemas.microsoft.com/office/word/2010/wordprocessingInk" xmlns:wne="http://schemas.microsoft.com/office/word/2006/wordml" xmlns:wps="http://schemas.microsoft.com/office/word/2010/wordprocessingShape" mc:Ignorable="w14 w15 w16se w16cid w16 w16cex w16sdtdh w16sdtfl w16du wp14">
+<w:endnotes xmlns:wpc="http://schemas.microsoft.com/office/word/2010/wordprocessingCanvas" xmlns:cx="http://schemas.microsoft.com/office/drawing/2014/chartex" xmlns:cx1="http://schemas.microsoft.com/office/drawing/2015/9/8/chartex" xmlns:cx2="http://schemas.microsoft.com/office/drawing/2015/10/21/chartex" xmlns:cx3="http://schemas.microsoft.com/office/drawing/2016/5/9/chartex" xmlns:cx4="http://schemas.microsoft.com/office/drawing/2016/5/10/chartex" xmlns:cx5="http://schemas.microsoft.com/office/drawing/2016/5/11/chartex" xmlns:cx6="http://schemas.microsoft.com/office/drawing/2016/5/12/chartex" xmlns:cx7="http://schemas.microsoft.com/office/drawing/2016/5/13/chartex" xmlns:cx8="http://schemas.microsoft.com/office/drawing/2016/5/14/chartex" xmlns:mc="http://schemas.openxmlformats.org/markup-compatibility/2006" xmlns:aink="http://schemas.microsoft.com/office/drawing/2016/ink" xmlns:am3d="http://schemas.microsoft.com/office/drawing/2017/model3d" xmlns:o="urn:schemas-microsoft-com:office:office" xmlns:r="http://schemas.openxmlformats.org/officeDocument/2006/relationships" xmlns:m="http://schemas.openxmlformats.org/officeDocument/2006/math" xmlns:v="urn:schemas-microsoft-com:vml" xmlns:wp14="http://schemas.microsoft.com/office/word/2010/wordprocessingDrawing" xmlns:wp="http://schemas.openxmlformats.org/drawingml/2006/wordprocessingDrawing" xmlns:w10="urn:schemas-microsoft-com:office:word" xmlns:w="http://schemas.openxmlformats.org/wordprocessingml/2006/main" xmlns:w14="http://schemas.microsoft.com/office/word/2010/wordml" xmlns:w15="http://schemas.microsoft.com/office/word/2012/wordml" xmlns:w16cid="http://schemas.microsoft.com/office/word/2016/wordml/cid" xmlns:w16se="http://schemas.microsoft.com/office/word/2015/wordml/symex" xmlns:wpg="http://schemas.microsoft.com/office/word/2010/wordprocessingGroup" xmlns:wpi="http://schemas.microsoft.com/office/word/2010/wordprocessingInk" xmlns:wne="http://schemas.microsoft.com/office/word/2006/wordml" xmlns:wps="http://schemas.microsoft.com/office/word/2010/wordprocessingShape" mc:Ignorable="w14 w15 w16se w16cid wp14">
   <w:endnote w:type="separator" w:id="-1">
     <w:p>
       <w:r>
@@ -3701,7 +3890,7 @@
 </file>
 
 <file path=word/footer1.xml><?xml version="1.0" encoding="utf-8"?>
-<w:ftr xmlns:wpc="http://schemas.microsoft.com/office/word/2010/wordprocessingCanvas" xmlns:cx="http://schemas.microsoft.com/office/drawing/2014/chartex" xmlns:cx1="http://schemas.microsoft.com/office/drawing/2015/9/8/chartex" xmlns:cx2="http://schemas.microsoft.com/office/drawing/2015/10/21/chartex" xmlns:cx3="http://schemas.microsoft.com/office/drawing/2016/5/9/chartex" xmlns:cx4="http://schemas.microsoft.com/office/drawing/2016/5/10/chartex" xmlns:cx5="http://schemas.microsoft.com/office/drawing/2016/5/11/chartex" xmlns:cx6="http://schemas.microsoft.com/office/drawing/2016/5/12/chartex" xmlns:cx7="http://schemas.microsoft.com/office/drawing/2016/5/13/chartex" xmlns:cx8="http://schemas.microsoft.com/office/drawing/2016/5/14/chartex" xmlns:mc="http://schemas.openxmlformats.org/markup-compatibility/2006" xmlns:aink="http://schemas.microsoft.com/office/drawing/2016/ink" xmlns:am3d="http://schemas.microsoft.com/office/drawing/2017/model3d" xmlns:o="urn:schemas-microsoft-com:office:office" xmlns:oel="http://schemas.microsoft.com/office/2019/extlst" xmlns:r="http://schemas.openxmlformats.org/officeDocument/2006/relationships" xmlns:m="http://schemas.openxmlformats.org/officeDocument/2006/math" xmlns:v="urn:schemas-microsoft-com:vml" xmlns:wp14="http://schemas.microsoft.com/office/word/2010/wordprocessingDrawing" xmlns:wp="http://schemas.openxmlformats.org/drawingml/2006/wordprocessingDrawing" xmlns:w10="urn:schemas-microsoft-com:office:word" xmlns:w="http://schemas.openxmlformats.org/wordprocessingml/2006/main" xmlns:w14="http://schemas.microsoft.com/office/word/2010/wordml" xmlns:w15="http://schemas.microsoft.com/office/word/2012/wordml" xmlns:w16cex="http://schemas.microsoft.com/office/word/2018/wordml/cex" xmlns:w16cid="http://schemas.microsoft.com/office/word/2016/wordml/cid" xmlns:w16="http://schemas.microsoft.com/office/word/2018/wordml" xmlns:w16du="http://schemas.microsoft.com/office/word/2023/wordml/word16du" xmlns:w16sdtdh="http://schemas.microsoft.com/office/word/2020/wordml/sdtdatahash" xmlns:w16sdtfl="http://schemas.microsoft.com/office/word/2024/wordml/sdtformatlock" xmlns:w16se="http://schemas.microsoft.com/office/word/2015/wordml/symex" xmlns:wpg="http://schemas.microsoft.com/office/word/2010/wordprocessingGroup" xmlns:wpi="http://schemas.microsoft.com/office/word/2010/wordprocessingInk" xmlns:wne="http://schemas.microsoft.com/office/word/2006/wordml" xmlns:wps="http://schemas.microsoft.com/office/word/2010/wordprocessingShape" mc:Ignorable="w14 w15 w16se w16cid w16 w16cex w16sdtdh w16sdtfl w16du wp14">
+<w:ftr xmlns:wpc="http://schemas.microsoft.com/office/word/2010/wordprocessingCanvas" xmlns:cx="http://schemas.microsoft.com/office/drawing/2014/chartex" xmlns:cx1="http://schemas.microsoft.com/office/drawing/2015/9/8/chartex" xmlns:cx2="http://schemas.microsoft.com/office/drawing/2015/10/21/chartex" xmlns:cx3="http://schemas.microsoft.com/office/drawing/2016/5/9/chartex" xmlns:cx4="http://schemas.microsoft.com/office/drawing/2016/5/10/chartex" xmlns:cx5="http://schemas.microsoft.com/office/drawing/2016/5/11/chartex" xmlns:cx6="http://schemas.microsoft.com/office/drawing/2016/5/12/chartex" xmlns:cx7="http://schemas.microsoft.com/office/drawing/2016/5/13/chartex" xmlns:cx8="http://schemas.microsoft.com/office/drawing/2016/5/14/chartex" xmlns:mc="http://schemas.openxmlformats.org/markup-compatibility/2006" xmlns:aink="http://schemas.microsoft.com/office/drawing/2016/ink" xmlns:am3d="http://schemas.microsoft.com/office/drawing/2017/model3d" xmlns:o="urn:schemas-microsoft-com:office:office" xmlns:r="http://schemas.openxmlformats.org/officeDocument/2006/relationships" xmlns:m="http://schemas.openxmlformats.org/officeDocument/2006/math" xmlns:v="urn:schemas-microsoft-com:vml" xmlns:wp14="http://schemas.microsoft.com/office/word/2010/wordprocessingDrawing" xmlns:wp="http://schemas.openxmlformats.org/drawingml/2006/wordprocessingDrawing" xmlns:w10="urn:schemas-microsoft-com:office:word" xmlns:w="http://schemas.openxmlformats.org/wordprocessingml/2006/main" xmlns:w14="http://schemas.microsoft.com/office/word/2010/wordml" xmlns:w15="http://schemas.microsoft.com/office/word/2012/wordml" xmlns:w16cid="http://schemas.microsoft.com/office/word/2016/wordml/cid" xmlns:w16se="http://schemas.microsoft.com/office/word/2015/wordml/symex" xmlns:wpg="http://schemas.microsoft.com/office/word/2010/wordprocessingGroup" xmlns:wpi="http://schemas.microsoft.com/office/word/2010/wordprocessingInk" xmlns:wne="http://schemas.microsoft.com/office/word/2006/wordml" xmlns:wps="http://schemas.microsoft.com/office/word/2010/wordprocessingShape" mc:Ignorable="w14 w15 w16se w16cid wp14">
   <w:p>
     <w:pPr>
       <w:pStyle w:val="a3"/>
@@ -3920,7 +4109,7 @@
             </wp:anchor>
           </w:drawing>
         </mc:Choice>
-        <mc:Fallback>
+        <mc:Fallback xmlns:w16sdtfl="http://schemas.microsoft.com/office/word/2024/wordml/sdtformatlock" xmlns:w16sdtdh="http://schemas.microsoft.com/office/word/2020/wordml/sdtdatahash" xmlns:w16du="http://schemas.microsoft.com/office/word/2023/wordml/word16du" xmlns:w16="http://schemas.microsoft.com/office/word/2018/wordml" xmlns:w16cex="http://schemas.microsoft.com/office/word/2018/wordml/cex" xmlns:oel="http://schemas.microsoft.com/office/2019/extlst">
           <w:pict>
             <v:shapetype w14:anchorId="1A6F9CD0" id="_x0000_t202" coordsize="21600,21600" o:spt="202" path="m,l,21600r21600,l21600,xe">
               <v:stroke joinstyle="miter"/>
@@ -4050,7 +4239,7 @@
 </file>
 
 <file path=word/footnotes.xml><?xml version="1.0" encoding="utf-8"?>
-<w:footnotes xmlns:wpc="http://schemas.microsoft.com/office/word/2010/wordprocessingCanvas" xmlns:cx="http://schemas.microsoft.com/office/drawing/2014/chartex" xmlns:cx1="http://schemas.microsoft.com/office/drawing/2015/9/8/chartex" xmlns:cx2="http://schemas.microsoft.com/office/drawing/2015/10/21/chartex" xmlns:cx3="http://schemas.microsoft.com/office/drawing/2016/5/9/chartex" xmlns:cx4="http://schemas.microsoft.com/office/drawing/2016/5/10/chartex" xmlns:cx5="http://schemas.microsoft.com/office/drawing/2016/5/11/chartex" xmlns:cx6="http://schemas.microsoft.com/office/drawing/2016/5/12/chartex" xmlns:cx7="http://schemas.microsoft.com/office/drawing/2016/5/13/chartex" xmlns:cx8="http://schemas.microsoft.com/office/drawing/2016/5/14/chartex" xmlns:mc="http://schemas.openxmlformats.org/markup-compatibility/2006" xmlns:aink="http://schemas.microsoft.com/office/drawing/2016/ink" xmlns:am3d="http://schemas.microsoft.com/office/drawing/2017/model3d" xmlns:o="urn:schemas-microsoft-com:office:office" xmlns:oel="http://schemas.microsoft.com/office/2019/extlst" xmlns:r="http://schemas.openxmlformats.org/officeDocument/2006/relationships" xmlns:m="http://schemas.openxmlformats.org/officeDocument/2006/math" xmlns:v="urn:schemas-microsoft-com:vml" xmlns:wp14="http://schemas.microsoft.com/office/word/2010/wordprocessingDrawing" xmlns:wp="http://schemas.openxmlformats.org/drawingml/2006/wordprocessingDrawing" xmlns:w10="urn:schemas-microsoft-com:office:word" xmlns:w="http://schemas.openxmlformats.org/wordprocessingml/2006/main" xmlns:w14="http://schemas.microsoft.com/office/word/2010/wordml" xmlns:w15="http://schemas.microsoft.com/office/word/2012/wordml" xmlns:w16cex="http://schemas.microsoft.com/office/word/2018/wordml/cex" xmlns:w16cid="http://schemas.microsoft.com/office/word/2016/wordml/cid" xmlns:w16="http://schemas.microsoft.com/office/word/2018/wordml" xmlns:w16du="http://schemas.microsoft.com/office/word/2023/wordml/word16du" xmlns:w16sdtdh="http://schemas.microsoft.com/office/word/2020/wordml/sdtdatahash" xmlns:w16sdtfl="http://schemas.microsoft.com/office/word/2024/wordml/sdtformatlock" xmlns:w16se="http://schemas.microsoft.com/office/word/2015/wordml/symex" xmlns:wpg="http://schemas.microsoft.com/office/word/2010/wordprocessingGroup" xmlns:wpi="http://schemas.microsoft.com/office/word/2010/wordprocessingInk" xmlns:wne="http://schemas.microsoft.com/office/word/2006/wordml" xmlns:wps="http://schemas.microsoft.com/office/word/2010/wordprocessingShape" mc:Ignorable="w14 w15 w16se w16cid w16 w16cex w16sdtdh w16sdtfl w16du wp14">
+<w:footnotes xmlns:wpc="http://schemas.microsoft.com/office/word/2010/wordprocessingCanvas" xmlns:cx="http://schemas.microsoft.com/office/drawing/2014/chartex" xmlns:cx1="http://schemas.microsoft.com/office/drawing/2015/9/8/chartex" xmlns:cx2="http://schemas.microsoft.com/office/drawing/2015/10/21/chartex" xmlns:cx3="http://schemas.microsoft.com/office/drawing/2016/5/9/chartex" xmlns:cx4="http://schemas.microsoft.com/office/drawing/2016/5/10/chartex" xmlns:cx5="http://schemas.microsoft.com/office/drawing/2016/5/11/chartex" xmlns:cx6="http://schemas.microsoft.com/office/drawing/2016/5/12/chartex" xmlns:cx7="http://schemas.microsoft.com/office/drawing/2016/5/13/chartex" xmlns:cx8="http://schemas.microsoft.com/office/drawing/2016/5/14/chartex" xmlns:mc="http://schemas.openxmlformats.org/markup-compatibility/2006" xmlns:aink="http://schemas.microsoft.com/office/drawing/2016/ink" xmlns:am3d="http://schemas.microsoft.com/office/drawing/2017/model3d" xmlns:o="urn:schemas-microsoft-com:office:office" xmlns:r="http://schemas.openxmlformats.org/officeDocument/2006/relationships" xmlns:m="http://schemas.openxmlformats.org/officeDocument/2006/math" xmlns:v="urn:schemas-microsoft-com:vml" xmlns:wp14="http://schemas.microsoft.com/office/word/2010/wordprocessingDrawing" xmlns:wp="http://schemas.openxmlformats.org/drawingml/2006/wordprocessingDrawing" xmlns:w10="urn:schemas-microsoft-com:office:word" xmlns:w="http://schemas.openxmlformats.org/wordprocessingml/2006/main" xmlns:w14="http://schemas.microsoft.com/office/word/2010/wordml" xmlns:w15="http://schemas.microsoft.com/office/word/2012/wordml" xmlns:w16cid="http://schemas.microsoft.com/office/word/2016/wordml/cid" xmlns:w16se="http://schemas.microsoft.com/office/word/2015/wordml/symex" xmlns:wpg="http://schemas.microsoft.com/office/word/2010/wordprocessingGroup" xmlns:wpi="http://schemas.microsoft.com/office/word/2010/wordprocessingInk" xmlns:wne="http://schemas.microsoft.com/office/word/2006/wordml" xmlns:wps="http://schemas.microsoft.com/office/word/2010/wordprocessingShape" mc:Ignorable="w14 w15 w16se w16cid wp14">
   <w:footnote w:type="separator" w:id="-1">
     <w:p>
       <w:r>
@@ -4069,7 +4258,7 @@
 </file>
 
 <file path=word/header1.xml><?xml version="1.0" encoding="utf-8"?>
-<w:hdr xmlns:wpc="http://schemas.microsoft.com/office/word/2010/wordprocessingCanvas" xmlns:cx="http://schemas.microsoft.com/office/drawing/2014/chartex" xmlns:cx1="http://schemas.microsoft.com/office/drawing/2015/9/8/chartex" xmlns:cx2="http://schemas.microsoft.com/office/drawing/2015/10/21/chartex" xmlns:cx3="http://schemas.microsoft.com/office/drawing/2016/5/9/chartex" xmlns:cx4="http://schemas.microsoft.com/office/drawing/2016/5/10/chartex" xmlns:cx5="http://schemas.microsoft.com/office/drawing/2016/5/11/chartex" xmlns:cx6="http://schemas.microsoft.com/office/drawing/2016/5/12/chartex" xmlns:cx7="http://schemas.microsoft.com/office/drawing/2016/5/13/chartex" xmlns:cx8="http://schemas.microsoft.com/office/drawing/2016/5/14/chartex" xmlns:mc="http://schemas.openxmlformats.org/markup-compatibility/2006" xmlns:aink="http://schemas.microsoft.com/office/drawing/2016/ink" xmlns:am3d="http://schemas.microsoft.com/office/drawing/2017/model3d" xmlns:o="urn:schemas-microsoft-com:office:office" xmlns:oel="http://schemas.microsoft.com/office/2019/extlst" xmlns:r="http://schemas.openxmlformats.org/officeDocument/2006/relationships" xmlns:m="http://schemas.openxmlformats.org/officeDocument/2006/math" xmlns:v="urn:schemas-microsoft-com:vml" xmlns:wp14="http://schemas.microsoft.com/office/word/2010/wordprocessingDrawing" xmlns:wp="http://schemas.openxmlformats.org/drawingml/2006/wordprocessingDrawing" xmlns:w10="urn:schemas-microsoft-com:office:word" xmlns:w="http://schemas.openxmlformats.org/wordprocessingml/2006/main" xmlns:w14="http://schemas.microsoft.com/office/word/2010/wordml" xmlns:w15="http://schemas.microsoft.com/office/word/2012/wordml" xmlns:w16cex="http://schemas.microsoft.com/office/word/2018/wordml/cex" xmlns:w16cid="http://schemas.microsoft.com/office/word/2016/wordml/cid" xmlns:w16="http://schemas.microsoft.com/office/word/2018/wordml" xmlns:w16du="http://schemas.microsoft.com/office/word/2023/wordml/word16du" xmlns:w16sdtdh="http://schemas.microsoft.com/office/word/2020/wordml/sdtdatahash" xmlns:w16sdtfl="http://schemas.microsoft.com/office/word/2024/wordml/sdtformatlock" xmlns:w16se="http://schemas.microsoft.com/office/word/2015/wordml/symex" xmlns:wpg="http://schemas.microsoft.com/office/word/2010/wordprocessingGroup" xmlns:wpi="http://schemas.microsoft.com/office/word/2010/wordprocessingInk" xmlns:wne="http://schemas.microsoft.com/office/word/2006/wordml" xmlns:wps="http://schemas.microsoft.com/office/word/2010/wordprocessingShape" mc:Ignorable="w14 w15 w16se w16cid w16 w16cex w16sdtdh w16sdtfl w16du wp14">
+<w:hdr xmlns:wpc="http://schemas.microsoft.com/office/word/2010/wordprocessingCanvas" xmlns:cx="http://schemas.microsoft.com/office/drawing/2014/chartex" xmlns:cx1="http://schemas.microsoft.com/office/drawing/2015/9/8/chartex" xmlns:cx2="http://schemas.microsoft.com/office/drawing/2015/10/21/chartex" xmlns:cx3="http://schemas.microsoft.com/office/drawing/2016/5/9/chartex" xmlns:cx4="http://schemas.microsoft.com/office/drawing/2016/5/10/chartex" xmlns:cx5="http://schemas.microsoft.com/office/drawing/2016/5/11/chartex" xmlns:cx6="http://schemas.microsoft.com/office/drawing/2016/5/12/chartex" xmlns:cx7="http://schemas.microsoft.com/office/drawing/2016/5/13/chartex" xmlns:cx8="http://schemas.microsoft.com/office/drawing/2016/5/14/chartex" xmlns:mc="http://schemas.openxmlformats.org/markup-compatibility/2006" xmlns:aink="http://schemas.microsoft.com/office/drawing/2016/ink" xmlns:am3d="http://schemas.microsoft.com/office/drawing/2017/model3d" xmlns:o="urn:schemas-microsoft-com:office:office" xmlns:r="http://schemas.openxmlformats.org/officeDocument/2006/relationships" xmlns:m="http://schemas.openxmlformats.org/officeDocument/2006/math" xmlns:v="urn:schemas-microsoft-com:vml" xmlns:wp14="http://schemas.microsoft.com/office/word/2010/wordprocessingDrawing" xmlns:wp="http://schemas.openxmlformats.org/drawingml/2006/wordprocessingDrawing" xmlns:w10="urn:schemas-microsoft-com:office:word" xmlns:w="http://schemas.openxmlformats.org/wordprocessingml/2006/main" xmlns:w14="http://schemas.microsoft.com/office/word/2010/wordml" xmlns:w15="http://schemas.microsoft.com/office/word/2012/wordml" xmlns:w16cid="http://schemas.microsoft.com/office/word/2016/wordml/cid" xmlns:w16se="http://schemas.microsoft.com/office/word/2015/wordml/symex" xmlns:wpg="http://schemas.microsoft.com/office/word/2010/wordprocessingGroup" xmlns:wpi="http://schemas.microsoft.com/office/word/2010/wordprocessingInk" xmlns:wne="http://schemas.microsoft.com/office/word/2006/wordml" xmlns:wps="http://schemas.microsoft.com/office/word/2010/wordprocessingShape" mc:Ignorable="w14 w15 w16se w16cid wp14">
   <w:p>
     <w:pPr>
       <w:pStyle w:val="a3"/>
@@ -4205,7 +4394,7 @@
             </wp:anchor>
           </w:drawing>
         </mc:Choice>
-        <mc:Fallback>
+        <mc:Fallback xmlns:w16sdtfl="http://schemas.microsoft.com/office/word/2024/wordml/sdtformatlock" xmlns:w16sdtdh="http://schemas.microsoft.com/office/word/2020/wordml/sdtdatahash" xmlns:w16du="http://schemas.microsoft.com/office/word/2023/wordml/word16du" xmlns:w16="http://schemas.microsoft.com/office/word/2018/wordml" xmlns:w16cex="http://schemas.microsoft.com/office/word/2018/wordml/cex" xmlns:oel="http://schemas.microsoft.com/office/2019/extlst">
           <w:pict>
             <v:shapetype w14:anchorId="1A6F9CC6" id="_x0000_t202" coordsize="21600,21600" o:spt="202" path="m,l,21600r21600,l21600,xe">
               <v:stroke joinstyle="miter"/>
@@ -4318,7 +4507,7 @@
             </wp:anchor>
           </w:drawing>
         </mc:Choice>
-        <mc:Fallback>
+        <mc:Fallback xmlns:w16sdtfl="http://schemas.microsoft.com/office/word/2024/wordml/sdtformatlock" xmlns:w16sdtdh="http://schemas.microsoft.com/office/word/2020/wordml/sdtdatahash" xmlns:w16du="http://schemas.microsoft.com/office/word/2023/wordml/word16du" xmlns:w16="http://schemas.microsoft.com/office/word/2018/wordml" xmlns:w16cex="http://schemas.microsoft.com/office/word/2018/wordml/cex" xmlns:oel="http://schemas.microsoft.com/office/2019/extlst">
           <w:pict>
             <v:shape w14:anchorId="1A6F9CC8" id="Textbox 235" o:spid="_x0000_s1032" type="#_x0000_t202" style="position:absolute;margin-left:95.4pt;margin-top:106.3pt;width:53.6pt;height:10.95pt;z-index:-18990080;visibility:visible;mso-wrap-style:square;mso-wrap-distance-left:0;mso-wrap-distance-top:0;mso-wrap-distance-right:0;mso-wrap-distance-bottom:0;mso-position-horizontal:absolute;mso-position-horizontal-relative:page;mso-position-vertical:absolute;mso-position-vertical-relative:page;v-text-anchor:top" o:gfxdata="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" filled="f" stroked="f">
               <v:textbox inset="0,0,0,0">
@@ -4415,7 +4604,7 @@
             </wp:anchor>
           </w:drawing>
         </mc:Choice>
-        <mc:Fallback>
+        <mc:Fallback xmlns:w16sdtfl="http://schemas.microsoft.com/office/word/2024/wordml/sdtformatlock" xmlns:w16sdtdh="http://schemas.microsoft.com/office/word/2020/wordml/sdtdatahash" xmlns:w16du="http://schemas.microsoft.com/office/word/2023/wordml/word16du" xmlns:w16="http://schemas.microsoft.com/office/word/2018/wordml" xmlns:w16cex="http://schemas.microsoft.com/office/word/2018/wordml/cex" xmlns:oel="http://schemas.microsoft.com/office/2019/extlst">
           <w:pict>
             <v:shape w14:anchorId="1A6F9CCA" id="Textbox 236" o:spid="_x0000_s1033" type="#_x0000_t202" style="position:absolute;margin-left:187.35pt;margin-top:106.3pt;width:53.5pt;height:10.95pt;z-index:-18989568;visibility:visible;mso-wrap-style:square;mso-wrap-distance-left:0;mso-wrap-distance-top:0;mso-wrap-distance-right:0;mso-wrap-distance-bottom:0;mso-position-horizontal:absolute;mso-position-horizontal-relative:page;mso-position-vertical:absolute;mso-position-vertical-relative:page;v-text-anchor:top" o:gfxdata="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" filled="f" stroked="f">
               <v:textbox inset="0,0,0,0">
@@ -4530,7 +4719,7 @@
             </wp:anchor>
           </w:drawing>
         </mc:Choice>
-        <mc:Fallback>
+        <mc:Fallback xmlns:w16sdtfl="http://schemas.microsoft.com/office/word/2024/wordml/sdtformatlock" xmlns:w16sdtdh="http://schemas.microsoft.com/office/word/2020/wordml/sdtdatahash" xmlns:w16du="http://schemas.microsoft.com/office/word/2023/wordml/word16du" xmlns:w16="http://schemas.microsoft.com/office/word/2018/wordml" xmlns:w16cex="http://schemas.microsoft.com/office/word/2018/wordml/cex" xmlns:oel="http://schemas.microsoft.com/office/2019/extlst">
           <w:pict>
             <v:shape w14:anchorId="1A6F9CCC" id="Textbox 237" o:spid="_x0000_s1034" type="#_x0000_t202" style="position:absolute;margin-left:510.15pt;margin-top:106.3pt;width:58.9pt;height:20.15pt;z-index:-18989056;visibility:visible;mso-wrap-style:square;mso-wrap-distance-left:0;mso-wrap-distance-top:0;mso-wrap-distance-right:0;mso-wrap-distance-bottom:0;mso-position-horizontal:absolute;mso-position-horizontal-relative:page;mso-position-vertical:absolute;mso-position-vertical-relative:page;v-text-anchor:top" o:gfxdata="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" filled="f" stroked="f">
               <v:textbox inset="0,0,0,0">
@@ -4585,7 +4774,7 @@
 </file>
 
 <file path=word/styles.xml><?xml version="1.0" encoding="utf-8"?>
-<w:styles xmlns:mc="http://schemas.openxmlformats.org/markup-compatibility/2006" xmlns:r="http://schemas.openxmlformats.org/officeDocument/2006/relationships" xmlns:w="http://schemas.openxmlformats.org/wordprocessingml/2006/main" xmlns:w14="http://schemas.microsoft.com/office/word/2010/wordml" xmlns:w15="http://schemas.microsoft.com/office/word/2012/wordml" xmlns:w16cex="http://schemas.microsoft.com/office/word/2018/wordml/cex" xmlns:w16cid="http://schemas.microsoft.com/office/word/2016/wordml/cid" xmlns:w16="http://schemas.microsoft.com/office/word/2018/wordml" xmlns:w16du="http://schemas.microsoft.com/office/word/2023/wordml/word16du" xmlns:w16sdtdh="http://schemas.microsoft.com/office/word/2020/wordml/sdtdatahash" xmlns:w16sdtfl="http://schemas.microsoft.com/office/word/2024/wordml/sdtformatlock" xmlns:w16se="http://schemas.microsoft.com/office/word/2015/wordml/symex" mc:Ignorable="w14 w15 w16se w16cid w16 w16cex w16sdtdh w16sdtfl w16du">
+<w:styles xmlns:mc="http://schemas.openxmlformats.org/markup-compatibility/2006" xmlns:r="http://schemas.openxmlformats.org/officeDocument/2006/relationships" xmlns:w="http://schemas.openxmlformats.org/wordprocessingml/2006/main" xmlns:w14="http://schemas.microsoft.com/office/word/2010/wordml" xmlns:w15="http://schemas.microsoft.com/office/word/2012/wordml" xmlns:w16cid="http://schemas.microsoft.com/office/word/2016/wordml/cid" xmlns:w16se="http://schemas.microsoft.com/office/word/2015/wordml/symex" mc:Ignorable="w14 w15 w16se w16cid">
   <w:docDefaults>
     <w:rPrDefault>
       <w:rPr>
@@ -4603,7 +4792,7 @@
       </w:pPr>
     </w:pPrDefault>
   </w:docDefaults>
-  <w:latentStyles w:defLockedState="0" w:defUIPriority="99" w:defSemiHidden="0" w:defUnhideWhenUsed="0" w:defQFormat="0" w:count="376">
+  <w:latentStyles w:defLockedState="0" w:defUIPriority="99" w:defSemiHidden="0" w:defUnhideWhenUsed="0" w:defQFormat="0" w:count="375">
     <w:lsdException w:name="Normal" w:uiPriority="1" w:qFormat="1"/>
     <w:lsdException w:name="heading 1" w:uiPriority="9" w:qFormat="1"/>
     <w:lsdException w:name="heading 2" w:semiHidden="1" w:uiPriority="9" w:unhideWhenUsed="1" w:qFormat="1"/>
@@ -4979,7 +5168,6 @@
     <w:lsdException w:name="Smart Hyperlink" w:semiHidden="1" w:unhideWhenUsed="1"/>
     <w:lsdException w:name="Hashtag" w:semiHidden="1" w:unhideWhenUsed="1"/>
     <w:lsdException w:name="Unresolved Mention" w:semiHidden="1" w:unhideWhenUsed="1"/>
-    <w:lsdException w:name="Smart Link" w:semiHidden="1" w:unhideWhenUsed="1"/>
   </w:latentStyles>
   <w:style w:type="paragraph" w:default="1" w:styleId="a">
     <w:name w:val="Normal"/>
@@ -5428,7 +5616,7 @@
 </file>
 
 <file path=customXml/itemProps1.xml><?xml version="1.0" encoding="utf-8"?>
-<ds:datastoreItem xmlns:ds="http://schemas.openxmlformats.org/officeDocument/2006/customXml" ds:itemID="{F1F974B4-4CD3-4822-AE74-E9F4554AC887}">
+<ds:datastoreItem xmlns:ds="http://schemas.openxmlformats.org/officeDocument/2006/customXml" ds:itemID="{7A28E0B3-3570-4CEE-BDF7-1CADACD6F605}">
   <ds:schemaRefs>
     <ds:schemaRef ds:uri="http://schemas.openxmlformats.org/officeDocument/2006/bibliography"/>
   </ds:schemaRefs>

</xml_diff>

<commit_message>
fix(bank): widen Alfa header label textbox + NBSP for multi-word labels
</commit_message>
<xml_diff>
--- a/templates/docx/bank_statement_template.docx
+++ b/templates/docx/bank_statement_template.docx
@@ -177,7 +177,7 @@
                         <wps:spPr>
                           <a:xfrm>
                             <a:off x="114300" y="117625"/>
-                            <a:ext cx="995680" cy="1330295"/>
+                            <a:ext cx="1260000" cy="1330295"/>
                           </a:xfrm>
                           <a:prstGeom prst="rect">
                             <a:avLst/>
@@ -203,7 +203,7 @@
                                   <w:spacing w:val="-8"/>
                                   <w:sz w:val="16"/>
                                 </w:rPr>
-                                <w:t xml:space="preserve"> </w:t>
+                                <w:t xml:space="preserve"> </w:t>
                               </w:r>
                               <w:r>
                                 <w:rPr>
@@ -232,7 +232,7 @@
                                   <w:spacing w:val="-9"/>
                                   <w:sz w:val="16"/>
                                 </w:rPr>
-                                <w:t xml:space="preserve"> </w:t>
+                                <w:t xml:space="preserve"> </w:t>
                               </w:r>
                               <w:r>
                                 <w:rPr>
@@ -246,7 +246,7 @@
                                   <w:spacing w:val="-9"/>
                                   <w:sz w:val="16"/>
                                 </w:rPr>
-                                <w:t xml:space="preserve"> </w:t>
+                                <w:t xml:space="preserve"> </w:t>
                               </w:r>
                               <w:r>
                                 <w:rPr>
@@ -259,7 +259,7 @@
                                 <w:rPr>
                                   <w:sz w:val="16"/>
                                 </w:rPr>
-                                <w:t>Валюта счета</w:t>
+                                <w:t>Валюта счета</w:t>
                               </w:r>
                             </w:p>
                             <w:p>
@@ -280,7 +280,7 @@
                                   <w:spacing w:val="-4"/>
                                   <w:sz w:val="16"/>
                                 </w:rPr>
-                                <w:t xml:space="preserve"> </w:t>
+                                <w:t xml:space="preserve"> </w:t>
                               </w:r>
                               <w:r>
                                 <w:rPr>
@@ -309,14 +309,14 @@
                                   <w:spacing w:val="-9"/>
                                   <w:sz w:val="16"/>
                                 </w:rPr>
-                                <w:t xml:space="preserve"> </w:t>
+                                <w:t xml:space="preserve"> </w:t>
                               </w:r>
                               <w:r>
                                 <w:rPr>
                                   <w:spacing w:val="-2"/>
                                   <w:sz w:val="16"/>
                                 </w:rPr>
-                                <w:t>формирования выписки</w:t>
+                                <w:t>формирования выписки</w:t>
                               </w:r>
                             </w:p>
                             <w:p>
@@ -615,7 +615,7 @@
                             <w:spacing w:val="-8"/>
                             <w:sz w:val="16"/>
                           </w:rPr>
-                          <w:t xml:space="preserve"> </w:t>
+                          <w:t xml:space="preserve"> </w:t>
                         </w:r>
                         <w:r>
                           <w:rPr>
@@ -644,7 +644,7 @@
                             <w:spacing w:val="-9"/>
                             <w:sz w:val="16"/>
                           </w:rPr>
-                          <w:t xml:space="preserve"> </w:t>
+                          <w:t xml:space="preserve"> </w:t>
                         </w:r>
                         <w:r>
                           <w:rPr>
@@ -658,7 +658,7 @@
                             <w:spacing w:val="-9"/>
                             <w:sz w:val="16"/>
                           </w:rPr>
-                          <w:t xml:space="preserve"> </w:t>
+                          <w:t xml:space="preserve"> </w:t>
                         </w:r>
                         <w:r>
                           <w:rPr>
@@ -671,7 +671,7 @@
                           <w:rPr>
                             <w:sz w:val="16"/>
                           </w:rPr>
-                          <w:t>Валюта счета</w:t>
+                          <w:t>Валюта счета</w:t>
                         </w:r>
                       </w:p>
                       <w:p>
@@ -692,7 +692,7 @@
                             <w:spacing w:val="-4"/>
                             <w:sz w:val="16"/>
                           </w:rPr>
-                          <w:t xml:space="preserve"> </w:t>
+                          <w:t xml:space="preserve"> </w:t>
                         </w:r>
                         <w:r>
                           <w:rPr>
@@ -721,14 +721,14 @@
                             <w:spacing w:val="-9"/>
                             <w:sz w:val="16"/>
                           </w:rPr>
-                          <w:t xml:space="preserve"> </w:t>
+                          <w:t xml:space="preserve"> </w:t>
                         </w:r>
                         <w:r>
                           <w:rPr>
                             <w:spacing w:val="-2"/>
                             <w:sz w:val="16"/>
                           </w:rPr>
-                          <w:t>формирования выписки</w:t>
+                          <w:t>формирования выписки</w:t>
                         </w:r>
                       </w:p>
                       <w:p>

</xml_diff>

<commit_message>
fix(bank): remove NBSP in 3-word Alfa header labels to allow word-wrap
</commit_message>
<xml_diff>
--- a/templates/docx/bank_statement_template.docx
+++ b/templates/docx/bank_statement_template.docx
@@ -232,7 +232,7 @@
                                   <w:spacing w:val="-9"/>
                                   <w:sz w:val="16"/>
                                 </w:rPr>
-                                <w:t xml:space="preserve"> </w:t>
+                                <w:t xml:space="preserve"> </w:t>
                               </w:r>
                               <w:r>
                                 <w:rPr>
@@ -246,7 +246,7 @@
                                   <w:spacing w:val="-9"/>
                                   <w:sz w:val="16"/>
                                 </w:rPr>
-                                <w:t xml:space="preserve"> </w:t>
+                                <w:t xml:space="preserve"> </w:t>
                               </w:r>
                               <w:r>
                                 <w:rPr>
@@ -309,14 +309,14 @@
                                   <w:spacing w:val="-9"/>
                                   <w:sz w:val="16"/>
                                 </w:rPr>
-                                <w:t xml:space="preserve"> </w:t>
+                                <w:t xml:space="preserve"> </w:t>
                               </w:r>
                               <w:r>
                                 <w:rPr>
                                   <w:spacing w:val="-2"/>
                                   <w:sz w:val="16"/>
                                 </w:rPr>
-                                <w:t>формирования выписки</w:t>
+                                <w:t xml:space="preserve">формирования выписки</w:t>
                               </w:r>
                             </w:p>
                             <w:p>
@@ -644,7 +644,7 @@
                             <w:spacing w:val="-9"/>
                             <w:sz w:val="16"/>
                           </w:rPr>
-                          <w:t xml:space="preserve"> </w:t>
+                          <w:t xml:space="preserve"> </w:t>
                         </w:r>
                         <w:r>
                           <w:rPr>
@@ -658,7 +658,7 @@
                             <w:spacing w:val="-9"/>
                             <w:sz w:val="16"/>
                           </w:rPr>
-                          <w:t xml:space="preserve"> </w:t>
+                          <w:t xml:space="preserve"> </w:t>
                         </w:r>
                         <w:r>
                           <w:rPr>
@@ -721,14 +721,14 @@
                             <w:spacing w:val="-9"/>
                             <w:sz w:val="16"/>
                           </w:rPr>
-                          <w:t xml:space="preserve"> </w:t>
+                          <w:t xml:space="preserve"> </w:t>
                         </w:r>
                         <w:r>
                           <w:rPr>
                             <w:spacing w:val="-2"/>
                             <w:sz w:val="16"/>
                           </w:rPr>
-                          <w:t>формирования выписки</w:t>
+                          <w:t xml:space="preserve">формирования выписки</w:t>
                         </w:r>
                       </w:p>
                       <w:p>

</xml_diff>